<commit_message>
Hapus akun demo di halaman login, tambah ikon mata pada input password
- Tombol "Gunakan akun demo" dan kotak Demo User dihapus dari halaman login
- Ikon mata untuk tampilkan/sembunyikan password di login dan form user
- Komponen PasswordInput yang bisa dipakai ulang
- docs/akun-testing.docx diperbarui (login manual, skenario ikon mata)

Co-Authored-By: Claude Opus 5.5 <noreply@anthropic.com>
</commit_message>
<xml_diff>
--- a/docs/akun-testing.docx
+++ b/docs/akun-testing.docx
@@ -2341,7 +2341,7 @@
                 <w:sz w:val="18"/>
                 <w:szCs w:val="18"/>
               </w:rPr>
-              <w:t xml:space="preserve">demo@pap-ms.id *</w:t>
+              <w:t xml:space="preserve">demo@pap-ms.id</w:t>
             </w:r>
           </w:p>
         </w:tc>
@@ -2624,7 +2624,7 @@
           <w:sz w:val="18"/>
           <w:szCs w:val="18"/>
         </w:rPr>
-        <w:t xml:space="preserve">* demo@pap-ms.id dipakai tombol "Gunakan akun demo" di halaman login. HRD, General Affair, General Manager, dan Staff IT tidak memiliki level Lead/Staff.</w:t>
+        <w:t xml:space="preserve">Login manual dengan email dan password di atas (ikon mata di kolom password untuk melihat isian). HRD, General Affair, General Manager, dan Staff IT tidak memiliki level Lead/Staff.</w:t>
       </w:r>
     </w:p>
     <w:p>
@@ -6155,7 +6155,7 @@
                 <w:sz w:val="20"/>
                 <w:szCs w:val="20"/>
               </w:rPr>
-              <w:t xml:space="preserve">Refresh halaman setelah login → tetap login.</w:t>
+              <w:t xml:space="preserve">Ikon mata di kolom password menampilkan dan menyembunyikan isian password.</w:t>
             </w:r>
           </w:p>
         </w:tc>
@@ -6332,7 +6332,7 @@
                 <w:sz w:val="20"/>
                 <w:szCs w:val="20"/>
               </w:rPr>
-              <w:t xml:space="preserve">Logout lewat menu profil (kanan atas) → kembali ke halaman login.</w:t>
+              <w:t xml:space="preserve">Refresh halaman setelah login → tetap login.</w:t>
             </w:r>
           </w:p>
         </w:tc>
@@ -6477,6 +6477,182 @@
                 <w:sz w:val="18"/>
                 <w:szCs w:val="18"/>
               </w:rPr>
+              <w:t xml:space="preserve">Akun mana pun</w:t>
+            </w:r>
+          </w:p>
+        </w:tc>
+        <w:tc>
+          <w:tcPr>
+            <w:tcW w:type="dxa" w:w="4238"/>
+            <w:tcBorders>
+              <w:top w:val="single" w:color="C9D3DD" w:sz="4"/>
+              <w:left w:val="single" w:color="C9D3DD" w:sz="4"/>
+              <w:bottom w:val="single" w:color="C9D3DD" w:sz="4"/>
+              <w:right w:val="single" w:color="C9D3DD" w:sz="4"/>
+            </w:tcBorders>
+            <w:tcMar>
+              <w:top w:type="dxa" w:w="70"/>
+              <w:left w:type="dxa" w:w="110"/>
+              <w:bottom w:type="dxa" w:w="70"/>
+              <w:right w:type="dxa" w:w="110"/>
+            </w:tcMar>
+            <w:vAlign w:val="center"/>
+          </w:tcPr>
+          <w:p>
+            <w:pPr>
+              <w:jc w:val="left"/>
+            </w:pPr>
+            <w:r>
+              <w:rPr>
+                <w:rFonts w:ascii="Calibri" w:cs="Calibri" w:eastAsia="Calibri" w:hAnsi="Calibri"/>
+                <w:sz w:val="20"/>
+                <w:szCs w:val="20"/>
+              </w:rPr>
+              <w:t xml:space="preserve">Logout lewat menu profil (kanan atas) → kembali ke halaman login.</w:t>
+            </w:r>
+          </w:p>
+        </w:tc>
+        <w:tc>
+          <w:tcPr>
+            <w:tcW w:type="dxa" w:w="1300"/>
+            <w:tcBorders>
+              <w:top w:val="single" w:color="C9D3DD" w:sz="4"/>
+              <w:left w:val="single" w:color="C9D3DD" w:sz="4"/>
+              <w:bottom w:val="single" w:color="C9D3DD" w:sz="4"/>
+              <w:right w:val="single" w:color="C9D3DD" w:sz="4"/>
+            </w:tcBorders>
+            <w:tcMar>
+              <w:top w:type="dxa" w:w="70"/>
+              <w:left w:type="dxa" w:w="110"/>
+              <w:bottom w:type="dxa" w:w="70"/>
+              <w:right w:type="dxa" w:w="110"/>
+            </w:tcMar>
+            <w:vAlign w:val="center"/>
+          </w:tcPr>
+          <w:p>
+            <w:pPr>
+              <w:jc w:val="left"/>
+            </w:pPr>
+            <w:r>
+              <w:rPr>
+                <w:rFonts w:ascii="Calibri" w:cs="Calibri" w:eastAsia="Calibri" w:hAnsi="Calibri"/>
+                <w:sz w:val="18"/>
+                <w:szCs w:val="18"/>
+              </w:rPr>
+              <w:t xml:space="preserve">☐  Lulus</w:t>
+            </w:r>
+          </w:p>
+          <w:p>
+            <w:pPr>
+              <w:jc w:val="left"/>
+            </w:pPr>
+            <w:r>
+              <w:rPr>
+                <w:rFonts w:ascii="Calibri" w:cs="Calibri" w:eastAsia="Calibri" w:hAnsi="Calibri"/>
+                <w:sz w:val="18"/>
+                <w:szCs w:val="18"/>
+              </w:rPr>
+              <w:t xml:space="preserve">☐  Gagal</w:t>
+            </w:r>
+          </w:p>
+        </w:tc>
+        <w:tc>
+          <w:tcPr>
+            <w:tcW w:type="dxa" w:w="1800"/>
+            <w:tcBorders>
+              <w:top w:val="single" w:color="C9D3DD" w:sz="4"/>
+              <w:left w:val="single" w:color="C9D3DD" w:sz="4"/>
+              <w:bottom w:val="single" w:color="C9D3DD" w:sz="4"/>
+              <w:right w:val="single" w:color="C9D3DD" w:sz="4"/>
+            </w:tcBorders>
+            <w:tcMar>
+              <w:top w:type="dxa" w:w="70"/>
+              <w:left w:type="dxa" w:w="110"/>
+              <w:bottom w:type="dxa" w:w="70"/>
+              <w:right w:type="dxa" w:w="110"/>
+            </w:tcMar>
+            <w:vAlign w:val="center"/>
+          </w:tcPr>
+          <w:p>
+            <w:pPr>
+              <w:jc w:val="left"/>
+            </w:pPr>
+            <w:r>
+              <w:rPr>
+                <w:rFonts w:ascii="Calibri" w:cs="Calibri" w:eastAsia="Calibri" w:hAnsi="Calibri"/>
+                <w:sz w:val="20"/>
+                <w:szCs w:val="20"/>
+              </w:rPr>
+              <w:t xml:space="preserve"/>
+            </w:r>
+          </w:p>
+        </w:tc>
+      </w:tr>
+      <w:tr>
+        <w:trPr>
+          <w:cantSplit/>
+        </w:trPr>
+        <w:tc>
+          <w:tcPr>
+            <w:tcW w:type="dxa" w:w="500"/>
+            <w:tcBorders>
+              <w:top w:val="single" w:color="C9D3DD" w:sz="4"/>
+              <w:left w:val="single" w:color="C9D3DD" w:sz="4"/>
+              <w:bottom w:val="single" w:color="C9D3DD" w:sz="4"/>
+              <w:right w:val="single" w:color="C9D3DD" w:sz="4"/>
+            </w:tcBorders>
+            <w:shd w:fill="F6F8FA" w:color="auto" w:val="clear"/>
+            <w:tcMar>
+              <w:top w:type="dxa" w:w="70"/>
+              <w:left w:type="dxa" w:w="110"/>
+              <w:bottom w:type="dxa" w:w="70"/>
+              <w:right w:type="dxa" w:w="110"/>
+            </w:tcMar>
+            <w:vAlign w:val="center"/>
+          </w:tcPr>
+          <w:p>
+            <w:pPr>
+              <w:jc w:val="center"/>
+            </w:pPr>
+            <w:r>
+              <w:rPr>
+                <w:rFonts w:ascii="Calibri" w:cs="Calibri" w:eastAsia="Calibri" w:hAnsi="Calibri"/>
+                <w:sz w:val="20"/>
+                <w:szCs w:val="20"/>
+              </w:rPr>
+              <w:t xml:space="preserve">6</w:t>
+            </w:r>
+          </w:p>
+        </w:tc>
+        <w:tc>
+          <w:tcPr>
+            <w:tcW w:type="dxa" w:w="1800"/>
+            <w:tcBorders>
+              <w:top w:val="single" w:color="C9D3DD" w:sz="4"/>
+              <w:left w:val="single" w:color="C9D3DD" w:sz="4"/>
+              <w:bottom w:val="single" w:color="C9D3DD" w:sz="4"/>
+              <w:right w:val="single" w:color="C9D3DD" w:sz="4"/>
+            </w:tcBorders>
+            <w:shd w:fill="F6F8FA" w:color="auto" w:val="clear"/>
+            <w:tcMar>
+              <w:top w:type="dxa" w:w="70"/>
+              <w:left w:type="dxa" w:w="110"/>
+              <w:bottom w:type="dxa" w:w="70"/>
+              <w:right w:type="dxa" w:w="110"/>
+            </w:tcMar>
+            <w:vAlign w:val="center"/>
+          </w:tcPr>
+          <w:p>
+            <w:pPr>
+              <w:jc w:val="left"/>
+            </w:pPr>
+            <w:r>
+              <w:rPr>
+                <w:rFonts w:ascii="Calibri" w:cs="Calibri" w:eastAsia="Calibri" w:hAnsi="Calibri"/>
+                <w:color w:val="5B6474"/>
+                <w:sz w:val="18"/>
+                <w:szCs w:val="18"/>
+              </w:rPr>
               <w:t xml:space="preserve">Semua akun</w:t>
             </w:r>
           </w:p>
@@ -6490,6 +6666,7 @@
               <w:bottom w:val="single" w:color="C9D3DD" w:sz="4"/>
               <w:right w:val="single" w:color="C9D3DD" w:sz="4"/>
             </w:tcBorders>
+            <w:shd w:fill="F6F8FA" w:color="auto" w:val="clear"/>
             <w:tcMar>
               <w:top w:type="dxa" w:w="70"/>
               <w:left w:type="dxa" w:w="110"/>
@@ -6521,6 +6698,7 @@
               <w:bottom w:val="single" w:color="C9D3DD" w:sz="4"/>
               <w:right w:val="single" w:color="C9D3DD" w:sz="4"/>
             </w:tcBorders>
+            <w:shd w:fill="F6F8FA" w:color="auto" w:val="clear"/>
             <w:tcMar>
               <w:top w:type="dxa" w:w="70"/>
               <w:left w:type="dxa" w:w="110"/>
@@ -6565,6 +6743,7 @@
               <w:bottom w:val="single" w:color="C9D3DD" w:sz="4"/>
               <w:right w:val="single" w:color="C9D3DD" w:sz="4"/>
             </w:tcBorders>
+            <w:shd w:fill="F6F8FA" w:color="auto" w:val="clear"/>
             <w:tcMar>
               <w:top w:type="dxa" w:w="70"/>
               <w:left w:type="dxa" w:w="110"/>
@@ -6838,7 +7017,7 @@
                 <w:sz w:val="20"/>
                 <w:szCs w:val="20"/>
               </w:rPr>
-              <w:t xml:space="preserve">6</w:t>
+              <w:t xml:space="preserve">7</w:t>
             </w:r>
           </w:p>
         </w:tc>
@@ -7012,7 +7191,7 @@
                 <w:sz w:val="20"/>
                 <w:szCs w:val="20"/>
               </w:rPr>
-              <w:t xml:space="preserve">7</w:t>
+              <w:t xml:space="preserve">8</w:t>
             </w:r>
           </w:p>
         </w:tc>
@@ -7189,7 +7368,7 @@
                 <w:sz w:val="20"/>
                 <w:szCs w:val="20"/>
               </w:rPr>
-              <w:t xml:space="preserve">8</w:t>
+              <w:t xml:space="preserve">9</w:t>
             </w:r>
           </w:p>
         </w:tc>
@@ -7363,7 +7542,7 @@
                 <w:sz w:val="20"/>
                 <w:szCs w:val="20"/>
               </w:rPr>
-              <w:t xml:space="preserve">9</w:t>
+              <w:t xml:space="preserve">10</w:t>
             </w:r>
           </w:p>
         </w:tc>
@@ -7540,7 +7719,7 @@
                 <w:sz w:val="20"/>
                 <w:szCs w:val="20"/>
               </w:rPr>
-              <w:t xml:space="preserve">10</w:t>
+              <w:t xml:space="preserve">11</w:t>
             </w:r>
           </w:p>
         </w:tc>
@@ -7714,7 +7893,7 @@
                 <w:sz w:val="20"/>
                 <w:szCs w:val="20"/>
               </w:rPr>
-              <w:t xml:space="preserve">11</w:t>
+              <w:t xml:space="preserve">12</w:t>
             </w:r>
           </w:p>
         </w:tc>
@@ -7891,7 +8070,7 @@
                 <w:sz w:val="20"/>
                 <w:szCs w:val="20"/>
               </w:rPr>
-              <w:t xml:space="preserve">12</w:t>
+              <w:t xml:space="preserve">13</w:t>
             </w:r>
           </w:p>
         </w:tc>
@@ -8065,7 +8244,7 @@
                 <w:sz w:val="20"/>
                 <w:szCs w:val="20"/>
               </w:rPr>
-              <w:t xml:space="preserve">13</w:t>
+              <w:t xml:space="preserve">14</w:t>
             </w:r>
           </w:p>
         </w:tc>
@@ -8242,7 +8421,7 @@
                 <w:sz w:val="20"/>
                 <w:szCs w:val="20"/>
               </w:rPr>
-              <w:t xml:space="preserve">14</w:t>
+              <w:t xml:space="preserve">15</w:t>
             </w:r>
           </w:p>
         </w:tc>
@@ -8416,7 +8595,7 @@
                 <w:sz w:val="20"/>
                 <w:szCs w:val="20"/>
               </w:rPr>
-              <w:t xml:space="preserve">15</w:t>
+              <w:t xml:space="preserve">16</w:t>
             </w:r>
           </w:p>
         </w:tc>
@@ -8593,7 +8772,7 @@
                 <w:sz w:val="20"/>
                 <w:szCs w:val="20"/>
               </w:rPr>
-              <w:t xml:space="preserve">16</w:t>
+              <w:t xml:space="preserve">17</w:t>
             </w:r>
           </w:p>
         </w:tc>
@@ -8985,7 +9164,7 @@
                 <w:sz w:val="20"/>
                 <w:szCs w:val="20"/>
               </w:rPr>
-              <w:t xml:space="preserve">17</w:t>
+              <w:t xml:space="preserve">18</w:t>
             </w:r>
           </w:p>
         </w:tc>
@@ -9160,7 +9339,7 @@
                 <w:sz w:val="20"/>
                 <w:szCs w:val="20"/>
               </w:rPr>
-              <w:t xml:space="preserve">18</w:t>
+              <w:t xml:space="preserve">19</w:t>
             </w:r>
           </w:p>
         </w:tc>
@@ -9338,7 +9517,7 @@
                 <w:sz w:val="20"/>
                 <w:szCs w:val="20"/>
               </w:rPr>
-              <w:t xml:space="preserve">19</w:t>
+              <w:t xml:space="preserve">20</w:t>
             </w:r>
           </w:p>
         </w:tc>
@@ -9513,7 +9692,7 @@
                 <w:sz w:val="20"/>
                 <w:szCs w:val="20"/>
               </w:rPr>
-              <w:t xml:space="preserve">20</w:t>
+              <w:t xml:space="preserve">21</w:t>
             </w:r>
           </w:p>
         </w:tc>
@@ -9910,7 +10089,7 @@
                 <w:sz w:val="20"/>
                 <w:szCs w:val="20"/>
               </w:rPr>
-              <w:t xml:space="preserve">21</w:t>
+              <w:t xml:space="preserve">22</w:t>
             </w:r>
           </w:p>
         </w:tc>
@@ -10084,7 +10263,7 @@
                 <w:sz w:val="20"/>
                 <w:szCs w:val="20"/>
               </w:rPr>
-              <w:t xml:space="preserve">22</w:t>
+              <w:t xml:space="preserve">23</w:t>
             </w:r>
           </w:p>
         </w:tc>
@@ -10261,7 +10440,7 @@
                 <w:sz w:val="20"/>
                 <w:szCs w:val="20"/>
               </w:rPr>
-              <w:t xml:space="preserve">23</w:t>
+              <w:t xml:space="preserve">24</w:t>
             </w:r>
           </w:p>
         </w:tc>
@@ -10435,7 +10614,7 @@
                 <w:sz w:val="20"/>
                 <w:szCs w:val="20"/>
               </w:rPr>
-              <w:t xml:space="preserve">24</w:t>
+              <w:t xml:space="preserve">25</w:t>
             </w:r>
           </w:p>
         </w:tc>
@@ -10612,7 +10791,7 @@
                 <w:sz w:val="20"/>
                 <w:szCs w:val="20"/>
               </w:rPr>
-              <w:t xml:space="preserve">25</w:t>
+              <w:t xml:space="preserve">26</w:t>
             </w:r>
           </w:p>
         </w:tc>
@@ -10786,7 +10965,7 @@
                 <w:sz w:val="20"/>
                 <w:szCs w:val="20"/>
               </w:rPr>
-              <w:t xml:space="preserve">26</w:t>
+              <w:t xml:space="preserve">27</w:t>
             </w:r>
           </w:p>
         </w:tc>
@@ -11182,7 +11361,7 @@
                 <w:sz w:val="20"/>
                 <w:szCs w:val="20"/>
               </w:rPr>
-              <w:t xml:space="preserve">27</w:t>
+              <w:t xml:space="preserve">28</w:t>
             </w:r>
           </w:p>
         </w:tc>
@@ -11356,7 +11535,7 @@
                 <w:sz w:val="20"/>
                 <w:szCs w:val="20"/>
               </w:rPr>
-              <w:t xml:space="preserve">28</w:t>
+              <w:t xml:space="preserve">29</w:t>
             </w:r>
           </w:p>
         </w:tc>
@@ -11752,7 +11931,7 @@
                 <w:sz w:val="20"/>
                 <w:szCs w:val="20"/>
               </w:rPr>
-              <w:t xml:space="preserve">29</w:t>
+              <w:t xml:space="preserve">30</w:t>
             </w:r>
           </w:p>
         </w:tc>
@@ -11927,7 +12106,7 @@
                 <w:sz w:val="20"/>
                 <w:szCs w:val="20"/>
               </w:rPr>
-              <w:t xml:space="preserve">30</w:t>
+              <w:t xml:space="preserve">31</w:t>
             </w:r>
           </w:p>
         </w:tc>

</xml_diff>

<commit_message>
Ganti menu Planning Meeting menjadi Meeting dengan data asli
- Migrasi 007_meetings: tabel meetings (planning_id opsional untuk meeting
  dadakan) dan meeting_participants, permission meeting.view/view_all/
  create/manage, menu lama "planning-meeting" dihapus dari division_menus
- API /api/meetings (daftar, buat, detail, edit, hapus) dan
  /api/users/options untuk memilih peserta
- Halaman Meeting: tombol "+ Tambah meeting", dropdown planning opsional,
  pilih peserta per divisi, detail dengan hasil meeting & status
- Peserta dari divisi lain bisa melihat meeting dan mengisi hasil meeting
- docs/akun-testing.docx: skenario Meeting dan alur planning tanpa approval

Co-Authored-By: Claude Opus 5.5 <noreply@anthropic.com>
</commit_message>
<xml_diff>
--- a/docs/akun-testing.docx
+++ b/docs/akun-testing.docx
@@ -3321,7 +3321,7 @@
                 <w:sz w:val="20"/>
                 <w:szCs w:val="20"/>
               </w:rPr>
-              <w:t xml:space="preserve">Buat pengajuan planning</w:t>
+              <w:t xml:space="preserve">Buat planning</w:t>
             </w:r>
           </w:p>
         </w:tc>
@@ -3380,12 +3380,13 @@
             <w:r>
               <w:rPr>
                 <w:rFonts w:ascii="Calibri" w:cs="Calibri" w:eastAsia="Calibri" w:hAnsi="Calibri"/>
-                <w:b/>
-                <w:bCs/>
-                <w:sz w:val="18"/>
-                <w:szCs w:val="18"/>
-              </w:rPr>
-              <w:t xml:space="preserve">✓</w:t>
+                <w:b w:val="false"/>
+                <w:bCs w:val="false"/>
+                <w:color w:val="5B6474"/>
+                <w:sz w:val="18"/>
+                <w:szCs w:val="18"/>
+              </w:rPr>
+              <w:t xml:space="preserve">—</w:t>
             </w:r>
           </w:p>
         </w:tc>
@@ -3582,12 +3583,12 @@
             <w:r>
               <w:rPr>
                 <w:rFonts w:ascii="Calibri" w:cs="Calibri" w:eastAsia="Calibri" w:hAnsi="Calibri"/>
-                <w:b w:val="false"/>
-                <w:bCs w:val="false"/>
-                <w:sz w:val="18"/>
-                <w:szCs w:val="18"/>
-              </w:rPr>
-              <w:t xml:space="preserve">✓ **</w:t>
+                <w:b/>
+                <w:bCs/>
+                <w:sz w:val="18"/>
+                <w:szCs w:val="18"/>
+              </w:rPr>
+              <w:t xml:space="preserve">✓</w:t>
             </w:r>
           </w:p>
         </w:tc>
@@ -3926,7 +3927,7 @@
                 <w:sz w:val="20"/>
                 <w:szCs w:val="20"/>
               </w:rPr>
-              <w:t xml:space="preserve">Approve / tolak planning</w:t>
+              <w:t xml:space="preserve">Manajemen User</w:t>
             </w:r>
           </w:p>
         </w:tc>
@@ -3958,7 +3959,7 @@
                 <w:sz w:val="16"/>
                 <w:szCs w:val="16"/>
               </w:rPr>
-              <w:t xml:space="preserve">planning.approve</w:t>
+              <w:t xml:space="preserve">users.manage</w:t>
             </w:r>
           </w:p>
         </w:tc>
@@ -4024,10 +4025,11 @@
                 <w:rFonts w:ascii="Calibri" w:cs="Calibri" w:eastAsia="Calibri" w:hAnsi="Calibri"/>
                 <w:b w:val="false"/>
                 <w:bCs w:val="false"/>
-                <w:sz w:val="18"/>
-                <w:szCs w:val="18"/>
-              </w:rPr>
-              <w:t xml:space="preserve">Divisi sendiri</w:t>
+                <w:color w:val="5B6474"/>
+                <w:sz w:val="18"/>
+                <w:szCs w:val="18"/>
+              </w:rPr>
+              <w:t xml:space="preserve">—</w:t>
             </w:r>
           </w:p>
         </w:tc>
@@ -4058,10 +4060,11 @@
                 <w:rFonts w:ascii="Calibri" w:cs="Calibri" w:eastAsia="Calibri" w:hAnsi="Calibri"/>
                 <w:b w:val="false"/>
                 <w:bCs w:val="false"/>
-                <w:sz w:val="18"/>
-                <w:szCs w:val="18"/>
-              </w:rPr>
-              <w:t xml:space="preserve">Semua divisi</w:t>
+                <w:color w:val="5B6474"/>
+                <w:sz w:val="18"/>
+                <w:szCs w:val="18"/>
+              </w:rPr>
+              <w:t xml:space="preserve">—</w:t>
             </w:r>
           </w:p>
         </w:tc>
@@ -4131,7 +4134,7 @@
                 <w:sz w:val="20"/>
                 <w:szCs w:val="20"/>
               </w:rPr>
-              <w:t xml:space="preserve">Manajemen User</w:t>
+              <w:t xml:space="preserve">Manajemen Role</w:t>
             </w:r>
           </w:p>
         </w:tc>
@@ -4162,7 +4165,7 @@
                 <w:sz w:val="16"/>
                 <w:szCs w:val="16"/>
               </w:rPr>
-              <w:t xml:space="preserve">users.manage</w:t>
+              <w:t xml:space="preserve">roles.manage</w:t>
             </w:r>
           </w:p>
         </w:tc>
@@ -4334,7 +4337,7 @@
                 <w:sz w:val="20"/>
                 <w:szCs w:val="20"/>
               </w:rPr>
-              <w:t xml:space="preserve">Manajemen Role</w:t>
+              <w:t xml:space="preserve">Lihat meeting divisi sendiri &amp; yang diikuti</w:t>
             </w:r>
           </w:p>
         </w:tc>
@@ -4366,7 +4369,7 @@
                 <w:sz w:val="16"/>
                 <w:szCs w:val="16"/>
               </w:rPr>
-              <w:t xml:space="preserve">roles.manage</w:t>
+              <w:t xml:space="preserve">meeting.view</w:t>
             </w:r>
           </w:p>
         </w:tc>
@@ -4380,6 +4383,208 @@
               <w:right w:val="single" w:color="C9D3DD" w:sz="4"/>
             </w:tcBorders>
             <w:shd w:fill="F6F8FA" w:color="auto" w:val="clear"/>
+            <w:tcMar>
+              <w:top w:type="dxa" w:w="70"/>
+              <w:left w:type="dxa" w:w="110"/>
+              <w:bottom w:type="dxa" w:w="70"/>
+              <w:right w:type="dxa" w:w="110"/>
+            </w:tcMar>
+            <w:vAlign w:val="center"/>
+          </w:tcPr>
+          <w:p>
+            <w:pPr>
+              <w:jc w:val="center"/>
+            </w:pPr>
+            <w:r>
+              <w:rPr>
+                <w:rFonts w:ascii="Calibri" w:cs="Calibri" w:eastAsia="Calibri" w:hAnsi="Calibri"/>
+                <w:b/>
+                <w:bCs/>
+                <w:sz w:val="18"/>
+                <w:szCs w:val="18"/>
+              </w:rPr>
+              <w:t xml:space="preserve">✓</w:t>
+            </w:r>
+          </w:p>
+        </w:tc>
+        <w:tc>
+          <w:tcPr>
+            <w:tcW w:type="dxa" w:w="1300"/>
+            <w:tcBorders>
+              <w:top w:val="single" w:color="C9D3DD" w:sz="4"/>
+              <w:left w:val="single" w:color="C9D3DD" w:sz="4"/>
+              <w:bottom w:val="single" w:color="C9D3DD" w:sz="4"/>
+              <w:right w:val="single" w:color="C9D3DD" w:sz="4"/>
+            </w:tcBorders>
+            <w:shd w:fill="F6F8FA" w:color="auto" w:val="clear"/>
+            <w:tcMar>
+              <w:top w:type="dxa" w:w="70"/>
+              <w:left w:type="dxa" w:w="110"/>
+              <w:bottom w:type="dxa" w:w="70"/>
+              <w:right w:type="dxa" w:w="110"/>
+            </w:tcMar>
+            <w:vAlign w:val="center"/>
+          </w:tcPr>
+          <w:p>
+            <w:pPr>
+              <w:jc w:val="center"/>
+            </w:pPr>
+            <w:r>
+              <w:rPr>
+                <w:rFonts w:ascii="Calibri" w:cs="Calibri" w:eastAsia="Calibri" w:hAnsi="Calibri"/>
+                <w:b/>
+                <w:bCs/>
+                <w:sz w:val="18"/>
+                <w:szCs w:val="18"/>
+              </w:rPr>
+              <w:t xml:space="preserve">✓</w:t>
+            </w:r>
+          </w:p>
+        </w:tc>
+        <w:tc>
+          <w:tcPr>
+            <w:tcW w:type="dxa" w:w="1300"/>
+            <w:tcBorders>
+              <w:top w:val="single" w:color="C9D3DD" w:sz="4"/>
+              <w:left w:val="single" w:color="C9D3DD" w:sz="4"/>
+              <w:bottom w:val="single" w:color="C9D3DD" w:sz="4"/>
+              <w:right w:val="single" w:color="C9D3DD" w:sz="4"/>
+            </w:tcBorders>
+            <w:shd w:fill="F6F8FA" w:color="auto" w:val="clear"/>
+            <w:tcMar>
+              <w:top w:type="dxa" w:w="70"/>
+              <w:left w:type="dxa" w:w="110"/>
+              <w:bottom w:type="dxa" w:w="70"/>
+              <w:right w:type="dxa" w:w="110"/>
+            </w:tcMar>
+            <w:vAlign w:val="center"/>
+          </w:tcPr>
+          <w:p>
+            <w:pPr>
+              <w:jc w:val="center"/>
+            </w:pPr>
+            <w:r>
+              <w:rPr>
+                <w:rFonts w:ascii="Calibri" w:cs="Calibri" w:eastAsia="Calibri" w:hAnsi="Calibri"/>
+                <w:b/>
+                <w:bCs/>
+                <w:sz w:val="18"/>
+                <w:szCs w:val="18"/>
+              </w:rPr>
+              <w:t xml:space="preserve">✓</w:t>
+            </w:r>
+          </w:p>
+        </w:tc>
+        <w:tc>
+          <w:tcPr>
+            <w:tcW w:type="dxa" w:w="1200"/>
+            <w:tcBorders>
+              <w:top w:val="single" w:color="C9D3DD" w:sz="4"/>
+              <w:left w:val="single" w:color="C9D3DD" w:sz="4"/>
+              <w:bottom w:val="single" w:color="C9D3DD" w:sz="4"/>
+              <w:right w:val="single" w:color="C9D3DD" w:sz="4"/>
+            </w:tcBorders>
+            <w:shd w:fill="F6F8FA" w:color="auto" w:val="clear"/>
+            <w:tcMar>
+              <w:top w:type="dxa" w:w="70"/>
+              <w:left w:type="dxa" w:w="110"/>
+              <w:bottom w:type="dxa" w:w="70"/>
+              <w:right w:type="dxa" w:w="110"/>
+            </w:tcMar>
+            <w:vAlign w:val="center"/>
+          </w:tcPr>
+          <w:p>
+            <w:pPr>
+              <w:jc w:val="center"/>
+            </w:pPr>
+            <w:r>
+              <w:rPr>
+                <w:rFonts w:ascii="Calibri" w:cs="Calibri" w:eastAsia="Calibri" w:hAnsi="Calibri"/>
+                <w:b/>
+                <w:bCs/>
+                <w:sz w:val="18"/>
+                <w:szCs w:val="18"/>
+              </w:rPr>
+              <w:t xml:space="preserve">✓</w:t>
+            </w:r>
+          </w:p>
+        </w:tc>
+      </w:tr>
+      <w:tr>
+        <w:trPr>
+          <w:cantSplit/>
+        </w:trPr>
+        <w:tc>
+          <w:tcPr>
+            <w:tcW w:type="dxa" w:w="2500"/>
+            <w:tcBorders>
+              <w:top w:val="single" w:color="C9D3DD" w:sz="4"/>
+              <w:left w:val="single" w:color="C9D3DD" w:sz="4"/>
+              <w:bottom w:val="single" w:color="C9D3DD" w:sz="4"/>
+              <w:right w:val="single" w:color="C9D3DD" w:sz="4"/>
+            </w:tcBorders>
+            <w:tcMar>
+              <w:top w:type="dxa" w:w="70"/>
+              <w:left w:type="dxa" w:w="110"/>
+              <w:bottom w:type="dxa" w:w="70"/>
+              <w:right w:type="dxa" w:w="110"/>
+            </w:tcMar>
+            <w:vAlign w:val="center"/>
+          </w:tcPr>
+          <w:p>
+            <w:pPr>
+              <w:jc w:val="left"/>
+            </w:pPr>
+            <w:r>
+              <w:rPr>
+                <w:rFonts w:ascii="Calibri" w:cs="Calibri" w:eastAsia="Calibri" w:hAnsi="Calibri"/>
+                <w:sz w:val="20"/>
+                <w:szCs w:val="20"/>
+              </w:rPr>
+              <w:t xml:space="preserve">Lihat meeting semua divisi</w:t>
+            </w:r>
+          </w:p>
+        </w:tc>
+        <w:tc>
+          <w:tcPr>
+            <w:tcW w:type="dxa" w:w="2238"/>
+            <w:tcBorders>
+              <w:top w:val="single" w:color="C9D3DD" w:sz="4"/>
+              <w:left w:val="single" w:color="C9D3DD" w:sz="4"/>
+              <w:bottom w:val="single" w:color="C9D3DD" w:sz="4"/>
+              <w:right w:val="single" w:color="C9D3DD" w:sz="4"/>
+            </w:tcBorders>
+            <w:tcMar>
+              <w:top w:type="dxa" w:w="70"/>
+              <w:left w:type="dxa" w:w="110"/>
+              <w:bottom w:type="dxa" w:w="70"/>
+              <w:right w:type="dxa" w:w="110"/>
+            </w:tcMar>
+            <w:vAlign w:val="center"/>
+          </w:tcPr>
+          <w:p>
+            <w:pPr>
+              <w:jc w:val="left"/>
+            </w:pPr>
+            <w:r>
+              <w:rPr>
+                <w:rFonts w:ascii="Consolas" w:cs="Consolas" w:eastAsia="Consolas" w:hAnsi="Consolas"/>
+                <w:sz w:val="16"/>
+                <w:szCs w:val="16"/>
+              </w:rPr>
+              <w:t xml:space="preserve">meeting.view_all</w:t>
+            </w:r>
+          </w:p>
+        </w:tc>
+        <w:tc>
+          <w:tcPr>
+            <w:tcW w:type="dxa" w:w="1100"/>
+            <w:tcBorders>
+              <w:top w:val="single" w:color="C9D3DD" w:sz="4"/>
+              <w:left w:val="single" w:color="C9D3DD" w:sz="4"/>
+              <w:bottom w:val="single" w:color="C9D3DD" w:sz="4"/>
+              <w:right w:val="single" w:color="C9D3DD" w:sz="4"/>
+            </w:tcBorders>
             <w:tcMar>
               <w:top w:type="dxa" w:w="70"/>
               <w:left w:type="dxa" w:w="110"/>
@@ -4414,7 +4619,6 @@
               <w:bottom w:val="single" w:color="C9D3DD" w:sz="4"/>
               <w:right w:val="single" w:color="C9D3DD" w:sz="4"/>
             </w:tcBorders>
-            <w:shd w:fill="F6F8FA" w:color="auto" w:val="clear"/>
             <w:tcMar>
               <w:top w:type="dxa" w:w="70"/>
               <w:left w:type="dxa" w:w="110"/>
@@ -4449,7 +4653,344 @@
               <w:bottom w:val="single" w:color="C9D3DD" w:sz="4"/>
               <w:right w:val="single" w:color="C9D3DD" w:sz="4"/>
             </w:tcBorders>
-            <w:shd w:fill="F6F8FA" w:color="auto" w:val="clear"/>
+            <w:tcMar>
+              <w:top w:type="dxa" w:w="70"/>
+              <w:left w:type="dxa" w:w="110"/>
+              <w:bottom w:type="dxa" w:w="70"/>
+              <w:right w:type="dxa" w:w="110"/>
+            </w:tcMar>
+            <w:vAlign w:val="center"/>
+          </w:tcPr>
+          <w:p>
+            <w:pPr>
+              <w:jc w:val="center"/>
+            </w:pPr>
+            <w:r>
+              <w:rPr>
+                <w:rFonts w:ascii="Calibri" w:cs="Calibri" w:eastAsia="Calibri" w:hAnsi="Calibri"/>
+                <w:b/>
+                <w:bCs/>
+                <w:sz w:val="18"/>
+                <w:szCs w:val="18"/>
+              </w:rPr>
+              <w:t xml:space="preserve">✓</w:t>
+            </w:r>
+          </w:p>
+        </w:tc>
+        <w:tc>
+          <w:tcPr>
+            <w:tcW w:type="dxa" w:w="1200"/>
+            <w:tcBorders>
+              <w:top w:val="single" w:color="C9D3DD" w:sz="4"/>
+              <w:left w:val="single" w:color="C9D3DD" w:sz="4"/>
+              <w:bottom w:val="single" w:color="C9D3DD" w:sz="4"/>
+              <w:right w:val="single" w:color="C9D3DD" w:sz="4"/>
+            </w:tcBorders>
+            <w:tcMar>
+              <w:top w:type="dxa" w:w="70"/>
+              <w:left w:type="dxa" w:w="110"/>
+              <w:bottom w:type="dxa" w:w="70"/>
+              <w:right w:type="dxa" w:w="110"/>
+            </w:tcMar>
+            <w:vAlign w:val="center"/>
+          </w:tcPr>
+          <w:p>
+            <w:pPr>
+              <w:jc w:val="center"/>
+            </w:pPr>
+            <w:r>
+              <w:rPr>
+                <w:rFonts w:ascii="Calibri" w:cs="Calibri" w:eastAsia="Calibri" w:hAnsi="Calibri"/>
+                <w:b/>
+                <w:bCs/>
+                <w:sz w:val="18"/>
+                <w:szCs w:val="18"/>
+              </w:rPr>
+              <w:t xml:space="preserve">✓</w:t>
+            </w:r>
+          </w:p>
+        </w:tc>
+      </w:tr>
+      <w:tr>
+        <w:trPr>
+          <w:cantSplit/>
+        </w:trPr>
+        <w:tc>
+          <w:tcPr>
+            <w:tcW w:type="dxa" w:w="2500"/>
+            <w:tcBorders>
+              <w:top w:val="single" w:color="C9D3DD" w:sz="4"/>
+              <w:left w:val="single" w:color="C9D3DD" w:sz="4"/>
+              <w:bottom w:val="single" w:color="C9D3DD" w:sz="4"/>
+              <w:right w:val="single" w:color="C9D3DD" w:sz="4"/>
+            </w:tcBorders>
+            <w:shd w:fill="F6F8FA" w:color="auto" w:val="clear"/>
+            <w:tcMar>
+              <w:top w:type="dxa" w:w="70"/>
+              <w:left w:type="dxa" w:w="110"/>
+              <w:bottom w:type="dxa" w:w="70"/>
+              <w:right w:type="dxa" w:w="110"/>
+            </w:tcMar>
+            <w:vAlign w:val="center"/>
+          </w:tcPr>
+          <w:p>
+            <w:pPr>
+              <w:jc w:val="left"/>
+            </w:pPr>
+            <w:r>
+              <w:rPr>
+                <w:rFonts w:ascii="Calibri" w:cs="Calibri" w:eastAsia="Calibri" w:hAnsi="Calibri"/>
+                <w:sz w:val="20"/>
+                <w:szCs w:val="20"/>
+              </w:rPr>
+              <w:t xml:space="preserve">Buat meeting</w:t>
+            </w:r>
+          </w:p>
+        </w:tc>
+        <w:tc>
+          <w:tcPr>
+            <w:tcW w:type="dxa" w:w="2238"/>
+            <w:tcBorders>
+              <w:top w:val="single" w:color="C9D3DD" w:sz="4"/>
+              <w:left w:val="single" w:color="C9D3DD" w:sz="4"/>
+              <w:bottom w:val="single" w:color="C9D3DD" w:sz="4"/>
+              <w:right w:val="single" w:color="C9D3DD" w:sz="4"/>
+            </w:tcBorders>
+            <w:shd w:fill="F6F8FA" w:color="auto" w:val="clear"/>
+            <w:tcMar>
+              <w:top w:type="dxa" w:w="70"/>
+              <w:left w:type="dxa" w:w="110"/>
+              <w:bottom w:type="dxa" w:w="70"/>
+              <w:right w:type="dxa" w:w="110"/>
+            </w:tcMar>
+            <w:vAlign w:val="center"/>
+          </w:tcPr>
+          <w:p>
+            <w:pPr>
+              <w:jc w:val="left"/>
+            </w:pPr>
+            <w:r>
+              <w:rPr>
+                <w:rFonts w:ascii="Consolas" w:cs="Consolas" w:eastAsia="Consolas" w:hAnsi="Consolas"/>
+                <w:sz w:val="16"/>
+                <w:szCs w:val="16"/>
+              </w:rPr>
+              <w:t xml:space="preserve">meeting.create</w:t>
+            </w:r>
+          </w:p>
+        </w:tc>
+        <w:tc>
+          <w:tcPr>
+            <w:tcW w:type="dxa" w:w="1100"/>
+            <w:tcBorders>
+              <w:top w:val="single" w:color="C9D3DD" w:sz="4"/>
+              <w:left w:val="single" w:color="C9D3DD" w:sz="4"/>
+              <w:bottom w:val="single" w:color="C9D3DD" w:sz="4"/>
+              <w:right w:val="single" w:color="C9D3DD" w:sz="4"/>
+            </w:tcBorders>
+            <w:shd w:fill="F6F8FA" w:color="auto" w:val="clear"/>
+            <w:tcMar>
+              <w:top w:type="dxa" w:w="70"/>
+              <w:left w:type="dxa" w:w="110"/>
+              <w:bottom w:type="dxa" w:w="70"/>
+              <w:right w:type="dxa" w:w="110"/>
+            </w:tcMar>
+            <w:vAlign w:val="center"/>
+          </w:tcPr>
+          <w:p>
+            <w:pPr>
+              <w:jc w:val="center"/>
+            </w:pPr>
+            <w:r>
+              <w:rPr>
+                <w:rFonts w:ascii="Calibri" w:cs="Calibri" w:eastAsia="Calibri" w:hAnsi="Calibri"/>
+                <w:b/>
+                <w:bCs/>
+                <w:sz w:val="18"/>
+                <w:szCs w:val="18"/>
+              </w:rPr>
+              <w:t xml:space="preserve">✓</w:t>
+            </w:r>
+          </w:p>
+        </w:tc>
+        <w:tc>
+          <w:tcPr>
+            <w:tcW w:type="dxa" w:w="1300"/>
+            <w:tcBorders>
+              <w:top w:val="single" w:color="C9D3DD" w:sz="4"/>
+              <w:left w:val="single" w:color="C9D3DD" w:sz="4"/>
+              <w:bottom w:val="single" w:color="C9D3DD" w:sz="4"/>
+              <w:right w:val="single" w:color="C9D3DD" w:sz="4"/>
+            </w:tcBorders>
+            <w:shd w:fill="F6F8FA" w:color="auto" w:val="clear"/>
+            <w:tcMar>
+              <w:top w:type="dxa" w:w="70"/>
+              <w:left w:type="dxa" w:w="110"/>
+              <w:bottom w:type="dxa" w:w="70"/>
+              <w:right w:type="dxa" w:w="110"/>
+            </w:tcMar>
+            <w:vAlign w:val="center"/>
+          </w:tcPr>
+          <w:p>
+            <w:pPr>
+              <w:jc w:val="center"/>
+            </w:pPr>
+            <w:r>
+              <w:rPr>
+                <w:rFonts w:ascii="Calibri" w:cs="Calibri" w:eastAsia="Calibri" w:hAnsi="Calibri"/>
+                <w:b/>
+                <w:bCs/>
+                <w:sz w:val="18"/>
+                <w:szCs w:val="18"/>
+              </w:rPr>
+              <w:t xml:space="preserve">✓</w:t>
+            </w:r>
+          </w:p>
+        </w:tc>
+        <w:tc>
+          <w:tcPr>
+            <w:tcW w:type="dxa" w:w="1300"/>
+            <w:tcBorders>
+              <w:top w:val="single" w:color="C9D3DD" w:sz="4"/>
+              <w:left w:val="single" w:color="C9D3DD" w:sz="4"/>
+              <w:bottom w:val="single" w:color="C9D3DD" w:sz="4"/>
+              <w:right w:val="single" w:color="C9D3DD" w:sz="4"/>
+            </w:tcBorders>
+            <w:shd w:fill="F6F8FA" w:color="auto" w:val="clear"/>
+            <w:tcMar>
+              <w:top w:type="dxa" w:w="70"/>
+              <w:left w:type="dxa" w:w="110"/>
+              <w:bottom w:type="dxa" w:w="70"/>
+              <w:right w:type="dxa" w:w="110"/>
+            </w:tcMar>
+            <w:vAlign w:val="center"/>
+          </w:tcPr>
+          <w:p>
+            <w:pPr>
+              <w:jc w:val="center"/>
+            </w:pPr>
+            <w:r>
+              <w:rPr>
+                <w:rFonts w:ascii="Calibri" w:cs="Calibri" w:eastAsia="Calibri" w:hAnsi="Calibri"/>
+                <w:b/>
+                <w:bCs/>
+                <w:sz w:val="18"/>
+                <w:szCs w:val="18"/>
+              </w:rPr>
+              <w:t xml:space="preserve">✓</w:t>
+            </w:r>
+          </w:p>
+        </w:tc>
+        <w:tc>
+          <w:tcPr>
+            <w:tcW w:type="dxa" w:w="1200"/>
+            <w:tcBorders>
+              <w:top w:val="single" w:color="C9D3DD" w:sz="4"/>
+              <w:left w:val="single" w:color="C9D3DD" w:sz="4"/>
+              <w:bottom w:val="single" w:color="C9D3DD" w:sz="4"/>
+              <w:right w:val="single" w:color="C9D3DD" w:sz="4"/>
+            </w:tcBorders>
+            <w:shd w:fill="F6F8FA" w:color="auto" w:val="clear"/>
+            <w:tcMar>
+              <w:top w:type="dxa" w:w="70"/>
+              <w:left w:type="dxa" w:w="110"/>
+              <w:bottom w:type="dxa" w:w="70"/>
+              <w:right w:type="dxa" w:w="110"/>
+            </w:tcMar>
+            <w:vAlign w:val="center"/>
+          </w:tcPr>
+          <w:p>
+            <w:pPr>
+              <w:jc w:val="center"/>
+            </w:pPr>
+            <w:r>
+              <w:rPr>
+                <w:rFonts w:ascii="Calibri" w:cs="Calibri" w:eastAsia="Calibri" w:hAnsi="Calibri"/>
+                <w:b/>
+                <w:bCs/>
+                <w:sz w:val="18"/>
+                <w:szCs w:val="18"/>
+              </w:rPr>
+              <w:t xml:space="preserve">✓</w:t>
+            </w:r>
+          </w:p>
+        </w:tc>
+      </w:tr>
+      <w:tr>
+        <w:trPr>
+          <w:cantSplit/>
+        </w:trPr>
+        <w:tc>
+          <w:tcPr>
+            <w:tcW w:type="dxa" w:w="2500"/>
+            <w:tcBorders>
+              <w:top w:val="single" w:color="C9D3DD" w:sz="4"/>
+              <w:left w:val="single" w:color="C9D3DD" w:sz="4"/>
+              <w:bottom w:val="single" w:color="C9D3DD" w:sz="4"/>
+              <w:right w:val="single" w:color="C9D3DD" w:sz="4"/>
+            </w:tcBorders>
+            <w:tcMar>
+              <w:top w:type="dxa" w:w="70"/>
+              <w:left w:type="dxa" w:w="110"/>
+              <w:bottom w:type="dxa" w:w="70"/>
+              <w:right w:type="dxa" w:w="110"/>
+            </w:tcMar>
+            <w:vAlign w:val="center"/>
+          </w:tcPr>
+          <w:p>
+            <w:pPr>
+              <w:jc w:val="left"/>
+            </w:pPr>
+            <w:r>
+              <w:rPr>
+                <w:rFonts w:ascii="Calibri" w:cs="Calibri" w:eastAsia="Calibri" w:hAnsi="Calibri"/>
+                <w:sz w:val="20"/>
+                <w:szCs w:val="20"/>
+              </w:rPr>
+              <w:t xml:space="preserve">Kelola (edit &amp; hapus) semua meeting</w:t>
+            </w:r>
+          </w:p>
+        </w:tc>
+        <w:tc>
+          <w:tcPr>
+            <w:tcW w:type="dxa" w:w="2238"/>
+            <w:tcBorders>
+              <w:top w:val="single" w:color="C9D3DD" w:sz="4"/>
+              <w:left w:val="single" w:color="C9D3DD" w:sz="4"/>
+              <w:bottom w:val="single" w:color="C9D3DD" w:sz="4"/>
+              <w:right w:val="single" w:color="C9D3DD" w:sz="4"/>
+            </w:tcBorders>
+            <w:tcMar>
+              <w:top w:type="dxa" w:w="70"/>
+              <w:left w:type="dxa" w:w="110"/>
+              <w:bottom w:type="dxa" w:w="70"/>
+              <w:right w:type="dxa" w:w="110"/>
+            </w:tcMar>
+            <w:vAlign w:val="center"/>
+          </w:tcPr>
+          <w:p>
+            <w:pPr>
+              <w:jc w:val="left"/>
+            </w:pPr>
+            <w:r>
+              <w:rPr>
+                <w:rFonts w:ascii="Consolas" w:cs="Consolas" w:eastAsia="Consolas" w:hAnsi="Consolas"/>
+                <w:sz w:val="16"/>
+                <w:szCs w:val="16"/>
+              </w:rPr>
+              <w:t xml:space="preserve">meeting.manage</w:t>
+            </w:r>
+          </w:p>
+        </w:tc>
+        <w:tc>
+          <w:tcPr>
+            <w:tcW w:type="dxa" w:w="1100"/>
+            <w:tcBorders>
+              <w:top w:val="single" w:color="C9D3DD" w:sz="4"/>
+              <w:left w:val="single" w:color="C9D3DD" w:sz="4"/>
+              <w:bottom w:val="single" w:color="C9D3DD" w:sz="4"/>
+              <w:right w:val="single" w:color="C9D3DD" w:sz="4"/>
+            </w:tcBorders>
             <w:tcMar>
               <w:top w:type="dxa" w:w="70"/>
               <w:left w:type="dxa" w:w="110"/>
@@ -4477,6 +5018,72 @@
         </w:tc>
         <w:tc>
           <w:tcPr>
+            <w:tcW w:type="dxa" w:w="1300"/>
+            <w:tcBorders>
+              <w:top w:val="single" w:color="C9D3DD" w:sz="4"/>
+              <w:left w:val="single" w:color="C9D3DD" w:sz="4"/>
+              <w:bottom w:val="single" w:color="C9D3DD" w:sz="4"/>
+              <w:right w:val="single" w:color="C9D3DD" w:sz="4"/>
+            </w:tcBorders>
+            <w:tcMar>
+              <w:top w:type="dxa" w:w="70"/>
+              <w:left w:type="dxa" w:w="110"/>
+              <w:bottom w:type="dxa" w:w="70"/>
+              <w:right w:type="dxa" w:w="110"/>
+            </w:tcMar>
+            <w:vAlign w:val="center"/>
+          </w:tcPr>
+          <w:p>
+            <w:pPr>
+              <w:jc w:val="center"/>
+            </w:pPr>
+            <w:r>
+              <w:rPr>
+                <w:rFonts w:ascii="Calibri" w:cs="Calibri" w:eastAsia="Calibri" w:hAnsi="Calibri"/>
+                <w:b w:val="false"/>
+                <w:bCs w:val="false"/>
+                <w:sz w:val="18"/>
+                <w:szCs w:val="18"/>
+              </w:rPr>
+              <w:t xml:space="preserve">Divisi sendiri</w:t>
+            </w:r>
+          </w:p>
+        </w:tc>
+        <w:tc>
+          <w:tcPr>
+            <w:tcW w:type="dxa" w:w="1300"/>
+            <w:tcBorders>
+              <w:top w:val="single" w:color="C9D3DD" w:sz="4"/>
+              <w:left w:val="single" w:color="C9D3DD" w:sz="4"/>
+              <w:bottom w:val="single" w:color="C9D3DD" w:sz="4"/>
+              <w:right w:val="single" w:color="C9D3DD" w:sz="4"/>
+            </w:tcBorders>
+            <w:tcMar>
+              <w:top w:type="dxa" w:w="70"/>
+              <w:left w:type="dxa" w:w="110"/>
+              <w:bottom w:type="dxa" w:w="70"/>
+              <w:right w:type="dxa" w:w="110"/>
+            </w:tcMar>
+            <w:vAlign w:val="center"/>
+          </w:tcPr>
+          <w:p>
+            <w:pPr>
+              <w:jc w:val="center"/>
+            </w:pPr>
+            <w:r>
+              <w:rPr>
+                <w:rFonts w:ascii="Calibri" w:cs="Calibri" w:eastAsia="Calibri" w:hAnsi="Calibri"/>
+                <w:b w:val="false"/>
+                <w:bCs w:val="false"/>
+                <w:sz w:val="18"/>
+                <w:szCs w:val="18"/>
+              </w:rPr>
+              <w:t xml:space="preserve">Semua divisi</w:t>
+            </w:r>
+          </w:p>
+        </w:tc>
+        <w:tc>
+          <w:tcPr>
             <w:tcW w:type="dxa" w:w="1200"/>
             <w:tcBorders>
               <w:top w:val="single" w:color="C9D3DD" w:sz="4"/>
@@ -4484,7 +5091,6 @@
               <w:bottom w:val="single" w:color="C9D3DD" w:sz="4"/>
               <w:right w:val="single" w:color="C9D3DD" w:sz="4"/>
             </w:tcBorders>
-            <w:shd w:fill="F6F8FA" w:color="auto" w:val="clear"/>
             <w:tcMar>
               <w:top w:type="dxa" w:w="70"/>
               <w:left w:type="dxa" w:w="110"/>
@@ -4511,20 +5117,6 @@
         </w:tc>
       </w:tr>
     </w:tbl>
-    <w:p>
-      <w:pPr>
-        <w:spacing w:after="120" w:before="80" w:line="276"/>
-      </w:pPr>
-      <w:r>
-        <w:rPr>
-          <w:rFonts w:ascii="Calibri" w:cs="Calibri" w:eastAsia="Calibri" w:hAnsi="Calibri"/>
-          <w:color w:val="5B6474"/>
-          <w:sz w:val="18"/>
-          <w:szCs w:val="18"/>
-        </w:rPr>
-        <w:t xml:space="preserve">** Staff hanya bisa update progress setelah planning disetujui. Selama masih menunggu atau ditolak, staff bisa mengedit atau menghapus planning buatannya sendiri.</w:t>
-      </w:r>
-    </w:p>
     <w:p>
       <w:pPr>
         <w:spacing w:after="120" w:before="0" w:line="276"/>
@@ -4623,6 +5215,24 @@
           <w:sz w:val="20"/>
           <w:szCs w:val="20"/>
         </w:rPr>
+        <w:t xml:space="preserve"> dan </w:t>
+      </w:r>
+      <w:r>
+        <w:rPr>
+          <w:rFonts w:ascii="Calibri" w:cs="Calibri" w:eastAsia="Calibri" w:hAnsi="Calibri"/>
+          <w:b/>
+          <w:bCs/>
+          <w:sz w:val="20"/>
+          <w:szCs w:val="20"/>
+        </w:rPr>
+        <w:t xml:space="preserve">Meeting</w:t>
+      </w:r>
+      <w:r>
+        <w:rPr>
+          <w:rFonts w:ascii="Calibri" w:cs="Calibri" w:eastAsia="Calibri" w:hAnsi="Calibri"/>
+          <w:sz w:val="20"/>
+          <w:szCs w:val="20"/>
+        </w:rPr>
         <w:t xml:space="preserve"> muncul untuk semua user. Menu </w:t>
       </w:r>
       <w:r>
@@ -4818,7 +5428,7 @@
                 <w:sz w:val="20"/>
                 <w:szCs w:val="20"/>
               </w:rPr>
-              <w:t xml:space="preserve">Dashboard, Karyawan, Absensi, Progress Kerja, Planning Meeting</w:t>
+              <w:t xml:space="preserve">Dashboard, Karyawan, Absensi, Progress Kerja</w:t>
             </w:r>
           </w:p>
         </w:tc>
@@ -4889,7 +5499,7 @@
                 <w:sz w:val="20"/>
                 <w:szCs w:val="20"/>
               </w:rPr>
-              <w:t xml:space="preserve">Dashboard, Customer, Quotation, Progress Kerja, Planning Meeting</w:t>
+              <w:t xml:space="preserve">Dashboard, Customer, Quotation, Progress Kerja</w:t>
             </w:r>
           </w:p>
         </w:tc>
@@ -4958,7 +5568,7 @@
                 <w:sz w:val="20"/>
                 <w:szCs w:val="20"/>
               </w:rPr>
-              <w:t xml:space="preserve">Dashboard, Surat Berita Kerja, Jadwal Produksi, Data Mesin, Progress Kerja, Planning Meeting</w:t>
+              <w:t xml:space="preserve">Dashboard, Surat Berita Kerja, Jadwal Produksi, Data Mesin, Progress Kerja</w:t>
             </w:r>
           </w:p>
         </w:tc>
@@ -5029,7 +5639,7 @@
                 <w:sz w:val="20"/>
                 <w:szCs w:val="20"/>
               </w:rPr>
-              <w:t xml:space="preserve">Dashboard, Jadwal Produksi, Data Mesin, Progress Kerja, Planning Meeting</w:t>
+              <w:t xml:space="preserve">Dashboard, Jadwal Produksi, Data Mesin, Progress Kerja</w:t>
             </w:r>
           </w:p>
         </w:tc>
@@ -5098,7 +5708,7 @@
                 <w:sz w:val="20"/>
                 <w:szCs w:val="20"/>
               </w:rPr>
-              <w:t xml:space="preserve">Dashboard, Surat Berita Kerja, Jadwal Produksi, Data Mesin, Progress Kerja, Planning Meeting</w:t>
+              <w:t xml:space="preserve">Dashboard, Surat Berita Kerja, Jadwal Produksi, Data Mesin, Progress Kerja</w:t>
             </w:r>
           </w:p>
         </w:tc>
@@ -5169,7 +5779,7 @@
                 <w:sz w:val="20"/>
                 <w:szCs w:val="20"/>
               </w:rPr>
-              <w:t xml:space="preserve">Dashboard, Jadwal Produksi, Data Mesin, Progress Kerja, Planning Meeting</w:t>
+              <w:t xml:space="preserve">Dashboard, Jadwal Produksi, Data Mesin, Progress Kerja</w:t>
             </w:r>
           </w:p>
         </w:tc>
@@ -5309,7 +5919,7 @@
                 <w:sz w:val="20"/>
                 <w:szCs w:val="20"/>
               </w:rPr>
-              <w:t xml:space="preserve">Dashboard, Karyawan, Progress Kerja, Planning Meeting</w:t>
+              <w:t xml:space="preserve">Dashboard, Karyawan, Progress Kerja</w:t>
             </w:r>
           </w:p>
         </w:tc>
@@ -5449,7 +6059,7 @@
                 <w:sz w:val="20"/>
                 <w:szCs w:val="20"/>
               </w:rPr>
-              <w:t xml:space="preserve">Dashboard, Customer, Quotation, Karyawan, Absensi, Progress Kerja, Planning Meeting</w:t>
+              <w:t xml:space="preserve">Dashboard, Customer, Quotation, Karyawan, Absensi, Progress Kerja</w:t>
             </w:r>
           </w:p>
         </w:tc>
@@ -7048,7 +7658,7 @@
                 <w:sz w:val="17"/>
                 <w:szCs w:val="17"/>
               </w:rPr>
-              <w:t xml:space="preserve">marketing.staff@</w:t>
+              <w:t xml:space="preserve">marketing@</w:t>
             </w:r>
           </w:p>
         </w:tc>
@@ -7079,7 +7689,7 @@
                 <w:sz w:val="20"/>
                 <w:szCs w:val="20"/>
               </w:rPr>
-              <w:t xml:space="preserve">Buat planning (judul, tanggal, deskripsi, 1 link, 1 file). Approval = Menunggu, nomor otomatis PLN-YYYYMM-xxxx.</w:t>
+              <w:t xml:space="preserve">Buat planning (judul, tanggal, deskripsi, 1 link, 1 file). Nomor otomatis PLN-YYYYMM-xxxx dan planning langsung aktif (tanpa approval).</w:t>
             </w:r>
           </w:p>
         </w:tc>
@@ -7223,7 +7833,7 @@
                 <w:sz w:val="17"/>
                 <w:szCs w:val="17"/>
               </w:rPr>
-              <w:t xml:space="preserve">marketing.staff@</w:t>
+              <w:t xml:space="preserve">marketing@</w:t>
             </w:r>
           </w:p>
         </w:tc>
@@ -7255,7 +7865,7 @@
                 <w:sz w:val="20"/>
                 <w:szCs w:val="20"/>
               </w:rPr>
-              <w:t xml:space="preserve">Kolom divisi terkunci di Marketing; bagian "Update progress" belum muncul.</w:t>
+              <w:t xml:space="preserve">Kolom divisi terkunci di Marketing.</w:t>
             </w:r>
           </w:p>
         </w:tc>
@@ -7399,7 +8009,7 @@
                 <w:sz w:val="17"/>
                 <w:szCs w:val="17"/>
               </w:rPr>
-              <w:t xml:space="preserve">ppic.staff@ / ppic@</w:t>
+              <w:t xml:space="preserve">marketing.staff@</w:t>
             </w:r>
           </w:p>
         </w:tc>
@@ -7430,7 +8040,7 @@
                 <w:sz w:val="20"/>
                 <w:szCs w:val="20"/>
               </w:rPr>
-              <w:t xml:space="preserve">Planning Marketing tidak terlihat di daftar.</w:t>
+              <w:t xml:space="preserve">Tombol "Buat planning" tidak ada; planning divisi Marketing tetap terlihat.</w:t>
             </w:r>
           </w:p>
         </w:tc>
@@ -7574,7 +8184,7 @@
                 <w:sz w:val="17"/>
                 <w:szCs w:val="17"/>
               </w:rPr>
-              <w:t xml:space="preserve">marketing@</w:t>
+              <w:t xml:space="preserve">ppic.staff@ / ppic@</w:t>
             </w:r>
           </w:p>
         </w:tc>
@@ -7606,7 +8216,7 @@
                 <w:sz w:val="20"/>
                 <w:szCs w:val="20"/>
               </w:rPr>
-              <w:t xml:space="preserve">Buka planning tadi → tombol Setujui, Tolak, Edit, Hapus tersedia.</w:t>
+              <w:t xml:space="preserve">Planning Marketing tidak terlihat di daftar.</w:t>
             </w:r>
           </w:p>
         </w:tc>
@@ -7750,7 +8360,7 @@
                 <w:sz w:val="17"/>
                 <w:szCs w:val="17"/>
               </w:rPr>
-              <w:t xml:space="preserve">marketing@</w:t>
+              <w:t xml:space="preserve">marketing.staff@</w:t>
             </w:r>
           </w:p>
         </w:tc>
@@ -7781,7 +8391,7 @@
                 <w:sz w:val="20"/>
                 <w:szCs w:val="20"/>
               </w:rPr>
-              <w:t xml:space="preserve">Tolak tanpa alasan → tidak bisa; isi alasan → status Ditolak dan catatan tampil.</w:t>
+              <w:t xml:space="preserve">Update progress 60% → status otomatis Berjalan; 100% → Selesai.</w:t>
             </w:r>
           </w:p>
         </w:tc>
@@ -7957,7 +8567,7 @@
                 <w:sz w:val="20"/>
                 <w:szCs w:val="20"/>
               </w:rPr>
-              <w:t xml:space="preserve">Edit planning yang ditolak → approval kembali Menunggu.</w:t>
+              <w:t xml:space="preserve">Tombol Edit/Hapus planning tidak ada.</w:t>
             </w:r>
           </w:p>
         </w:tc>
@@ -8132,7 +8742,7 @@
                 <w:sz w:val="20"/>
                 <w:szCs w:val="20"/>
               </w:rPr>
-              <w:t xml:space="preserve">Setujui → approval Disetujui; nama &amp; waktu approval tampil.</w:t>
+              <w:t xml:space="preserve">Edit dan hapus planning divisinya.</w:t>
             </w:r>
           </w:p>
         </w:tc>
@@ -8276,7 +8886,7 @@
                 <w:sz w:val="17"/>
                 <w:szCs w:val="17"/>
               </w:rPr>
-              <w:t xml:space="preserve">marketing.staff@</w:t>
+              <w:t xml:space="preserve">gm@</w:t>
             </w:r>
           </w:p>
         </w:tc>
@@ -8308,7 +8918,7 @@
                 <w:sz w:val="20"/>
                 <w:szCs w:val="20"/>
               </w:rPr>
-              <w:t xml:space="preserve">Update progress 60% → status otomatis Berjalan; 100% → Selesai.</w:t>
+              <w:t xml:space="preserve">Dropdown divisi berisi semua divisi; bisa membuat, melihat, dan edit planning divisi mana pun.</w:t>
             </w:r>
           </w:p>
         </w:tc>
@@ -8422,357 +9032,6 @@
                 <w:szCs w:val="20"/>
               </w:rPr>
               <w:t xml:space="preserve">15</w:t>
-            </w:r>
-          </w:p>
-        </w:tc>
-        <w:tc>
-          <w:tcPr>
-            <w:tcW w:type="dxa" w:w="1800"/>
-            <w:tcBorders>
-              <w:top w:val="single" w:color="C9D3DD" w:sz="4"/>
-              <w:left w:val="single" w:color="C9D3DD" w:sz="4"/>
-              <w:bottom w:val="single" w:color="C9D3DD" w:sz="4"/>
-              <w:right w:val="single" w:color="C9D3DD" w:sz="4"/>
-            </w:tcBorders>
-            <w:tcMar>
-              <w:top w:type="dxa" w:w="70"/>
-              <w:left w:type="dxa" w:w="110"/>
-              <w:bottom w:type="dxa" w:w="70"/>
-              <w:right w:type="dxa" w:w="110"/>
-            </w:tcMar>
-            <w:vAlign w:val="center"/>
-          </w:tcPr>
-          <w:p>
-            <w:pPr>
-              <w:jc w:val="left"/>
-            </w:pPr>
-            <w:r>
-              <w:rPr>
-                <w:rFonts w:ascii="Consolas" w:cs="Consolas" w:eastAsia="Consolas" w:hAnsi="Consolas"/>
-                <w:sz w:val="17"/>
-                <w:szCs w:val="17"/>
-              </w:rPr>
-              <w:t xml:space="preserve">marketing.staff@</w:t>
-            </w:r>
-          </w:p>
-        </w:tc>
-        <w:tc>
-          <w:tcPr>
-            <w:tcW w:type="dxa" w:w="4238"/>
-            <w:tcBorders>
-              <w:top w:val="single" w:color="C9D3DD" w:sz="4"/>
-              <w:left w:val="single" w:color="C9D3DD" w:sz="4"/>
-              <w:bottom w:val="single" w:color="C9D3DD" w:sz="4"/>
-              <w:right w:val="single" w:color="C9D3DD" w:sz="4"/>
-            </w:tcBorders>
-            <w:tcMar>
-              <w:top w:type="dxa" w:w="70"/>
-              <w:left w:type="dxa" w:w="110"/>
-              <w:bottom w:type="dxa" w:w="70"/>
-              <w:right w:type="dxa" w:w="110"/>
-            </w:tcMar>
-            <w:vAlign w:val="center"/>
-          </w:tcPr>
-          <w:p>
-            <w:pPr>
-              <w:jc w:val="left"/>
-            </w:pPr>
-            <w:r>
-              <w:rPr>
-                <w:rFonts w:ascii="Calibri" w:cs="Calibri" w:eastAsia="Calibri" w:hAnsi="Calibri"/>
-                <w:sz w:val="20"/>
-                <w:szCs w:val="20"/>
-              </w:rPr>
-              <w:t xml:space="preserve">Tombol Edit/Hapus tidak ada pada planning yang sudah disetujui.</w:t>
-            </w:r>
-          </w:p>
-        </w:tc>
-        <w:tc>
-          <w:tcPr>
-            <w:tcW w:type="dxa" w:w="1300"/>
-            <w:tcBorders>
-              <w:top w:val="single" w:color="C9D3DD" w:sz="4"/>
-              <w:left w:val="single" w:color="C9D3DD" w:sz="4"/>
-              <w:bottom w:val="single" w:color="C9D3DD" w:sz="4"/>
-              <w:right w:val="single" w:color="C9D3DD" w:sz="4"/>
-            </w:tcBorders>
-            <w:tcMar>
-              <w:top w:type="dxa" w:w="70"/>
-              <w:left w:type="dxa" w:w="110"/>
-              <w:bottom w:type="dxa" w:w="70"/>
-              <w:right w:type="dxa" w:w="110"/>
-            </w:tcMar>
-            <w:vAlign w:val="center"/>
-          </w:tcPr>
-          <w:p>
-            <w:pPr>
-              <w:jc w:val="left"/>
-            </w:pPr>
-            <w:r>
-              <w:rPr>
-                <w:rFonts w:ascii="Calibri" w:cs="Calibri" w:eastAsia="Calibri" w:hAnsi="Calibri"/>
-                <w:sz w:val="18"/>
-                <w:szCs w:val="18"/>
-              </w:rPr>
-              <w:t xml:space="preserve">☐  Lulus</w:t>
-            </w:r>
-          </w:p>
-          <w:p>
-            <w:pPr>
-              <w:jc w:val="left"/>
-            </w:pPr>
-            <w:r>
-              <w:rPr>
-                <w:rFonts w:ascii="Calibri" w:cs="Calibri" w:eastAsia="Calibri" w:hAnsi="Calibri"/>
-                <w:sz w:val="18"/>
-                <w:szCs w:val="18"/>
-              </w:rPr>
-              <w:t xml:space="preserve">☐  Gagal</w:t>
-            </w:r>
-          </w:p>
-        </w:tc>
-        <w:tc>
-          <w:tcPr>
-            <w:tcW w:type="dxa" w:w="1800"/>
-            <w:tcBorders>
-              <w:top w:val="single" w:color="C9D3DD" w:sz="4"/>
-              <w:left w:val="single" w:color="C9D3DD" w:sz="4"/>
-              <w:bottom w:val="single" w:color="C9D3DD" w:sz="4"/>
-              <w:right w:val="single" w:color="C9D3DD" w:sz="4"/>
-            </w:tcBorders>
-            <w:tcMar>
-              <w:top w:type="dxa" w:w="70"/>
-              <w:left w:type="dxa" w:w="110"/>
-              <w:bottom w:type="dxa" w:w="70"/>
-              <w:right w:type="dxa" w:w="110"/>
-            </w:tcMar>
-            <w:vAlign w:val="center"/>
-          </w:tcPr>
-          <w:p>
-            <w:pPr>
-              <w:jc w:val="left"/>
-            </w:pPr>
-            <w:r>
-              <w:rPr>
-                <w:rFonts w:ascii="Calibri" w:cs="Calibri" w:eastAsia="Calibri" w:hAnsi="Calibri"/>
-                <w:sz w:val="20"/>
-                <w:szCs w:val="20"/>
-              </w:rPr>
-              <w:t xml:space="preserve"/>
-            </w:r>
-          </w:p>
-        </w:tc>
-      </w:tr>
-      <w:tr>
-        <w:trPr>
-          <w:cantSplit/>
-        </w:trPr>
-        <w:tc>
-          <w:tcPr>
-            <w:tcW w:type="dxa" w:w="500"/>
-            <w:tcBorders>
-              <w:top w:val="single" w:color="C9D3DD" w:sz="4"/>
-              <w:left w:val="single" w:color="C9D3DD" w:sz="4"/>
-              <w:bottom w:val="single" w:color="C9D3DD" w:sz="4"/>
-              <w:right w:val="single" w:color="C9D3DD" w:sz="4"/>
-            </w:tcBorders>
-            <w:shd w:fill="F6F8FA" w:color="auto" w:val="clear"/>
-            <w:tcMar>
-              <w:top w:type="dxa" w:w="70"/>
-              <w:left w:type="dxa" w:w="110"/>
-              <w:bottom w:type="dxa" w:w="70"/>
-              <w:right w:type="dxa" w:w="110"/>
-            </w:tcMar>
-            <w:vAlign w:val="center"/>
-          </w:tcPr>
-          <w:p>
-            <w:pPr>
-              <w:jc w:val="center"/>
-            </w:pPr>
-            <w:r>
-              <w:rPr>
-                <w:rFonts w:ascii="Calibri" w:cs="Calibri" w:eastAsia="Calibri" w:hAnsi="Calibri"/>
-                <w:sz w:val="20"/>
-                <w:szCs w:val="20"/>
-              </w:rPr>
-              <w:t xml:space="preserve">16</w:t>
-            </w:r>
-          </w:p>
-        </w:tc>
-        <w:tc>
-          <w:tcPr>
-            <w:tcW w:type="dxa" w:w="1800"/>
-            <w:tcBorders>
-              <w:top w:val="single" w:color="C9D3DD" w:sz="4"/>
-              <w:left w:val="single" w:color="C9D3DD" w:sz="4"/>
-              <w:bottom w:val="single" w:color="C9D3DD" w:sz="4"/>
-              <w:right w:val="single" w:color="C9D3DD" w:sz="4"/>
-            </w:tcBorders>
-            <w:shd w:fill="F6F8FA" w:color="auto" w:val="clear"/>
-            <w:tcMar>
-              <w:top w:type="dxa" w:w="70"/>
-              <w:left w:type="dxa" w:w="110"/>
-              <w:bottom w:type="dxa" w:w="70"/>
-              <w:right w:type="dxa" w:w="110"/>
-            </w:tcMar>
-            <w:vAlign w:val="center"/>
-          </w:tcPr>
-          <w:p>
-            <w:pPr>
-              <w:jc w:val="left"/>
-            </w:pPr>
-            <w:r>
-              <w:rPr>
-                <w:rFonts w:ascii="Consolas" w:cs="Consolas" w:eastAsia="Consolas" w:hAnsi="Consolas"/>
-                <w:sz w:val="17"/>
-                <w:szCs w:val="17"/>
-              </w:rPr>
-              <w:t xml:space="preserve">gm@</w:t>
-            </w:r>
-          </w:p>
-        </w:tc>
-        <w:tc>
-          <w:tcPr>
-            <w:tcW w:type="dxa" w:w="4238"/>
-            <w:tcBorders>
-              <w:top w:val="single" w:color="C9D3DD" w:sz="4"/>
-              <w:left w:val="single" w:color="C9D3DD" w:sz="4"/>
-              <w:bottom w:val="single" w:color="C9D3DD" w:sz="4"/>
-              <w:right w:val="single" w:color="C9D3DD" w:sz="4"/>
-            </w:tcBorders>
-            <w:shd w:fill="F6F8FA" w:color="auto" w:val="clear"/>
-            <w:tcMar>
-              <w:top w:type="dxa" w:w="70"/>
-              <w:left w:type="dxa" w:w="110"/>
-              <w:bottom w:type="dxa" w:w="70"/>
-              <w:right w:type="dxa" w:w="110"/>
-            </w:tcMar>
-            <w:vAlign w:val="center"/>
-          </w:tcPr>
-          <w:p>
-            <w:pPr>
-              <w:jc w:val="left"/>
-            </w:pPr>
-            <w:r>
-              <w:rPr>
-                <w:rFonts w:ascii="Calibri" w:cs="Calibri" w:eastAsia="Calibri" w:hAnsi="Calibri"/>
-                <w:sz w:val="20"/>
-                <w:szCs w:val="20"/>
-              </w:rPr>
-              <w:t xml:space="preserve">Dropdown divisi berisi semua divisi; bisa melihat, edit, dan approve planning divisi mana pun.</w:t>
-            </w:r>
-          </w:p>
-        </w:tc>
-        <w:tc>
-          <w:tcPr>
-            <w:tcW w:type="dxa" w:w="1300"/>
-            <w:tcBorders>
-              <w:top w:val="single" w:color="C9D3DD" w:sz="4"/>
-              <w:left w:val="single" w:color="C9D3DD" w:sz="4"/>
-              <w:bottom w:val="single" w:color="C9D3DD" w:sz="4"/>
-              <w:right w:val="single" w:color="C9D3DD" w:sz="4"/>
-            </w:tcBorders>
-            <w:shd w:fill="F6F8FA" w:color="auto" w:val="clear"/>
-            <w:tcMar>
-              <w:top w:type="dxa" w:w="70"/>
-              <w:left w:type="dxa" w:w="110"/>
-              <w:bottom w:type="dxa" w:w="70"/>
-              <w:right w:type="dxa" w:w="110"/>
-            </w:tcMar>
-            <w:vAlign w:val="center"/>
-          </w:tcPr>
-          <w:p>
-            <w:pPr>
-              <w:jc w:val="left"/>
-            </w:pPr>
-            <w:r>
-              <w:rPr>
-                <w:rFonts w:ascii="Calibri" w:cs="Calibri" w:eastAsia="Calibri" w:hAnsi="Calibri"/>
-                <w:sz w:val="18"/>
-                <w:szCs w:val="18"/>
-              </w:rPr>
-              <w:t xml:space="preserve">☐  Lulus</w:t>
-            </w:r>
-          </w:p>
-          <w:p>
-            <w:pPr>
-              <w:jc w:val="left"/>
-            </w:pPr>
-            <w:r>
-              <w:rPr>
-                <w:rFonts w:ascii="Calibri" w:cs="Calibri" w:eastAsia="Calibri" w:hAnsi="Calibri"/>
-                <w:sz w:val="18"/>
-                <w:szCs w:val="18"/>
-              </w:rPr>
-              <w:t xml:space="preserve">☐  Gagal</w:t>
-            </w:r>
-          </w:p>
-        </w:tc>
-        <w:tc>
-          <w:tcPr>
-            <w:tcW w:type="dxa" w:w="1800"/>
-            <w:tcBorders>
-              <w:top w:val="single" w:color="C9D3DD" w:sz="4"/>
-              <w:left w:val="single" w:color="C9D3DD" w:sz="4"/>
-              <w:bottom w:val="single" w:color="C9D3DD" w:sz="4"/>
-              <w:right w:val="single" w:color="C9D3DD" w:sz="4"/>
-            </w:tcBorders>
-            <w:shd w:fill="F6F8FA" w:color="auto" w:val="clear"/>
-            <w:tcMar>
-              <w:top w:type="dxa" w:w="70"/>
-              <w:left w:type="dxa" w:w="110"/>
-              <w:bottom w:type="dxa" w:w="70"/>
-              <w:right w:type="dxa" w:w="110"/>
-            </w:tcMar>
-            <w:vAlign w:val="center"/>
-          </w:tcPr>
-          <w:p>
-            <w:pPr>
-              <w:jc w:val="left"/>
-            </w:pPr>
-            <w:r>
-              <w:rPr>
-                <w:rFonts w:ascii="Calibri" w:cs="Calibri" w:eastAsia="Calibri" w:hAnsi="Calibri"/>
-                <w:sz w:val="20"/>
-                <w:szCs w:val="20"/>
-              </w:rPr>
-              <w:t xml:space="preserve"/>
-            </w:r>
-          </w:p>
-        </w:tc>
-      </w:tr>
-      <w:tr>
-        <w:trPr>
-          <w:cantSplit/>
-        </w:trPr>
-        <w:tc>
-          <w:tcPr>
-            <w:tcW w:type="dxa" w:w="500"/>
-            <w:tcBorders>
-              <w:top w:val="single" w:color="C9D3DD" w:sz="4"/>
-              <w:left w:val="single" w:color="C9D3DD" w:sz="4"/>
-              <w:bottom w:val="single" w:color="C9D3DD" w:sz="4"/>
-              <w:right w:val="single" w:color="C9D3DD" w:sz="4"/>
-            </w:tcBorders>
-            <w:tcMar>
-              <w:top w:type="dxa" w:w="70"/>
-              <w:left w:type="dxa" w:w="110"/>
-              <w:bottom w:type="dxa" w:w="70"/>
-              <w:right w:type="dxa" w:w="110"/>
-            </w:tcMar>
-            <w:vAlign w:val="center"/>
-          </w:tcPr>
-          <w:p>
-            <w:pPr>
-              <w:jc w:val="center"/>
-            </w:pPr>
-            <w:r>
-              <w:rPr>
-                <w:rFonts w:ascii="Calibri" w:cs="Calibri" w:eastAsia="Calibri" w:hAnsi="Calibri"/>
-                <w:sz w:val="20"/>
-                <w:szCs w:val="20"/>
-              </w:rPr>
-              <w:t xml:space="preserve">17</w:t>
             </w:r>
           </w:p>
         </w:tc>
@@ -9164,7 +9423,7 @@
                 <w:sz w:val="20"/>
                 <w:szCs w:val="20"/>
               </w:rPr>
-              <w:t xml:space="preserve">18</w:t>
+              <w:t xml:space="preserve">16</w:t>
             </w:r>
           </w:p>
         </w:tc>
@@ -9339,7 +9598,7 @@
                 <w:sz w:val="20"/>
                 <w:szCs w:val="20"/>
               </w:rPr>
-              <w:t xml:space="preserve">19</w:t>
+              <w:t xml:space="preserve">17</w:t>
             </w:r>
           </w:p>
         </w:tc>
@@ -9517,7 +9776,7 @@
                 <w:sz w:val="20"/>
                 <w:szCs w:val="20"/>
               </w:rPr>
-              <w:t xml:space="preserve">20</w:t>
+              <w:t xml:space="preserve">18</w:t>
             </w:r>
           </w:p>
         </w:tc>
@@ -9692,6 +9951,577 @@
                 <w:sz w:val="20"/>
                 <w:szCs w:val="20"/>
               </w:rPr>
+              <w:t xml:space="preserve">19</w:t>
+            </w:r>
+          </w:p>
+        </w:tc>
+        <w:tc>
+          <w:tcPr>
+            <w:tcW w:type="dxa" w:w="1800"/>
+            <w:tcBorders>
+              <w:top w:val="single" w:color="C9D3DD" w:sz="4"/>
+              <w:left w:val="single" w:color="C9D3DD" w:sz="4"/>
+              <w:bottom w:val="single" w:color="C9D3DD" w:sz="4"/>
+              <w:right w:val="single" w:color="C9D3DD" w:sz="4"/>
+            </w:tcBorders>
+            <w:shd w:fill="F6F8FA" w:color="auto" w:val="clear"/>
+            <w:tcMar>
+              <w:top w:type="dxa" w:w="70"/>
+              <w:left w:type="dxa" w:w="110"/>
+              <w:bottom w:type="dxa" w:w="70"/>
+              <w:right w:type="dxa" w:w="110"/>
+            </w:tcMar>
+            <w:vAlign w:val="center"/>
+          </w:tcPr>
+          <w:p>
+            <w:pPr>
+              <w:jc w:val="left"/>
+            </w:pPr>
+            <w:r>
+              <w:rPr>
+                <w:rFonts w:ascii="Calibri" w:cs="Calibri" w:eastAsia="Calibri" w:hAnsi="Calibri"/>
+                <w:color w:val="5B6474"/>
+                <w:sz w:val="18"/>
+                <w:szCs w:val="18"/>
+              </w:rPr>
+              <w:t xml:space="preserve">Akun mana pun</w:t>
+            </w:r>
+          </w:p>
+        </w:tc>
+        <w:tc>
+          <w:tcPr>
+            <w:tcW w:type="dxa" w:w="4238"/>
+            <w:tcBorders>
+              <w:top w:val="single" w:color="C9D3DD" w:sz="4"/>
+              <w:left w:val="single" w:color="C9D3DD" w:sz="4"/>
+              <w:bottom w:val="single" w:color="C9D3DD" w:sz="4"/>
+              <w:right w:val="single" w:color="C9D3DD" w:sz="4"/>
+            </w:tcBorders>
+            <w:shd w:fill="F6F8FA" w:color="auto" w:val="clear"/>
+            <w:tcMar>
+              <w:top w:type="dxa" w:w="70"/>
+              <w:left w:type="dxa" w:w="110"/>
+              <w:bottom w:type="dxa" w:w="70"/>
+              <w:right w:type="dxa" w:w="110"/>
+            </w:tcMar>
+            <w:vAlign w:val="center"/>
+          </w:tcPr>
+          <w:p>
+            <w:pPr>
+              <w:jc w:val="left"/>
+            </w:pPr>
+            <w:r>
+              <w:rPr>
+                <w:rFonts w:ascii="Calibri" w:cs="Calibri" w:eastAsia="Calibri" w:hAnsi="Calibri"/>
+                <w:sz w:val="20"/>
+                <w:szCs w:val="20"/>
+              </w:rPr>
+              <w:t xml:space="preserve">Filter divisi, status, dan pencarian judul/nomor bekerja.</w:t>
+            </w:r>
+          </w:p>
+        </w:tc>
+        <w:tc>
+          <w:tcPr>
+            <w:tcW w:type="dxa" w:w="1300"/>
+            <w:tcBorders>
+              <w:top w:val="single" w:color="C9D3DD" w:sz="4"/>
+              <w:left w:val="single" w:color="C9D3DD" w:sz="4"/>
+              <w:bottom w:val="single" w:color="C9D3DD" w:sz="4"/>
+              <w:right w:val="single" w:color="C9D3DD" w:sz="4"/>
+            </w:tcBorders>
+            <w:shd w:fill="F6F8FA" w:color="auto" w:val="clear"/>
+            <w:tcMar>
+              <w:top w:type="dxa" w:w="70"/>
+              <w:left w:type="dxa" w:w="110"/>
+              <w:bottom w:type="dxa" w:w="70"/>
+              <w:right w:type="dxa" w:w="110"/>
+            </w:tcMar>
+            <w:vAlign w:val="center"/>
+          </w:tcPr>
+          <w:p>
+            <w:pPr>
+              <w:jc w:val="left"/>
+            </w:pPr>
+            <w:r>
+              <w:rPr>
+                <w:rFonts w:ascii="Calibri" w:cs="Calibri" w:eastAsia="Calibri" w:hAnsi="Calibri"/>
+                <w:sz w:val="18"/>
+                <w:szCs w:val="18"/>
+              </w:rPr>
+              <w:t xml:space="preserve">☐  Lulus</w:t>
+            </w:r>
+          </w:p>
+          <w:p>
+            <w:pPr>
+              <w:jc w:val="left"/>
+            </w:pPr>
+            <w:r>
+              <w:rPr>
+                <w:rFonts w:ascii="Calibri" w:cs="Calibri" w:eastAsia="Calibri" w:hAnsi="Calibri"/>
+                <w:sz w:val="18"/>
+                <w:szCs w:val="18"/>
+              </w:rPr>
+              <w:t xml:space="preserve">☐  Gagal</w:t>
+            </w:r>
+          </w:p>
+        </w:tc>
+        <w:tc>
+          <w:tcPr>
+            <w:tcW w:type="dxa" w:w="1800"/>
+            <w:tcBorders>
+              <w:top w:val="single" w:color="C9D3DD" w:sz="4"/>
+              <w:left w:val="single" w:color="C9D3DD" w:sz="4"/>
+              <w:bottom w:val="single" w:color="C9D3DD" w:sz="4"/>
+              <w:right w:val="single" w:color="C9D3DD" w:sz="4"/>
+            </w:tcBorders>
+            <w:shd w:fill="F6F8FA" w:color="auto" w:val="clear"/>
+            <w:tcMar>
+              <w:top w:type="dxa" w:w="70"/>
+              <w:left w:type="dxa" w:w="110"/>
+              <w:bottom w:type="dxa" w:w="70"/>
+              <w:right w:type="dxa" w:w="110"/>
+            </w:tcMar>
+            <w:vAlign w:val="center"/>
+          </w:tcPr>
+          <w:p>
+            <w:pPr>
+              <w:jc w:val="left"/>
+            </w:pPr>
+            <w:r>
+              <w:rPr>
+                <w:rFonts w:ascii="Calibri" w:cs="Calibri" w:eastAsia="Calibri" w:hAnsi="Calibri"/>
+                <w:sz w:val="20"/>
+                <w:szCs w:val="20"/>
+              </w:rPr>
+              <w:t xml:space="preserve"/>
+            </w:r>
+          </w:p>
+        </w:tc>
+      </w:tr>
+    </w:tbl>
+    <w:p>
+      <w:pPr>
+        <w:pStyle w:val="Heading2"/>
+        <w:keepNext/>
+        <w:spacing w:after="120" w:before="280"/>
+      </w:pPr>
+      <w:r>
+        <w:rPr>
+          <w:rFonts w:ascii="Calibri" w:cs="Calibri" w:eastAsia="Calibri" w:hAnsi="Calibri"/>
+          <w:b/>
+          <w:bCs/>
+          <w:color w:val="0096CF"/>
+          <w:sz w:val="24"/>
+          <w:szCs w:val="24"/>
+        </w:rPr>
+        <w:t xml:space="preserve">Meeting</w:t>
+      </w:r>
+    </w:p>
+    <w:tbl>
+      <w:tblPr>
+        <w:tblW w:type="dxa" w:w="9638"/>
+        <w:tblBorders>
+          <w:top w:val="single" w:color="auto" w:sz="4"/>
+          <w:left w:val="single" w:color="auto" w:sz="4"/>
+          <w:bottom w:val="single" w:color="auto" w:sz="4"/>
+          <w:right w:val="single" w:color="auto" w:sz="4"/>
+          <w:insideH w:val="single" w:color="auto" w:sz="4"/>
+          <w:insideV w:val="single" w:color="auto" w:sz="4"/>
+        </w:tblBorders>
+      </w:tblPr>
+      <w:tblGrid>
+        <w:gridCol w:w="500"/>
+        <w:gridCol w:w="1800"/>
+        <w:gridCol w:w="4238"/>
+        <w:gridCol w:w="1300"/>
+        <w:gridCol w:w="1800"/>
+      </w:tblGrid>
+      <w:tr>
+        <w:trPr>
+          <w:cantSplit/>
+          <w:tblHeader/>
+        </w:trPr>
+        <w:tc>
+          <w:tcPr>
+            <w:tcW w:type="dxa" w:w="500"/>
+            <w:tcBorders>
+              <w:top w:val="single" w:color="C9D3DD" w:sz="4"/>
+              <w:left w:val="single" w:color="C9D3DD" w:sz="4"/>
+              <w:bottom w:val="single" w:color="C9D3DD" w:sz="4"/>
+              <w:right w:val="single" w:color="C9D3DD" w:sz="4"/>
+            </w:tcBorders>
+            <w:shd w:fill="0E1C28" w:color="auto" w:val="clear"/>
+            <w:tcMar>
+              <w:top w:type="dxa" w:w="70"/>
+              <w:left w:type="dxa" w:w="110"/>
+              <w:bottom w:type="dxa" w:w="70"/>
+              <w:right w:type="dxa" w:w="110"/>
+            </w:tcMar>
+            <w:vAlign w:val="center"/>
+          </w:tcPr>
+          <w:p>
+            <w:pPr>
+              <w:jc w:val="center"/>
+            </w:pPr>
+            <w:r>
+              <w:rPr>
+                <w:rFonts w:ascii="Calibri" w:cs="Calibri" w:eastAsia="Calibri" w:hAnsi="Calibri"/>
+                <w:b/>
+                <w:bCs/>
+                <w:color w:val="FFFFFF"/>
+                <w:sz w:val="18"/>
+                <w:szCs w:val="18"/>
+              </w:rPr>
+              <w:t xml:space="preserve">No</w:t>
+            </w:r>
+          </w:p>
+        </w:tc>
+        <w:tc>
+          <w:tcPr>
+            <w:tcW w:type="dxa" w:w="1800"/>
+            <w:tcBorders>
+              <w:top w:val="single" w:color="C9D3DD" w:sz="4"/>
+              <w:left w:val="single" w:color="C9D3DD" w:sz="4"/>
+              <w:bottom w:val="single" w:color="C9D3DD" w:sz="4"/>
+              <w:right w:val="single" w:color="C9D3DD" w:sz="4"/>
+            </w:tcBorders>
+            <w:shd w:fill="0E1C28" w:color="auto" w:val="clear"/>
+            <w:tcMar>
+              <w:top w:type="dxa" w:w="70"/>
+              <w:left w:type="dxa" w:w="110"/>
+              <w:bottom w:type="dxa" w:w="70"/>
+              <w:right w:type="dxa" w:w="110"/>
+            </w:tcMar>
+            <w:vAlign w:val="center"/>
+          </w:tcPr>
+          <w:p>
+            <w:pPr>
+              <w:jc w:val="left"/>
+            </w:pPr>
+            <w:r>
+              <w:rPr>
+                <w:rFonts w:ascii="Calibri" w:cs="Calibri" w:eastAsia="Calibri" w:hAnsi="Calibri"/>
+                <w:b/>
+                <w:bCs/>
+                <w:color w:val="FFFFFF"/>
+                <w:sz w:val="18"/>
+                <w:szCs w:val="18"/>
+              </w:rPr>
+              <w:t xml:space="preserve">Akun</w:t>
+            </w:r>
+          </w:p>
+        </w:tc>
+        <w:tc>
+          <w:tcPr>
+            <w:tcW w:type="dxa" w:w="4238"/>
+            <w:tcBorders>
+              <w:top w:val="single" w:color="C9D3DD" w:sz="4"/>
+              <w:left w:val="single" w:color="C9D3DD" w:sz="4"/>
+              <w:bottom w:val="single" w:color="C9D3DD" w:sz="4"/>
+              <w:right w:val="single" w:color="C9D3DD" w:sz="4"/>
+            </w:tcBorders>
+            <w:shd w:fill="0E1C28" w:color="auto" w:val="clear"/>
+            <w:tcMar>
+              <w:top w:type="dxa" w:w="70"/>
+              <w:left w:type="dxa" w:w="110"/>
+              <w:bottom w:type="dxa" w:w="70"/>
+              <w:right w:type="dxa" w:w="110"/>
+            </w:tcMar>
+            <w:vAlign w:val="center"/>
+          </w:tcPr>
+          <w:p>
+            <w:pPr>
+              <w:jc w:val="left"/>
+            </w:pPr>
+            <w:r>
+              <w:rPr>
+                <w:rFonts w:ascii="Calibri" w:cs="Calibri" w:eastAsia="Calibri" w:hAnsi="Calibri"/>
+                <w:b/>
+                <w:bCs/>
+                <w:color w:val="FFFFFF"/>
+                <w:sz w:val="18"/>
+                <w:szCs w:val="18"/>
+              </w:rPr>
+              <w:t xml:space="preserve">Skenario</w:t>
+            </w:r>
+          </w:p>
+        </w:tc>
+        <w:tc>
+          <w:tcPr>
+            <w:tcW w:type="dxa" w:w="1300"/>
+            <w:tcBorders>
+              <w:top w:val="single" w:color="C9D3DD" w:sz="4"/>
+              <w:left w:val="single" w:color="C9D3DD" w:sz="4"/>
+              <w:bottom w:val="single" w:color="C9D3DD" w:sz="4"/>
+              <w:right w:val="single" w:color="C9D3DD" w:sz="4"/>
+            </w:tcBorders>
+            <w:shd w:fill="0E1C28" w:color="auto" w:val="clear"/>
+            <w:tcMar>
+              <w:top w:type="dxa" w:w="70"/>
+              <w:left w:type="dxa" w:w="110"/>
+              <w:bottom w:type="dxa" w:w="70"/>
+              <w:right w:type="dxa" w:w="110"/>
+            </w:tcMar>
+            <w:vAlign w:val="center"/>
+          </w:tcPr>
+          <w:p>
+            <w:pPr>
+              <w:jc w:val="left"/>
+            </w:pPr>
+            <w:r>
+              <w:rPr>
+                <w:rFonts w:ascii="Calibri" w:cs="Calibri" w:eastAsia="Calibri" w:hAnsi="Calibri"/>
+                <w:b/>
+                <w:bCs/>
+                <w:color w:val="FFFFFF"/>
+                <w:sz w:val="18"/>
+                <w:szCs w:val="18"/>
+              </w:rPr>
+              <w:t xml:space="preserve">Hasil</w:t>
+            </w:r>
+          </w:p>
+        </w:tc>
+        <w:tc>
+          <w:tcPr>
+            <w:tcW w:type="dxa" w:w="1800"/>
+            <w:tcBorders>
+              <w:top w:val="single" w:color="C9D3DD" w:sz="4"/>
+              <w:left w:val="single" w:color="C9D3DD" w:sz="4"/>
+              <w:bottom w:val="single" w:color="C9D3DD" w:sz="4"/>
+              <w:right w:val="single" w:color="C9D3DD" w:sz="4"/>
+            </w:tcBorders>
+            <w:shd w:fill="0E1C28" w:color="auto" w:val="clear"/>
+            <w:tcMar>
+              <w:top w:type="dxa" w:w="70"/>
+              <w:left w:type="dxa" w:w="110"/>
+              <w:bottom w:type="dxa" w:w="70"/>
+              <w:right w:type="dxa" w:w="110"/>
+            </w:tcMar>
+            <w:vAlign w:val="center"/>
+          </w:tcPr>
+          <w:p>
+            <w:pPr>
+              <w:jc w:val="left"/>
+            </w:pPr>
+            <w:r>
+              <w:rPr>
+                <w:rFonts w:ascii="Calibri" w:cs="Calibri" w:eastAsia="Calibri" w:hAnsi="Calibri"/>
+                <w:b/>
+                <w:bCs/>
+                <w:color w:val="FFFFFF"/>
+                <w:sz w:val="18"/>
+                <w:szCs w:val="18"/>
+              </w:rPr>
+              <w:t xml:space="preserve">Catatan</w:t>
+            </w:r>
+          </w:p>
+        </w:tc>
+      </w:tr>
+      <w:tr>
+        <w:trPr>
+          <w:cantSplit/>
+        </w:trPr>
+        <w:tc>
+          <w:tcPr>
+            <w:tcW w:type="dxa" w:w="500"/>
+            <w:tcBorders>
+              <w:top w:val="single" w:color="C9D3DD" w:sz="4"/>
+              <w:left w:val="single" w:color="C9D3DD" w:sz="4"/>
+              <w:bottom w:val="single" w:color="C9D3DD" w:sz="4"/>
+              <w:right w:val="single" w:color="C9D3DD" w:sz="4"/>
+            </w:tcBorders>
+            <w:tcMar>
+              <w:top w:type="dxa" w:w="70"/>
+              <w:left w:type="dxa" w:w="110"/>
+              <w:bottom w:type="dxa" w:w="70"/>
+              <w:right w:type="dxa" w:w="110"/>
+            </w:tcMar>
+            <w:vAlign w:val="center"/>
+          </w:tcPr>
+          <w:p>
+            <w:pPr>
+              <w:jc w:val="center"/>
+            </w:pPr>
+            <w:r>
+              <w:rPr>
+                <w:rFonts w:ascii="Calibri" w:cs="Calibri" w:eastAsia="Calibri" w:hAnsi="Calibri"/>
+                <w:sz w:val="20"/>
+                <w:szCs w:val="20"/>
+              </w:rPr>
+              <w:t xml:space="preserve">20</w:t>
+            </w:r>
+          </w:p>
+        </w:tc>
+        <w:tc>
+          <w:tcPr>
+            <w:tcW w:type="dxa" w:w="1800"/>
+            <w:tcBorders>
+              <w:top w:val="single" w:color="C9D3DD" w:sz="4"/>
+              <w:left w:val="single" w:color="C9D3DD" w:sz="4"/>
+              <w:bottom w:val="single" w:color="C9D3DD" w:sz="4"/>
+              <w:right w:val="single" w:color="C9D3DD" w:sz="4"/>
+            </w:tcBorders>
+            <w:tcMar>
+              <w:top w:type="dxa" w:w="70"/>
+              <w:left w:type="dxa" w:w="110"/>
+              <w:bottom w:type="dxa" w:w="70"/>
+              <w:right w:type="dxa" w:w="110"/>
+            </w:tcMar>
+            <w:vAlign w:val="center"/>
+          </w:tcPr>
+          <w:p>
+            <w:pPr>
+              <w:jc w:val="left"/>
+            </w:pPr>
+            <w:r>
+              <w:rPr>
+                <w:rFonts w:ascii="Consolas" w:cs="Consolas" w:eastAsia="Consolas" w:hAnsi="Consolas"/>
+                <w:sz w:val="17"/>
+                <w:szCs w:val="17"/>
+              </w:rPr>
+              <w:t xml:space="preserve">marketing.staff@</w:t>
+            </w:r>
+          </w:p>
+        </w:tc>
+        <w:tc>
+          <w:tcPr>
+            <w:tcW w:type="dxa" w:w="4238"/>
+            <w:tcBorders>
+              <w:top w:val="single" w:color="C9D3DD" w:sz="4"/>
+              <w:left w:val="single" w:color="C9D3DD" w:sz="4"/>
+              <w:bottom w:val="single" w:color="C9D3DD" w:sz="4"/>
+              <w:right w:val="single" w:color="C9D3DD" w:sz="4"/>
+            </w:tcBorders>
+            <w:tcMar>
+              <w:top w:type="dxa" w:w="70"/>
+              <w:left w:type="dxa" w:w="110"/>
+              <w:bottom w:type="dxa" w:w="70"/>
+              <w:right w:type="dxa" w:w="110"/>
+            </w:tcMar>
+            <w:vAlign w:val="center"/>
+          </w:tcPr>
+          <w:p>
+            <w:pPr>
+              <w:jc w:val="left"/>
+            </w:pPr>
+            <w:r>
+              <w:rPr>
+                <w:rFonts w:ascii="Calibri" w:cs="Calibri" w:eastAsia="Calibri" w:hAnsi="Calibri"/>
+                <w:sz w:val="20"/>
+                <w:szCs w:val="20"/>
+              </w:rPr>
+              <w:t xml:space="preserve">Klik "+ Tambah meeting": dropdown Planning berisi "Tanpa planning (meeting dadakan)" dan planning divisi Marketing.</w:t>
+            </w:r>
+          </w:p>
+        </w:tc>
+        <w:tc>
+          <w:tcPr>
+            <w:tcW w:type="dxa" w:w="1300"/>
+            <w:tcBorders>
+              <w:top w:val="single" w:color="C9D3DD" w:sz="4"/>
+              <w:left w:val="single" w:color="C9D3DD" w:sz="4"/>
+              <w:bottom w:val="single" w:color="C9D3DD" w:sz="4"/>
+              <w:right w:val="single" w:color="C9D3DD" w:sz="4"/>
+            </w:tcBorders>
+            <w:tcMar>
+              <w:top w:type="dxa" w:w="70"/>
+              <w:left w:type="dxa" w:w="110"/>
+              <w:bottom w:type="dxa" w:w="70"/>
+              <w:right w:type="dxa" w:w="110"/>
+            </w:tcMar>
+            <w:vAlign w:val="center"/>
+          </w:tcPr>
+          <w:p>
+            <w:pPr>
+              <w:jc w:val="left"/>
+            </w:pPr>
+            <w:r>
+              <w:rPr>
+                <w:rFonts w:ascii="Calibri" w:cs="Calibri" w:eastAsia="Calibri" w:hAnsi="Calibri"/>
+                <w:sz w:val="18"/>
+                <w:szCs w:val="18"/>
+              </w:rPr>
+              <w:t xml:space="preserve">☐  Lulus</w:t>
+            </w:r>
+          </w:p>
+          <w:p>
+            <w:pPr>
+              <w:jc w:val="left"/>
+            </w:pPr>
+            <w:r>
+              <w:rPr>
+                <w:rFonts w:ascii="Calibri" w:cs="Calibri" w:eastAsia="Calibri" w:hAnsi="Calibri"/>
+                <w:sz w:val="18"/>
+                <w:szCs w:val="18"/>
+              </w:rPr>
+              <w:t xml:space="preserve">☐  Gagal</w:t>
+            </w:r>
+          </w:p>
+        </w:tc>
+        <w:tc>
+          <w:tcPr>
+            <w:tcW w:type="dxa" w:w="1800"/>
+            <w:tcBorders>
+              <w:top w:val="single" w:color="C9D3DD" w:sz="4"/>
+              <w:left w:val="single" w:color="C9D3DD" w:sz="4"/>
+              <w:bottom w:val="single" w:color="C9D3DD" w:sz="4"/>
+              <w:right w:val="single" w:color="C9D3DD" w:sz="4"/>
+            </w:tcBorders>
+            <w:tcMar>
+              <w:top w:type="dxa" w:w="70"/>
+              <w:left w:type="dxa" w:w="110"/>
+              <w:bottom w:type="dxa" w:w="70"/>
+              <w:right w:type="dxa" w:w="110"/>
+            </w:tcMar>
+            <w:vAlign w:val="center"/>
+          </w:tcPr>
+          <w:p>
+            <w:pPr>
+              <w:jc w:val="left"/>
+            </w:pPr>
+            <w:r>
+              <w:rPr>
+                <w:rFonts w:ascii="Calibri" w:cs="Calibri" w:eastAsia="Calibri" w:hAnsi="Calibri"/>
+                <w:sz w:val="20"/>
+                <w:szCs w:val="20"/>
+              </w:rPr>
+              <w:t xml:space="preserve"/>
+            </w:r>
+          </w:p>
+        </w:tc>
+      </w:tr>
+      <w:tr>
+        <w:trPr>
+          <w:cantSplit/>
+        </w:trPr>
+        <w:tc>
+          <w:tcPr>
+            <w:tcW w:type="dxa" w:w="500"/>
+            <w:tcBorders>
+              <w:top w:val="single" w:color="C9D3DD" w:sz="4"/>
+              <w:left w:val="single" w:color="C9D3DD" w:sz="4"/>
+              <w:bottom w:val="single" w:color="C9D3DD" w:sz="4"/>
+              <w:right w:val="single" w:color="C9D3DD" w:sz="4"/>
+            </w:tcBorders>
+            <w:shd w:fill="F6F8FA" w:color="auto" w:val="clear"/>
+            <w:tcMar>
+              <w:top w:type="dxa" w:w="70"/>
+              <w:left w:type="dxa" w:w="110"/>
+              <w:bottom w:type="dxa" w:w="70"/>
+              <w:right w:type="dxa" w:w="110"/>
+            </w:tcMar>
+            <w:vAlign w:val="center"/>
+          </w:tcPr>
+          <w:p>
+            <w:pPr>
+              <w:jc w:val="center"/>
+            </w:pPr>
+            <w:r>
+              <w:rPr>
+                <w:rFonts w:ascii="Calibri" w:cs="Calibri" w:eastAsia="Calibri" w:hAnsi="Calibri"/>
+                <w:sz w:val="20"/>
+                <w:szCs w:val="20"/>
+              </w:rPr>
               <w:t xml:space="preserve">21</w:t>
             </w:r>
           </w:p>
@@ -9720,12 +10550,11 @@
             </w:pPr>
             <w:r>
               <w:rPr>
-                <w:rFonts w:ascii="Calibri" w:cs="Calibri" w:eastAsia="Calibri" w:hAnsi="Calibri"/>
-                <w:color w:val="5B6474"/>
-                <w:sz w:val="18"/>
-                <w:szCs w:val="18"/>
-              </w:rPr>
-              <w:t xml:space="preserve">Akun mana pun</w:t>
+                <w:rFonts w:ascii="Consolas" w:cs="Consolas" w:eastAsia="Consolas" w:hAnsi="Consolas"/>
+                <w:sz w:val="17"/>
+                <w:szCs w:val="17"/>
+              </w:rPr>
+              <w:t xml:space="preserve">marketing.staff@</w:t>
             </w:r>
           </w:p>
         </w:tc>
@@ -9757,7 +10586,1060 @@
                 <w:sz w:val="20"/>
                 <w:szCs w:val="20"/>
               </w:rPr>
-              <w:t xml:space="preserve">Filter status, approval, dan pencarian judul/nomor bekerja.</w:t>
+              <w:t xml:space="preserve">Buat meeting tanpa planning (dadakan) dengan peserta dari divisi lain (mis. PPIC). Nomor otomatis MTG-YYYYMM-xxxx.</w:t>
+            </w:r>
+          </w:p>
+        </w:tc>
+        <w:tc>
+          <w:tcPr>
+            <w:tcW w:type="dxa" w:w="1300"/>
+            <w:tcBorders>
+              <w:top w:val="single" w:color="C9D3DD" w:sz="4"/>
+              <w:left w:val="single" w:color="C9D3DD" w:sz="4"/>
+              <w:bottom w:val="single" w:color="C9D3DD" w:sz="4"/>
+              <w:right w:val="single" w:color="C9D3DD" w:sz="4"/>
+            </w:tcBorders>
+            <w:shd w:fill="F6F8FA" w:color="auto" w:val="clear"/>
+            <w:tcMar>
+              <w:top w:type="dxa" w:w="70"/>
+              <w:left w:type="dxa" w:w="110"/>
+              <w:bottom w:type="dxa" w:w="70"/>
+              <w:right w:type="dxa" w:w="110"/>
+            </w:tcMar>
+            <w:vAlign w:val="center"/>
+          </w:tcPr>
+          <w:p>
+            <w:pPr>
+              <w:jc w:val="left"/>
+            </w:pPr>
+            <w:r>
+              <w:rPr>
+                <w:rFonts w:ascii="Calibri" w:cs="Calibri" w:eastAsia="Calibri" w:hAnsi="Calibri"/>
+                <w:sz w:val="18"/>
+                <w:szCs w:val="18"/>
+              </w:rPr>
+              <w:t xml:space="preserve">☐  Lulus</w:t>
+            </w:r>
+          </w:p>
+          <w:p>
+            <w:pPr>
+              <w:jc w:val="left"/>
+            </w:pPr>
+            <w:r>
+              <w:rPr>
+                <w:rFonts w:ascii="Calibri" w:cs="Calibri" w:eastAsia="Calibri" w:hAnsi="Calibri"/>
+                <w:sz w:val="18"/>
+                <w:szCs w:val="18"/>
+              </w:rPr>
+              <w:t xml:space="preserve">☐  Gagal</w:t>
+            </w:r>
+          </w:p>
+        </w:tc>
+        <w:tc>
+          <w:tcPr>
+            <w:tcW w:type="dxa" w:w="1800"/>
+            <w:tcBorders>
+              <w:top w:val="single" w:color="C9D3DD" w:sz="4"/>
+              <w:left w:val="single" w:color="C9D3DD" w:sz="4"/>
+              <w:bottom w:val="single" w:color="C9D3DD" w:sz="4"/>
+              <w:right w:val="single" w:color="C9D3DD" w:sz="4"/>
+            </w:tcBorders>
+            <w:shd w:fill="F6F8FA" w:color="auto" w:val="clear"/>
+            <w:tcMar>
+              <w:top w:type="dxa" w:w="70"/>
+              <w:left w:type="dxa" w:w="110"/>
+              <w:bottom w:type="dxa" w:w="70"/>
+              <w:right w:type="dxa" w:w="110"/>
+            </w:tcMar>
+            <w:vAlign w:val="center"/>
+          </w:tcPr>
+          <w:p>
+            <w:pPr>
+              <w:jc w:val="left"/>
+            </w:pPr>
+            <w:r>
+              <w:rPr>
+                <w:rFonts w:ascii="Calibri" w:cs="Calibri" w:eastAsia="Calibri" w:hAnsi="Calibri"/>
+                <w:sz w:val="20"/>
+                <w:szCs w:val="20"/>
+              </w:rPr>
+              <w:t xml:space="preserve"/>
+            </w:r>
+          </w:p>
+        </w:tc>
+      </w:tr>
+      <w:tr>
+        <w:trPr>
+          <w:cantSplit/>
+        </w:trPr>
+        <w:tc>
+          <w:tcPr>
+            <w:tcW w:type="dxa" w:w="500"/>
+            <w:tcBorders>
+              <w:top w:val="single" w:color="C9D3DD" w:sz="4"/>
+              <w:left w:val="single" w:color="C9D3DD" w:sz="4"/>
+              <w:bottom w:val="single" w:color="C9D3DD" w:sz="4"/>
+              <w:right w:val="single" w:color="C9D3DD" w:sz="4"/>
+            </w:tcBorders>
+            <w:tcMar>
+              <w:top w:type="dxa" w:w="70"/>
+              <w:left w:type="dxa" w:w="110"/>
+              <w:bottom w:type="dxa" w:w="70"/>
+              <w:right w:type="dxa" w:w="110"/>
+            </w:tcMar>
+            <w:vAlign w:val="center"/>
+          </w:tcPr>
+          <w:p>
+            <w:pPr>
+              <w:jc w:val="center"/>
+            </w:pPr>
+            <w:r>
+              <w:rPr>
+                <w:rFonts w:ascii="Calibri" w:cs="Calibri" w:eastAsia="Calibri" w:hAnsi="Calibri"/>
+                <w:sz w:val="20"/>
+                <w:szCs w:val="20"/>
+              </w:rPr>
+              <w:t xml:space="preserve">22</w:t>
+            </w:r>
+          </w:p>
+        </w:tc>
+        <w:tc>
+          <w:tcPr>
+            <w:tcW w:type="dxa" w:w="1800"/>
+            <w:tcBorders>
+              <w:top w:val="single" w:color="C9D3DD" w:sz="4"/>
+              <w:left w:val="single" w:color="C9D3DD" w:sz="4"/>
+              <w:bottom w:val="single" w:color="C9D3DD" w:sz="4"/>
+              <w:right w:val="single" w:color="C9D3DD" w:sz="4"/>
+            </w:tcBorders>
+            <w:tcMar>
+              <w:top w:type="dxa" w:w="70"/>
+              <w:left w:type="dxa" w:w="110"/>
+              <w:bottom w:type="dxa" w:w="70"/>
+              <w:right w:type="dxa" w:w="110"/>
+            </w:tcMar>
+            <w:vAlign w:val="center"/>
+          </w:tcPr>
+          <w:p>
+            <w:pPr>
+              <w:jc w:val="left"/>
+            </w:pPr>
+            <w:r>
+              <w:rPr>
+                <w:rFonts w:ascii="Consolas" w:cs="Consolas" w:eastAsia="Consolas" w:hAnsi="Consolas"/>
+                <w:sz w:val="17"/>
+                <w:szCs w:val="17"/>
+              </w:rPr>
+              <w:t xml:space="preserve">marketing.staff@</w:t>
+            </w:r>
+          </w:p>
+        </w:tc>
+        <w:tc>
+          <w:tcPr>
+            <w:tcW w:type="dxa" w:w="4238"/>
+            <w:tcBorders>
+              <w:top w:val="single" w:color="C9D3DD" w:sz="4"/>
+              <w:left w:val="single" w:color="C9D3DD" w:sz="4"/>
+              <w:bottom w:val="single" w:color="C9D3DD" w:sz="4"/>
+              <w:right w:val="single" w:color="C9D3DD" w:sz="4"/>
+            </w:tcBorders>
+            <w:tcMar>
+              <w:top w:type="dxa" w:w="70"/>
+              <w:left w:type="dxa" w:w="110"/>
+              <w:bottom w:type="dxa" w:w="70"/>
+              <w:right w:type="dxa" w:w="110"/>
+            </w:tcMar>
+            <w:vAlign w:val="center"/>
+          </w:tcPr>
+          <w:p>
+            <w:pPr>
+              <w:jc w:val="left"/>
+            </w:pPr>
+            <w:r>
+              <w:rPr>
+                <w:rFonts w:ascii="Calibri" w:cs="Calibri" w:eastAsia="Calibri" w:hAnsi="Calibri"/>
+                <w:sz w:val="20"/>
+                <w:szCs w:val="20"/>
+              </w:rPr>
+              <w:t xml:space="preserve">Buat meeting yang terhubung ke planning; tempat diisi link (https://...) → tampil sebagai link yang bisa diklik.</w:t>
+            </w:r>
+          </w:p>
+        </w:tc>
+        <w:tc>
+          <w:tcPr>
+            <w:tcW w:type="dxa" w:w="1300"/>
+            <w:tcBorders>
+              <w:top w:val="single" w:color="C9D3DD" w:sz="4"/>
+              <w:left w:val="single" w:color="C9D3DD" w:sz="4"/>
+              <w:bottom w:val="single" w:color="C9D3DD" w:sz="4"/>
+              <w:right w:val="single" w:color="C9D3DD" w:sz="4"/>
+            </w:tcBorders>
+            <w:tcMar>
+              <w:top w:type="dxa" w:w="70"/>
+              <w:left w:type="dxa" w:w="110"/>
+              <w:bottom w:type="dxa" w:w="70"/>
+              <w:right w:type="dxa" w:w="110"/>
+            </w:tcMar>
+            <w:vAlign w:val="center"/>
+          </w:tcPr>
+          <w:p>
+            <w:pPr>
+              <w:jc w:val="left"/>
+            </w:pPr>
+            <w:r>
+              <w:rPr>
+                <w:rFonts w:ascii="Calibri" w:cs="Calibri" w:eastAsia="Calibri" w:hAnsi="Calibri"/>
+                <w:sz w:val="18"/>
+                <w:szCs w:val="18"/>
+              </w:rPr>
+              <w:t xml:space="preserve">☐  Lulus</w:t>
+            </w:r>
+          </w:p>
+          <w:p>
+            <w:pPr>
+              <w:jc w:val="left"/>
+            </w:pPr>
+            <w:r>
+              <w:rPr>
+                <w:rFonts w:ascii="Calibri" w:cs="Calibri" w:eastAsia="Calibri" w:hAnsi="Calibri"/>
+                <w:sz w:val="18"/>
+                <w:szCs w:val="18"/>
+              </w:rPr>
+              <w:t xml:space="preserve">☐  Gagal</w:t>
+            </w:r>
+          </w:p>
+        </w:tc>
+        <w:tc>
+          <w:tcPr>
+            <w:tcW w:type="dxa" w:w="1800"/>
+            <w:tcBorders>
+              <w:top w:val="single" w:color="C9D3DD" w:sz="4"/>
+              <w:left w:val="single" w:color="C9D3DD" w:sz="4"/>
+              <w:bottom w:val="single" w:color="C9D3DD" w:sz="4"/>
+              <w:right w:val="single" w:color="C9D3DD" w:sz="4"/>
+            </w:tcBorders>
+            <w:tcMar>
+              <w:top w:type="dxa" w:w="70"/>
+              <w:left w:type="dxa" w:w="110"/>
+              <w:bottom w:type="dxa" w:w="70"/>
+              <w:right w:type="dxa" w:w="110"/>
+            </w:tcMar>
+            <w:vAlign w:val="center"/>
+          </w:tcPr>
+          <w:p>
+            <w:pPr>
+              <w:jc w:val="left"/>
+            </w:pPr>
+            <w:r>
+              <w:rPr>
+                <w:rFonts w:ascii="Calibri" w:cs="Calibri" w:eastAsia="Calibri" w:hAnsi="Calibri"/>
+                <w:sz w:val="20"/>
+                <w:szCs w:val="20"/>
+              </w:rPr>
+              <w:t xml:space="preserve"/>
+            </w:r>
+          </w:p>
+        </w:tc>
+      </w:tr>
+      <w:tr>
+        <w:trPr>
+          <w:cantSplit/>
+        </w:trPr>
+        <w:tc>
+          <w:tcPr>
+            <w:tcW w:type="dxa" w:w="500"/>
+            <w:tcBorders>
+              <w:top w:val="single" w:color="C9D3DD" w:sz="4"/>
+              <w:left w:val="single" w:color="C9D3DD" w:sz="4"/>
+              <w:bottom w:val="single" w:color="C9D3DD" w:sz="4"/>
+              <w:right w:val="single" w:color="C9D3DD" w:sz="4"/>
+            </w:tcBorders>
+            <w:shd w:fill="F6F8FA" w:color="auto" w:val="clear"/>
+            <w:tcMar>
+              <w:top w:type="dxa" w:w="70"/>
+              <w:left w:type="dxa" w:w="110"/>
+              <w:bottom w:type="dxa" w:w="70"/>
+              <w:right w:type="dxa" w:w="110"/>
+            </w:tcMar>
+            <w:vAlign w:val="center"/>
+          </w:tcPr>
+          <w:p>
+            <w:pPr>
+              <w:jc w:val="center"/>
+            </w:pPr>
+            <w:r>
+              <w:rPr>
+                <w:rFonts w:ascii="Calibri" w:cs="Calibri" w:eastAsia="Calibri" w:hAnsi="Calibri"/>
+                <w:sz w:val="20"/>
+                <w:szCs w:val="20"/>
+              </w:rPr>
+              <w:t xml:space="preserve">23</w:t>
+            </w:r>
+          </w:p>
+        </w:tc>
+        <w:tc>
+          <w:tcPr>
+            <w:tcW w:type="dxa" w:w="1800"/>
+            <w:tcBorders>
+              <w:top w:val="single" w:color="C9D3DD" w:sz="4"/>
+              <w:left w:val="single" w:color="C9D3DD" w:sz="4"/>
+              <w:bottom w:val="single" w:color="C9D3DD" w:sz="4"/>
+              <w:right w:val="single" w:color="C9D3DD" w:sz="4"/>
+            </w:tcBorders>
+            <w:shd w:fill="F6F8FA" w:color="auto" w:val="clear"/>
+            <w:tcMar>
+              <w:top w:type="dxa" w:w="70"/>
+              <w:left w:type="dxa" w:w="110"/>
+              <w:bottom w:type="dxa" w:w="70"/>
+              <w:right w:type="dxa" w:w="110"/>
+            </w:tcMar>
+            <w:vAlign w:val="center"/>
+          </w:tcPr>
+          <w:p>
+            <w:pPr>
+              <w:jc w:val="left"/>
+            </w:pPr>
+            <w:r>
+              <w:rPr>
+                <w:rFonts w:ascii="Consolas" w:cs="Consolas" w:eastAsia="Consolas" w:hAnsi="Consolas"/>
+                <w:sz w:val="17"/>
+                <w:szCs w:val="17"/>
+              </w:rPr>
+              <w:t xml:space="preserve">ppic.staff@</w:t>
+            </w:r>
+          </w:p>
+        </w:tc>
+        <w:tc>
+          <w:tcPr>
+            <w:tcW w:type="dxa" w:w="4238"/>
+            <w:tcBorders>
+              <w:top w:val="single" w:color="C9D3DD" w:sz="4"/>
+              <w:left w:val="single" w:color="C9D3DD" w:sz="4"/>
+              <w:bottom w:val="single" w:color="C9D3DD" w:sz="4"/>
+              <w:right w:val="single" w:color="C9D3DD" w:sz="4"/>
+            </w:tcBorders>
+            <w:shd w:fill="F6F8FA" w:color="auto" w:val="clear"/>
+            <w:tcMar>
+              <w:top w:type="dxa" w:w="70"/>
+              <w:left w:type="dxa" w:w="110"/>
+              <w:bottom w:type="dxa" w:w="70"/>
+              <w:right w:type="dxa" w:w="110"/>
+            </w:tcMar>
+            <w:vAlign w:val="center"/>
+          </w:tcPr>
+          <w:p>
+            <w:pPr>
+              <w:jc w:val="left"/>
+            </w:pPr>
+            <w:r>
+              <w:rPr>
+                <w:rFonts w:ascii="Calibri" w:cs="Calibri" w:eastAsia="Calibri" w:hAnsi="Calibri"/>
+                <w:sz w:val="20"/>
+                <w:szCs w:val="20"/>
+              </w:rPr>
+              <w:t xml:space="preserve">Meeting Marketing yang diikuti terlihat; meeting Marketing lain tidak terlihat.</w:t>
+            </w:r>
+          </w:p>
+        </w:tc>
+        <w:tc>
+          <w:tcPr>
+            <w:tcW w:type="dxa" w:w="1300"/>
+            <w:tcBorders>
+              <w:top w:val="single" w:color="C9D3DD" w:sz="4"/>
+              <w:left w:val="single" w:color="C9D3DD" w:sz="4"/>
+              <w:bottom w:val="single" w:color="C9D3DD" w:sz="4"/>
+              <w:right w:val="single" w:color="C9D3DD" w:sz="4"/>
+            </w:tcBorders>
+            <w:shd w:fill="F6F8FA" w:color="auto" w:val="clear"/>
+            <w:tcMar>
+              <w:top w:type="dxa" w:w="70"/>
+              <w:left w:type="dxa" w:w="110"/>
+              <w:bottom w:type="dxa" w:w="70"/>
+              <w:right w:type="dxa" w:w="110"/>
+            </w:tcMar>
+            <w:vAlign w:val="center"/>
+          </w:tcPr>
+          <w:p>
+            <w:pPr>
+              <w:jc w:val="left"/>
+            </w:pPr>
+            <w:r>
+              <w:rPr>
+                <w:rFonts w:ascii="Calibri" w:cs="Calibri" w:eastAsia="Calibri" w:hAnsi="Calibri"/>
+                <w:sz w:val="18"/>
+                <w:szCs w:val="18"/>
+              </w:rPr>
+              <w:t xml:space="preserve">☐  Lulus</w:t>
+            </w:r>
+          </w:p>
+          <w:p>
+            <w:pPr>
+              <w:jc w:val="left"/>
+            </w:pPr>
+            <w:r>
+              <w:rPr>
+                <w:rFonts w:ascii="Calibri" w:cs="Calibri" w:eastAsia="Calibri" w:hAnsi="Calibri"/>
+                <w:sz w:val="18"/>
+                <w:szCs w:val="18"/>
+              </w:rPr>
+              <w:t xml:space="preserve">☐  Gagal</w:t>
+            </w:r>
+          </w:p>
+        </w:tc>
+        <w:tc>
+          <w:tcPr>
+            <w:tcW w:type="dxa" w:w="1800"/>
+            <w:tcBorders>
+              <w:top w:val="single" w:color="C9D3DD" w:sz="4"/>
+              <w:left w:val="single" w:color="C9D3DD" w:sz="4"/>
+              <w:bottom w:val="single" w:color="C9D3DD" w:sz="4"/>
+              <w:right w:val="single" w:color="C9D3DD" w:sz="4"/>
+            </w:tcBorders>
+            <w:shd w:fill="F6F8FA" w:color="auto" w:val="clear"/>
+            <w:tcMar>
+              <w:top w:type="dxa" w:w="70"/>
+              <w:left w:type="dxa" w:w="110"/>
+              <w:bottom w:type="dxa" w:w="70"/>
+              <w:right w:type="dxa" w:w="110"/>
+            </w:tcMar>
+            <w:vAlign w:val="center"/>
+          </w:tcPr>
+          <w:p>
+            <w:pPr>
+              <w:jc w:val="left"/>
+            </w:pPr>
+            <w:r>
+              <w:rPr>
+                <w:rFonts w:ascii="Calibri" w:cs="Calibri" w:eastAsia="Calibri" w:hAnsi="Calibri"/>
+                <w:sz w:val="20"/>
+                <w:szCs w:val="20"/>
+              </w:rPr>
+              <w:t xml:space="preserve"/>
+            </w:r>
+          </w:p>
+        </w:tc>
+      </w:tr>
+      <w:tr>
+        <w:trPr>
+          <w:cantSplit/>
+        </w:trPr>
+        <w:tc>
+          <w:tcPr>
+            <w:tcW w:type="dxa" w:w="500"/>
+            <w:tcBorders>
+              <w:top w:val="single" w:color="C9D3DD" w:sz="4"/>
+              <w:left w:val="single" w:color="C9D3DD" w:sz="4"/>
+              <w:bottom w:val="single" w:color="C9D3DD" w:sz="4"/>
+              <w:right w:val="single" w:color="C9D3DD" w:sz="4"/>
+            </w:tcBorders>
+            <w:tcMar>
+              <w:top w:type="dxa" w:w="70"/>
+              <w:left w:type="dxa" w:w="110"/>
+              <w:bottom w:type="dxa" w:w="70"/>
+              <w:right w:type="dxa" w:w="110"/>
+            </w:tcMar>
+            <w:vAlign w:val="center"/>
+          </w:tcPr>
+          <w:p>
+            <w:pPr>
+              <w:jc w:val="center"/>
+            </w:pPr>
+            <w:r>
+              <w:rPr>
+                <w:rFonts w:ascii="Calibri" w:cs="Calibri" w:eastAsia="Calibri" w:hAnsi="Calibri"/>
+                <w:sz w:val="20"/>
+                <w:szCs w:val="20"/>
+              </w:rPr>
+              <w:t xml:space="preserve">24</w:t>
+            </w:r>
+          </w:p>
+        </w:tc>
+        <w:tc>
+          <w:tcPr>
+            <w:tcW w:type="dxa" w:w="1800"/>
+            <w:tcBorders>
+              <w:top w:val="single" w:color="C9D3DD" w:sz="4"/>
+              <w:left w:val="single" w:color="C9D3DD" w:sz="4"/>
+              <w:bottom w:val="single" w:color="C9D3DD" w:sz="4"/>
+              <w:right w:val="single" w:color="C9D3DD" w:sz="4"/>
+            </w:tcBorders>
+            <w:tcMar>
+              <w:top w:type="dxa" w:w="70"/>
+              <w:left w:type="dxa" w:w="110"/>
+              <w:bottom w:type="dxa" w:w="70"/>
+              <w:right w:type="dxa" w:w="110"/>
+            </w:tcMar>
+            <w:vAlign w:val="center"/>
+          </w:tcPr>
+          <w:p>
+            <w:pPr>
+              <w:jc w:val="left"/>
+            </w:pPr>
+            <w:r>
+              <w:rPr>
+                <w:rFonts w:ascii="Consolas" w:cs="Consolas" w:eastAsia="Consolas" w:hAnsi="Consolas"/>
+                <w:sz w:val="17"/>
+                <w:szCs w:val="17"/>
+              </w:rPr>
+              <w:t xml:space="preserve">ppic.staff@</w:t>
+            </w:r>
+          </w:p>
+        </w:tc>
+        <w:tc>
+          <w:tcPr>
+            <w:tcW w:type="dxa" w:w="4238"/>
+            <w:tcBorders>
+              <w:top w:val="single" w:color="C9D3DD" w:sz="4"/>
+              <w:left w:val="single" w:color="C9D3DD" w:sz="4"/>
+              <w:bottom w:val="single" w:color="C9D3DD" w:sz="4"/>
+              <w:right w:val="single" w:color="C9D3DD" w:sz="4"/>
+            </w:tcBorders>
+            <w:tcMar>
+              <w:top w:type="dxa" w:w="70"/>
+              <w:left w:type="dxa" w:w="110"/>
+              <w:bottom w:type="dxa" w:w="70"/>
+              <w:right w:type="dxa" w:w="110"/>
+            </w:tcMar>
+            <w:vAlign w:val="center"/>
+          </w:tcPr>
+          <w:p>
+            <w:pPr>
+              <w:jc w:val="left"/>
+            </w:pPr>
+            <w:r>
+              <w:rPr>
+                <w:rFonts w:ascii="Calibri" w:cs="Calibri" w:eastAsia="Calibri" w:hAnsi="Calibri"/>
+                <w:sz w:val="20"/>
+                <w:szCs w:val="20"/>
+              </w:rPr>
+              <w:t xml:space="preserve">Sebagai peserta: bisa isi Hasil meeting &amp; ubah status; tombol Edit/Hapus tidak ada.</w:t>
+            </w:r>
+          </w:p>
+        </w:tc>
+        <w:tc>
+          <w:tcPr>
+            <w:tcW w:type="dxa" w:w="1300"/>
+            <w:tcBorders>
+              <w:top w:val="single" w:color="C9D3DD" w:sz="4"/>
+              <w:left w:val="single" w:color="C9D3DD" w:sz="4"/>
+              <w:bottom w:val="single" w:color="C9D3DD" w:sz="4"/>
+              <w:right w:val="single" w:color="C9D3DD" w:sz="4"/>
+            </w:tcBorders>
+            <w:tcMar>
+              <w:top w:type="dxa" w:w="70"/>
+              <w:left w:type="dxa" w:w="110"/>
+              <w:bottom w:type="dxa" w:w="70"/>
+              <w:right w:type="dxa" w:w="110"/>
+            </w:tcMar>
+            <w:vAlign w:val="center"/>
+          </w:tcPr>
+          <w:p>
+            <w:pPr>
+              <w:jc w:val="left"/>
+            </w:pPr>
+            <w:r>
+              <w:rPr>
+                <w:rFonts w:ascii="Calibri" w:cs="Calibri" w:eastAsia="Calibri" w:hAnsi="Calibri"/>
+                <w:sz w:val="18"/>
+                <w:szCs w:val="18"/>
+              </w:rPr>
+              <w:t xml:space="preserve">☐  Lulus</w:t>
+            </w:r>
+          </w:p>
+          <w:p>
+            <w:pPr>
+              <w:jc w:val="left"/>
+            </w:pPr>
+            <w:r>
+              <w:rPr>
+                <w:rFonts w:ascii="Calibri" w:cs="Calibri" w:eastAsia="Calibri" w:hAnsi="Calibri"/>
+                <w:sz w:val="18"/>
+                <w:szCs w:val="18"/>
+              </w:rPr>
+              <w:t xml:space="preserve">☐  Gagal</w:t>
+            </w:r>
+          </w:p>
+        </w:tc>
+        <w:tc>
+          <w:tcPr>
+            <w:tcW w:type="dxa" w:w="1800"/>
+            <w:tcBorders>
+              <w:top w:val="single" w:color="C9D3DD" w:sz="4"/>
+              <w:left w:val="single" w:color="C9D3DD" w:sz="4"/>
+              <w:bottom w:val="single" w:color="C9D3DD" w:sz="4"/>
+              <w:right w:val="single" w:color="C9D3DD" w:sz="4"/>
+            </w:tcBorders>
+            <w:tcMar>
+              <w:top w:type="dxa" w:w="70"/>
+              <w:left w:type="dxa" w:w="110"/>
+              <w:bottom w:type="dxa" w:w="70"/>
+              <w:right w:type="dxa" w:w="110"/>
+            </w:tcMar>
+            <w:vAlign w:val="center"/>
+          </w:tcPr>
+          <w:p>
+            <w:pPr>
+              <w:jc w:val="left"/>
+            </w:pPr>
+            <w:r>
+              <w:rPr>
+                <w:rFonts w:ascii="Calibri" w:cs="Calibri" w:eastAsia="Calibri" w:hAnsi="Calibri"/>
+                <w:sz w:val="20"/>
+                <w:szCs w:val="20"/>
+              </w:rPr>
+              <w:t xml:space="preserve"/>
+            </w:r>
+          </w:p>
+        </w:tc>
+      </w:tr>
+      <w:tr>
+        <w:trPr>
+          <w:cantSplit/>
+        </w:trPr>
+        <w:tc>
+          <w:tcPr>
+            <w:tcW w:type="dxa" w:w="500"/>
+            <w:tcBorders>
+              <w:top w:val="single" w:color="C9D3DD" w:sz="4"/>
+              <w:left w:val="single" w:color="C9D3DD" w:sz="4"/>
+              <w:bottom w:val="single" w:color="C9D3DD" w:sz="4"/>
+              <w:right w:val="single" w:color="C9D3DD" w:sz="4"/>
+            </w:tcBorders>
+            <w:shd w:fill="F6F8FA" w:color="auto" w:val="clear"/>
+            <w:tcMar>
+              <w:top w:type="dxa" w:w="70"/>
+              <w:left w:type="dxa" w:w="110"/>
+              <w:bottom w:type="dxa" w:w="70"/>
+              <w:right w:type="dxa" w:w="110"/>
+            </w:tcMar>
+            <w:vAlign w:val="center"/>
+          </w:tcPr>
+          <w:p>
+            <w:pPr>
+              <w:jc w:val="center"/>
+            </w:pPr>
+            <w:r>
+              <w:rPr>
+                <w:rFonts w:ascii="Calibri" w:cs="Calibri" w:eastAsia="Calibri" w:hAnsi="Calibri"/>
+                <w:sz w:val="20"/>
+                <w:szCs w:val="20"/>
+              </w:rPr>
+              <w:t xml:space="preserve">25</w:t>
+            </w:r>
+          </w:p>
+        </w:tc>
+        <w:tc>
+          <w:tcPr>
+            <w:tcW w:type="dxa" w:w="1800"/>
+            <w:tcBorders>
+              <w:top w:val="single" w:color="C9D3DD" w:sz="4"/>
+              <w:left w:val="single" w:color="C9D3DD" w:sz="4"/>
+              <w:bottom w:val="single" w:color="C9D3DD" w:sz="4"/>
+              <w:right w:val="single" w:color="C9D3DD" w:sz="4"/>
+            </w:tcBorders>
+            <w:shd w:fill="F6F8FA" w:color="auto" w:val="clear"/>
+            <w:tcMar>
+              <w:top w:type="dxa" w:w="70"/>
+              <w:left w:type="dxa" w:w="110"/>
+              <w:bottom w:type="dxa" w:w="70"/>
+              <w:right w:type="dxa" w:w="110"/>
+            </w:tcMar>
+            <w:vAlign w:val="center"/>
+          </w:tcPr>
+          <w:p>
+            <w:pPr>
+              <w:jc w:val="left"/>
+            </w:pPr>
+            <w:r>
+              <w:rPr>
+                <w:rFonts w:ascii="Consolas" w:cs="Consolas" w:eastAsia="Consolas" w:hAnsi="Consolas"/>
+                <w:sz w:val="17"/>
+                <w:szCs w:val="17"/>
+              </w:rPr>
+              <w:t xml:space="preserve">teknik.staff@</w:t>
+            </w:r>
+          </w:p>
+        </w:tc>
+        <w:tc>
+          <w:tcPr>
+            <w:tcW w:type="dxa" w:w="4238"/>
+            <w:tcBorders>
+              <w:top w:val="single" w:color="C9D3DD" w:sz="4"/>
+              <w:left w:val="single" w:color="C9D3DD" w:sz="4"/>
+              <w:bottom w:val="single" w:color="C9D3DD" w:sz="4"/>
+              <w:right w:val="single" w:color="C9D3DD" w:sz="4"/>
+            </w:tcBorders>
+            <w:shd w:fill="F6F8FA" w:color="auto" w:val="clear"/>
+            <w:tcMar>
+              <w:top w:type="dxa" w:w="70"/>
+              <w:left w:type="dxa" w:w="110"/>
+              <w:bottom w:type="dxa" w:w="70"/>
+              <w:right w:type="dxa" w:w="110"/>
+            </w:tcMar>
+            <w:vAlign w:val="center"/>
+          </w:tcPr>
+          <w:p>
+            <w:pPr>
+              <w:jc w:val="left"/>
+            </w:pPr>
+            <w:r>
+              <w:rPr>
+                <w:rFonts w:ascii="Calibri" w:cs="Calibri" w:eastAsia="Calibri" w:hAnsi="Calibri"/>
+                <w:sz w:val="20"/>
+                <w:szCs w:val="20"/>
+              </w:rPr>
+              <w:t xml:space="preserve">Bukan peserta &amp; beda divisi → meeting Marketing tidak terlihat.</w:t>
+            </w:r>
+          </w:p>
+        </w:tc>
+        <w:tc>
+          <w:tcPr>
+            <w:tcW w:type="dxa" w:w="1300"/>
+            <w:tcBorders>
+              <w:top w:val="single" w:color="C9D3DD" w:sz="4"/>
+              <w:left w:val="single" w:color="C9D3DD" w:sz="4"/>
+              <w:bottom w:val="single" w:color="C9D3DD" w:sz="4"/>
+              <w:right w:val="single" w:color="C9D3DD" w:sz="4"/>
+            </w:tcBorders>
+            <w:shd w:fill="F6F8FA" w:color="auto" w:val="clear"/>
+            <w:tcMar>
+              <w:top w:type="dxa" w:w="70"/>
+              <w:left w:type="dxa" w:w="110"/>
+              <w:bottom w:type="dxa" w:w="70"/>
+              <w:right w:type="dxa" w:w="110"/>
+            </w:tcMar>
+            <w:vAlign w:val="center"/>
+          </w:tcPr>
+          <w:p>
+            <w:pPr>
+              <w:jc w:val="left"/>
+            </w:pPr>
+            <w:r>
+              <w:rPr>
+                <w:rFonts w:ascii="Calibri" w:cs="Calibri" w:eastAsia="Calibri" w:hAnsi="Calibri"/>
+                <w:sz w:val="18"/>
+                <w:szCs w:val="18"/>
+              </w:rPr>
+              <w:t xml:space="preserve">☐  Lulus</w:t>
+            </w:r>
+          </w:p>
+          <w:p>
+            <w:pPr>
+              <w:jc w:val="left"/>
+            </w:pPr>
+            <w:r>
+              <w:rPr>
+                <w:rFonts w:ascii="Calibri" w:cs="Calibri" w:eastAsia="Calibri" w:hAnsi="Calibri"/>
+                <w:sz w:val="18"/>
+                <w:szCs w:val="18"/>
+              </w:rPr>
+              <w:t xml:space="preserve">☐  Gagal</w:t>
+            </w:r>
+          </w:p>
+        </w:tc>
+        <w:tc>
+          <w:tcPr>
+            <w:tcW w:type="dxa" w:w="1800"/>
+            <w:tcBorders>
+              <w:top w:val="single" w:color="C9D3DD" w:sz="4"/>
+              <w:left w:val="single" w:color="C9D3DD" w:sz="4"/>
+              <w:bottom w:val="single" w:color="C9D3DD" w:sz="4"/>
+              <w:right w:val="single" w:color="C9D3DD" w:sz="4"/>
+            </w:tcBorders>
+            <w:shd w:fill="F6F8FA" w:color="auto" w:val="clear"/>
+            <w:tcMar>
+              <w:top w:type="dxa" w:w="70"/>
+              <w:left w:type="dxa" w:w="110"/>
+              <w:bottom w:type="dxa" w:w="70"/>
+              <w:right w:type="dxa" w:w="110"/>
+            </w:tcMar>
+            <w:vAlign w:val="center"/>
+          </w:tcPr>
+          <w:p>
+            <w:pPr>
+              <w:jc w:val="left"/>
+            </w:pPr>
+            <w:r>
+              <w:rPr>
+                <w:rFonts w:ascii="Calibri" w:cs="Calibri" w:eastAsia="Calibri" w:hAnsi="Calibri"/>
+                <w:sz w:val="20"/>
+                <w:szCs w:val="20"/>
+              </w:rPr>
+              <w:t xml:space="preserve"/>
+            </w:r>
+          </w:p>
+        </w:tc>
+      </w:tr>
+      <w:tr>
+        <w:trPr>
+          <w:cantSplit/>
+        </w:trPr>
+        <w:tc>
+          <w:tcPr>
+            <w:tcW w:type="dxa" w:w="500"/>
+            <w:tcBorders>
+              <w:top w:val="single" w:color="C9D3DD" w:sz="4"/>
+              <w:left w:val="single" w:color="C9D3DD" w:sz="4"/>
+              <w:bottom w:val="single" w:color="C9D3DD" w:sz="4"/>
+              <w:right w:val="single" w:color="C9D3DD" w:sz="4"/>
+            </w:tcBorders>
+            <w:tcMar>
+              <w:top w:type="dxa" w:w="70"/>
+              <w:left w:type="dxa" w:w="110"/>
+              <w:bottom w:type="dxa" w:w="70"/>
+              <w:right w:type="dxa" w:w="110"/>
+            </w:tcMar>
+            <w:vAlign w:val="center"/>
+          </w:tcPr>
+          <w:p>
+            <w:pPr>
+              <w:jc w:val="center"/>
+            </w:pPr>
+            <w:r>
+              <w:rPr>
+                <w:rFonts w:ascii="Calibri" w:cs="Calibri" w:eastAsia="Calibri" w:hAnsi="Calibri"/>
+                <w:sz w:val="20"/>
+                <w:szCs w:val="20"/>
+              </w:rPr>
+              <w:t xml:space="preserve">26</w:t>
+            </w:r>
+          </w:p>
+        </w:tc>
+        <w:tc>
+          <w:tcPr>
+            <w:tcW w:type="dxa" w:w="1800"/>
+            <w:tcBorders>
+              <w:top w:val="single" w:color="C9D3DD" w:sz="4"/>
+              <w:left w:val="single" w:color="C9D3DD" w:sz="4"/>
+              <w:bottom w:val="single" w:color="C9D3DD" w:sz="4"/>
+              <w:right w:val="single" w:color="C9D3DD" w:sz="4"/>
+            </w:tcBorders>
+            <w:tcMar>
+              <w:top w:type="dxa" w:w="70"/>
+              <w:left w:type="dxa" w:w="110"/>
+              <w:bottom w:type="dxa" w:w="70"/>
+              <w:right w:type="dxa" w:w="110"/>
+            </w:tcMar>
+            <w:vAlign w:val="center"/>
+          </w:tcPr>
+          <w:p>
+            <w:pPr>
+              <w:jc w:val="left"/>
+            </w:pPr>
+            <w:r>
+              <w:rPr>
+                <w:rFonts w:ascii="Consolas" w:cs="Consolas" w:eastAsia="Consolas" w:hAnsi="Consolas"/>
+                <w:sz w:val="17"/>
+                <w:szCs w:val="17"/>
+              </w:rPr>
+              <w:t xml:space="preserve">marketing@</w:t>
+            </w:r>
+          </w:p>
+        </w:tc>
+        <w:tc>
+          <w:tcPr>
+            <w:tcW w:type="dxa" w:w="4238"/>
+            <w:tcBorders>
+              <w:top w:val="single" w:color="C9D3DD" w:sz="4"/>
+              <w:left w:val="single" w:color="C9D3DD" w:sz="4"/>
+              <w:bottom w:val="single" w:color="C9D3DD" w:sz="4"/>
+              <w:right w:val="single" w:color="C9D3DD" w:sz="4"/>
+            </w:tcBorders>
+            <w:tcMar>
+              <w:top w:type="dxa" w:w="70"/>
+              <w:left w:type="dxa" w:w="110"/>
+              <w:bottom w:type="dxa" w:w="70"/>
+              <w:right w:type="dxa" w:w="110"/>
+            </w:tcMar>
+            <w:vAlign w:val="center"/>
+          </w:tcPr>
+          <w:p>
+            <w:pPr>
+              <w:jc w:val="left"/>
+            </w:pPr>
+            <w:r>
+              <w:rPr>
+                <w:rFonts w:ascii="Calibri" w:cs="Calibri" w:eastAsia="Calibri" w:hAnsi="Calibri"/>
+                <w:sz w:val="20"/>
+                <w:szCs w:val="20"/>
+              </w:rPr>
+              <w:t xml:space="preserve">Lead bisa edit (ganti peserta, lepas planning) dan hapus meeting buatan staff divisinya.</w:t>
+            </w:r>
+          </w:p>
+        </w:tc>
+        <w:tc>
+          <w:tcPr>
+            <w:tcW w:type="dxa" w:w="1300"/>
+            <w:tcBorders>
+              <w:top w:val="single" w:color="C9D3DD" w:sz="4"/>
+              <w:left w:val="single" w:color="C9D3DD" w:sz="4"/>
+              <w:bottom w:val="single" w:color="C9D3DD" w:sz="4"/>
+              <w:right w:val="single" w:color="C9D3DD" w:sz="4"/>
+            </w:tcBorders>
+            <w:tcMar>
+              <w:top w:type="dxa" w:w="70"/>
+              <w:left w:type="dxa" w:w="110"/>
+              <w:bottom w:type="dxa" w:w="70"/>
+              <w:right w:type="dxa" w:w="110"/>
+            </w:tcMar>
+            <w:vAlign w:val="center"/>
+          </w:tcPr>
+          <w:p>
+            <w:pPr>
+              <w:jc w:val="left"/>
+            </w:pPr>
+            <w:r>
+              <w:rPr>
+                <w:rFonts w:ascii="Calibri" w:cs="Calibri" w:eastAsia="Calibri" w:hAnsi="Calibri"/>
+                <w:sz w:val="18"/>
+                <w:szCs w:val="18"/>
+              </w:rPr>
+              <w:t xml:space="preserve">☐  Lulus</w:t>
+            </w:r>
+          </w:p>
+          <w:p>
+            <w:pPr>
+              <w:jc w:val="left"/>
+            </w:pPr>
+            <w:r>
+              <w:rPr>
+                <w:rFonts w:ascii="Calibri" w:cs="Calibri" w:eastAsia="Calibri" w:hAnsi="Calibri"/>
+                <w:sz w:val="18"/>
+                <w:szCs w:val="18"/>
+              </w:rPr>
+              <w:t xml:space="preserve">☐  Gagal</w:t>
+            </w:r>
+          </w:p>
+        </w:tc>
+        <w:tc>
+          <w:tcPr>
+            <w:tcW w:type="dxa" w:w="1800"/>
+            <w:tcBorders>
+              <w:top w:val="single" w:color="C9D3DD" w:sz="4"/>
+              <w:left w:val="single" w:color="C9D3DD" w:sz="4"/>
+              <w:bottom w:val="single" w:color="C9D3DD" w:sz="4"/>
+              <w:right w:val="single" w:color="C9D3DD" w:sz="4"/>
+            </w:tcBorders>
+            <w:tcMar>
+              <w:top w:type="dxa" w:w="70"/>
+              <w:left w:type="dxa" w:w="110"/>
+              <w:bottom w:type="dxa" w:w="70"/>
+              <w:right w:type="dxa" w:w="110"/>
+            </w:tcMar>
+            <w:vAlign w:val="center"/>
+          </w:tcPr>
+          <w:p>
+            <w:pPr>
+              <w:jc w:val="left"/>
+            </w:pPr>
+            <w:r>
+              <w:rPr>
+                <w:rFonts w:ascii="Calibri" w:cs="Calibri" w:eastAsia="Calibri" w:hAnsi="Calibri"/>
+                <w:sz w:val="20"/>
+                <w:szCs w:val="20"/>
+              </w:rPr>
+              <w:t xml:space="preserve"/>
+            </w:r>
+          </w:p>
+        </w:tc>
+      </w:tr>
+      <w:tr>
+        <w:trPr>
+          <w:cantSplit/>
+        </w:trPr>
+        <w:tc>
+          <w:tcPr>
+            <w:tcW w:type="dxa" w:w="500"/>
+            <w:tcBorders>
+              <w:top w:val="single" w:color="C9D3DD" w:sz="4"/>
+              <w:left w:val="single" w:color="C9D3DD" w:sz="4"/>
+              <w:bottom w:val="single" w:color="C9D3DD" w:sz="4"/>
+              <w:right w:val="single" w:color="C9D3DD" w:sz="4"/>
+            </w:tcBorders>
+            <w:shd w:fill="F6F8FA" w:color="auto" w:val="clear"/>
+            <w:tcMar>
+              <w:top w:type="dxa" w:w="70"/>
+              <w:left w:type="dxa" w:w="110"/>
+              <w:bottom w:type="dxa" w:w="70"/>
+              <w:right w:type="dxa" w:w="110"/>
+            </w:tcMar>
+            <w:vAlign w:val="center"/>
+          </w:tcPr>
+          <w:p>
+            <w:pPr>
+              <w:jc w:val="center"/>
+            </w:pPr>
+            <w:r>
+              <w:rPr>
+                <w:rFonts w:ascii="Calibri" w:cs="Calibri" w:eastAsia="Calibri" w:hAnsi="Calibri"/>
+                <w:sz w:val="20"/>
+                <w:szCs w:val="20"/>
+              </w:rPr>
+              <w:t xml:space="preserve">27</w:t>
+            </w:r>
+          </w:p>
+        </w:tc>
+        <w:tc>
+          <w:tcPr>
+            <w:tcW w:type="dxa" w:w="1800"/>
+            <w:tcBorders>
+              <w:top w:val="single" w:color="C9D3DD" w:sz="4"/>
+              <w:left w:val="single" w:color="C9D3DD" w:sz="4"/>
+              <w:bottom w:val="single" w:color="C9D3DD" w:sz="4"/>
+              <w:right w:val="single" w:color="C9D3DD" w:sz="4"/>
+            </w:tcBorders>
+            <w:shd w:fill="F6F8FA" w:color="auto" w:val="clear"/>
+            <w:tcMar>
+              <w:top w:type="dxa" w:w="70"/>
+              <w:left w:type="dxa" w:w="110"/>
+              <w:bottom w:type="dxa" w:w="70"/>
+              <w:right w:type="dxa" w:w="110"/>
+            </w:tcMar>
+            <w:vAlign w:val="center"/>
+          </w:tcPr>
+          <w:p>
+            <w:pPr>
+              <w:jc w:val="left"/>
+            </w:pPr>
+            <w:r>
+              <w:rPr>
+                <w:rFonts w:ascii="Consolas" w:cs="Consolas" w:eastAsia="Consolas" w:hAnsi="Consolas"/>
+                <w:sz w:val="17"/>
+                <w:szCs w:val="17"/>
+              </w:rPr>
+              <w:t xml:space="preserve">gm@</w:t>
+            </w:r>
+          </w:p>
+        </w:tc>
+        <w:tc>
+          <w:tcPr>
+            <w:tcW w:type="dxa" w:w="4238"/>
+            <w:tcBorders>
+              <w:top w:val="single" w:color="C9D3DD" w:sz="4"/>
+              <w:left w:val="single" w:color="C9D3DD" w:sz="4"/>
+              <w:bottom w:val="single" w:color="C9D3DD" w:sz="4"/>
+              <w:right w:val="single" w:color="C9D3DD" w:sz="4"/>
+            </w:tcBorders>
+            <w:shd w:fill="F6F8FA" w:color="auto" w:val="clear"/>
+            <w:tcMar>
+              <w:top w:type="dxa" w:w="70"/>
+              <w:left w:type="dxa" w:w="110"/>
+              <w:bottom w:type="dxa" w:w="70"/>
+              <w:right w:type="dxa" w:w="110"/>
+            </w:tcMar>
+            <w:vAlign w:val="center"/>
+          </w:tcPr>
+          <w:p>
+            <w:pPr>
+              <w:jc w:val="left"/>
+            </w:pPr>
+            <w:r>
+              <w:rPr>
+                <w:rFonts w:ascii="Calibri" w:cs="Calibri" w:eastAsia="Calibri" w:hAnsi="Calibri"/>
+                <w:sz w:val="20"/>
+                <w:szCs w:val="20"/>
+              </w:rPr>
+              <w:t xml:space="preserve">Melihat meeting semua divisi; filter divisi tersedia.</w:t>
             </w:r>
           </w:p>
         </w:tc>
@@ -10089,7 +11971,7 @@
                 <w:sz w:val="20"/>
                 <w:szCs w:val="20"/>
               </w:rPr>
-              <w:t xml:space="preserve">22</w:t>
+              <w:t xml:space="preserve">28</w:t>
             </w:r>
           </w:p>
         </w:tc>
@@ -10263,7 +12145,7 @@
                 <w:sz w:val="20"/>
                 <w:szCs w:val="20"/>
               </w:rPr>
-              <w:t xml:space="preserve">23</w:t>
+              <w:t xml:space="preserve">29</w:t>
             </w:r>
           </w:p>
         </w:tc>
@@ -10440,7 +12322,7 @@
                 <w:sz w:val="20"/>
                 <w:szCs w:val="20"/>
               </w:rPr>
-              <w:t xml:space="preserve">24</w:t>
+              <w:t xml:space="preserve">30</w:t>
             </w:r>
           </w:p>
         </w:tc>
@@ -10614,7 +12496,7 @@
                 <w:sz w:val="20"/>
                 <w:szCs w:val="20"/>
               </w:rPr>
-              <w:t xml:space="preserve">25</w:t>
+              <w:t xml:space="preserve">31</w:t>
             </w:r>
           </w:p>
         </w:tc>
@@ -10678,7 +12560,7 @@
                 <w:sz w:val="20"/>
                 <w:szCs w:val="20"/>
               </w:rPr>
-              <w:t xml:space="preserve">"Cabut" planning.create → tombol "Buat planning" hilang untuk user itu.</w:t>
+              <w:t xml:space="preserve">"Izinkan" planning.create untuk staff → tombol "Buat planning" muncul untuk user itu.</w:t>
             </w:r>
           </w:p>
         </w:tc>
@@ -10791,7 +12673,7 @@
                 <w:sz w:val="20"/>
                 <w:szCs w:val="20"/>
               </w:rPr>
-              <w:t xml:space="preserve">26</w:t>
+              <w:t xml:space="preserve">32</w:t>
             </w:r>
           </w:p>
         </w:tc>
@@ -10965,7 +12847,7 @@
                 <w:sz w:val="20"/>
                 <w:szCs w:val="20"/>
               </w:rPr>
-              <w:t xml:space="preserve">27</w:t>
+              <w:t xml:space="preserve">33</w:t>
             </w:r>
           </w:p>
         </w:tc>
@@ -11361,7 +13243,7 @@
                 <w:sz w:val="20"/>
                 <w:szCs w:val="20"/>
               </w:rPr>
-              <w:t xml:space="preserve">28</w:t>
+              <w:t xml:space="preserve">34</w:t>
             </w:r>
           </w:p>
         </w:tc>
@@ -11535,7 +13417,7 @@
                 <w:sz w:val="20"/>
                 <w:szCs w:val="20"/>
               </w:rPr>
-              <w:t xml:space="preserve">29</w:t>
+              <w:t xml:space="preserve">35</w:t>
             </w:r>
           </w:p>
         </w:tc>
@@ -11599,7 +13481,7 @@
                 <w:sz w:val="20"/>
                 <w:szCs w:val="20"/>
               </w:rPr>
-              <w:t xml:space="preserve">Centang planning.approve untuk Staff → Simpan → staff bisa approve planning divisinya. Kembalikan setelah selesai.</w:t>
+              <w:t xml:space="preserve">Centang planning.create untuk Staff → Simpan → staff bisa membuat planning. Kembalikan setelah selesai.</w:t>
             </w:r>
           </w:p>
         </w:tc>
@@ -11931,7 +13813,7 @@
                 <w:sz w:val="20"/>
                 <w:szCs w:val="20"/>
               </w:rPr>
-              <w:t xml:space="preserve">30</w:t>
+              <w:t xml:space="preserve">36</w:t>
             </w:r>
           </w:p>
         </w:tc>
@@ -12106,7 +13988,7 @@
                 <w:sz w:val="20"/>
                 <w:szCs w:val="20"/>
               </w:rPr>
-              <w:t xml:space="preserve">31</w:t>
+              <w:t xml:space="preserve">37</w:t>
             </w:r>
           </w:p>
         </w:tc>

</xml_diff>

<commit_message>
Planning: catatan progress (teks/link/file) dan update progress di paling bawah
- Migrasi 009_planning_progress_notes: tabel catatan progress; lampiran catatan
  memakai planning_files.note_id
- POST /api/planning/[id]/progress: simpan progress + catatan opsional dengan
  tanggal & waktu otomatis; PATCH/DELETE /api/planning/notes/[noteId]
- Penulis bisa edit/hapus catatannya, lead/admin bisa semua catatan divisinya
- Detail planning: Deskripsi, Lampiran, Catatan progress, lalu Update progress
- docs/akun-testing.docx: skenario catatan progress & meeting terbaru

Co-Authored-By: Claude Opus 5.5 <noreply@anthropic.com>
</commit_message>
<xml_diff>
--- a/docs/akun-testing.docx
+++ b/docs/akun-testing.docx
@@ -4804,12 +4804,13 @@
             <w:r>
               <w:rPr>
                 <w:rFonts w:ascii="Calibri" w:cs="Calibri" w:eastAsia="Calibri" w:hAnsi="Calibri"/>
-                <w:b/>
-                <w:bCs/>
-                <w:sz w:val="18"/>
-                <w:szCs w:val="18"/>
-              </w:rPr>
-              <w:t xml:space="preserve">✓</w:t>
+                <w:b w:val="false"/>
+                <w:bCs w:val="false"/>
+                <w:color w:val="5B6474"/>
+                <w:sz w:val="18"/>
+                <w:szCs w:val="18"/>
+              </w:rPr>
+              <w:t xml:space="preserve">—</w:t>
             </w:r>
           </w:p>
         </w:tc>
@@ -9189,6 +9190,1451 @@
           <w:sz w:val="24"/>
           <w:szCs w:val="24"/>
         </w:rPr>
+        <w:t xml:space="preserve">Planning — Catatan Progress</w:t>
+      </w:r>
+    </w:p>
+    <w:tbl>
+      <w:tblPr>
+        <w:tblW w:type="dxa" w:w="9638"/>
+        <w:tblBorders>
+          <w:top w:val="single" w:color="auto" w:sz="4"/>
+          <w:left w:val="single" w:color="auto" w:sz="4"/>
+          <w:bottom w:val="single" w:color="auto" w:sz="4"/>
+          <w:right w:val="single" w:color="auto" w:sz="4"/>
+          <w:insideH w:val="single" w:color="auto" w:sz="4"/>
+          <w:insideV w:val="single" w:color="auto" w:sz="4"/>
+        </w:tblBorders>
+      </w:tblPr>
+      <w:tblGrid>
+        <w:gridCol w:w="500"/>
+        <w:gridCol w:w="1800"/>
+        <w:gridCol w:w="4238"/>
+        <w:gridCol w:w="1300"/>
+        <w:gridCol w:w="1800"/>
+      </w:tblGrid>
+      <w:tr>
+        <w:trPr>
+          <w:cantSplit/>
+          <w:tblHeader/>
+        </w:trPr>
+        <w:tc>
+          <w:tcPr>
+            <w:tcW w:type="dxa" w:w="500"/>
+            <w:tcBorders>
+              <w:top w:val="single" w:color="C9D3DD" w:sz="4"/>
+              <w:left w:val="single" w:color="C9D3DD" w:sz="4"/>
+              <w:bottom w:val="single" w:color="C9D3DD" w:sz="4"/>
+              <w:right w:val="single" w:color="C9D3DD" w:sz="4"/>
+            </w:tcBorders>
+            <w:shd w:fill="0E1C28" w:color="auto" w:val="clear"/>
+            <w:tcMar>
+              <w:top w:type="dxa" w:w="70"/>
+              <w:left w:type="dxa" w:w="110"/>
+              <w:bottom w:type="dxa" w:w="70"/>
+              <w:right w:type="dxa" w:w="110"/>
+            </w:tcMar>
+            <w:vAlign w:val="center"/>
+          </w:tcPr>
+          <w:p>
+            <w:pPr>
+              <w:jc w:val="center"/>
+            </w:pPr>
+            <w:r>
+              <w:rPr>
+                <w:rFonts w:ascii="Calibri" w:cs="Calibri" w:eastAsia="Calibri" w:hAnsi="Calibri"/>
+                <w:b/>
+                <w:bCs/>
+                <w:color w:val="FFFFFF"/>
+                <w:sz w:val="18"/>
+                <w:szCs w:val="18"/>
+              </w:rPr>
+              <w:t xml:space="preserve">No</w:t>
+            </w:r>
+          </w:p>
+        </w:tc>
+        <w:tc>
+          <w:tcPr>
+            <w:tcW w:type="dxa" w:w="1800"/>
+            <w:tcBorders>
+              <w:top w:val="single" w:color="C9D3DD" w:sz="4"/>
+              <w:left w:val="single" w:color="C9D3DD" w:sz="4"/>
+              <w:bottom w:val="single" w:color="C9D3DD" w:sz="4"/>
+              <w:right w:val="single" w:color="C9D3DD" w:sz="4"/>
+            </w:tcBorders>
+            <w:shd w:fill="0E1C28" w:color="auto" w:val="clear"/>
+            <w:tcMar>
+              <w:top w:type="dxa" w:w="70"/>
+              <w:left w:type="dxa" w:w="110"/>
+              <w:bottom w:type="dxa" w:w="70"/>
+              <w:right w:type="dxa" w:w="110"/>
+            </w:tcMar>
+            <w:vAlign w:val="center"/>
+          </w:tcPr>
+          <w:p>
+            <w:pPr>
+              <w:jc w:val="left"/>
+            </w:pPr>
+            <w:r>
+              <w:rPr>
+                <w:rFonts w:ascii="Calibri" w:cs="Calibri" w:eastAsia="Calibri" w:hAnsi="Calibri"/>
+                <w:b/>
+                <w:bCs/>
+                <w:color w:val="FFFFFF"/>
+                <w:sz w:val="18"/>
+                <w:szCs w:val="18"/>
+              </w:rPr>
+              <w:t xml:space="preserve">Akun</w:t>
+            </w:r>
+          </w:p>
+        </w:tc>
+        <w:tc>
+          <w:tcPr>
+            <w:tcW w:type="dxa" w:w="4238"/>
+            <w:tcBorders>
+              <w:top w:val="single" w:color="C9D3DD" w:sz="4"/>
+              <w:left w:val="single" w:color="C9D3DD" w:sz="4"/>
+              <w:bottom w:val="single" w:color="C9D3DD" w:sz="4"/>
+              <w:right w:val="single" w:color="C9D3DD" w:sz="4"/>
+            </w:tcBorders>
+            <w:shd w:fill="0E1C28" w:color="auto" w:val="clear"/>
+            <w:tcMar>
+              <w:top w:type="dxa" w:w="70"/>
+              <w:left w:type="dxa" w:w="110"/>
+              <w:bottom w:type="dxa" w:w="70"/>
+              <w:right w:type="dxa" w:w="110"/>
+            </w:tcMar>
+            <w:vAlign w:val="center"/>
+          </w:tcPr>
+          <w:p>
+            <w:pPr>
+              <w:jc w:val="left"/>
+            </w:pPr>
+            <w:r>
+              <w:rPr>
+                <w:rFonts w:ascii="Calibri" w:cs="Calibri" w:eastAsia="Calibri" w:hAnsi="Calibri"/>
+                <w:b/>
+                <w:bCs/>
+                <w:color w:val="FFFFFF"/>
+                <w:sz w:val="18"/>
+                <w:szCs w:val="18"/>
+              </w:rPr>
+              <w:t xml:space="preserve">Skenario</w:t>
+            </w:r>
+          </w:p>
+        </w:tc>
+        <w:tc>
+          <w:tcPr>
+            <w:tcW w:type="dxa" w:w="1300"/>
+            <w:tcBorders>
+              <w:top w:val="single" w:color="C9D3DD" w:sz="4"/>
+              <w:left w:val="single" w:color="C9D3DD" w:sz="4"/>
+              <w:bottom w:val="single" w:color="C9D3DD" w:sz="4"/>
+              <w:right w:val="single" w:color="C9D3DD" w:sz="4"/>
+            </w:tcBorders>
+            <w:shd w:fill="0E1C28" w:color="auto" w:val="clear"/>
+            <w:tcMar>
+              <w:top w:type="dxa" w:w="70"/>
+              <w:left w:type="dxa" w:w="110"/>
+              <w:bottom w:type="dxa" w:w="70"/>
+              <w:right w:type="dxa" w:w="110"/>
+            </w:tcMar>
+            <w:vAlign w:val="center"/>
+          </w:tcPr>
+          <w:p>
+            <w:pPr>
+              <w:jc w:val="left"/>
+            </w:pPr>
+            <w:r>
+              <w:rPr>
+                <w:rFonts w:ascii="Calibri" w:cs="Calibri" w:eastAsia="Calibri" w:hAnsi="Calibri"/>
+                <w:b/>
+                <w:bCs/>
+                <w:color w:val="FFFFFF"/>
+                <w:sz w:val="18"/>
+                <w:szCs w:val="18"/>
+              </w:rPr>
+              <w:t xml:space="preserve">Hasil</w:t>
+            </w:r>
+          </w:p>
+        </w:tc>
+        <w:tc>
+          <w:tcPr>
+            <w:tcW w:type="dxa" w:w="1800"/>
+            <w:tcBorders>
+              <w:top w:val="single" w:color="C9D3DD" w:sz="4"/>
+              <w:left w:val="single" w:color="C9D3DD" w:sz="4"/>
+              <w:bottom w:val="single" w:color="C9D3DD" w:sz="4"/>
+              <w:right w:val="single" w:color="C9D3DD" w:sz="4"/>
+            </w:tcBorders>
+            <w:shd w:fill="0E1C28" w:color="auto" w:val="clear"/>
+            <w:tcMar>
+              <w:top w:type="dxa" w:w="70"/>
+              <w:left w:type="dxa" w:w="110"/>
+              <w:bottom w:type="dxa" w:w="70"/>
+              <w:right w:type="dxa" w:w="110"/>
+            </w:tcMar>
+            <w:vAlign w:val="center"/>
+          </w:tcPr>
+          <w:p>
+            <w:pPr>
+              <w:jc w:val="left"/>
+            </w:pPr>
+            <w:r>
+              <w:rPr>
+                <w:rFonts w:ascii="Calibri" w:cs="Calibri" w:eastAsia="Calibri" w:hAnsi="Calibri"/>
+                <w:b/>
+                <w:bCs/>
+                <w:color w:val="FFFFFF"/>
+                <w:sz w:val="18"/>
+                <w:szCs w:val="18"/>
+              </w:rPr>
+              <w:t xml:space="preserve">Catatan</w:t>
+            </w:r>
+          </w:p>
+        </w:tc>
+      </w:tr>
+      <w:tr>
+        <w:trPr>
+          <w:cantSplit/>
+        </w:trPr>
+        <w:tc>
+          <w:tcPr>
+            <w:tcW w:type="dxa" w:w="500"/>
+            <w:tcBorders>
+              <w:top w:val="single" w:color="C9D3DD" w:sz="4"/>
+              <w:left w:val="single" w:color="C9D3DD" w:sz="4"/>
+              <w:bottom w:val="single" w:color="C9D3DD" w:sz="4"/>
+              <w:right w:val="single" w:color="C9D3DD" w:sz="4"/>
+            </w:tcBorders>
+            <w:tcMar>
+              <w:top w:type="dxa" w:w="70"/>
+              <w:left w:type="dxa" w:w="110"/>
+              <w:bottom w:type="dxa" w:w="70"/>
+              <w:right w:type="dxa" w:w="110"/>
+            </w:tcMar>
+            <w:vAlign w:val="center"/>
+          </w:tcPr>
+          <w:p>
+            <w:pPr>
+              <w:jc w:val="center"/>
+            </w:pPr>
+            <w:r>
+              <w:rPr>
+                <w:rFonts w:ascii="Calibri" w:cs="Calibri" w:eastAsia="Calibri" w:hAnsi="Calibri"/>
+                <w:sz w:val="20"/>
+                <w:szCs w:val="20"/>
+              </w:rPr>
+              <w:t xml:space="preserve">16</w:t>
+            </w:r>
+          </w:p>
+        </w:tc>
+        <w:tc>
+          <w:tcPr>
+            <w:tcW w:type="dxa" w:w="1800"/>
+            <w:tcBorders>
+              <w:top w:val="single" w:color="C9D3DD" w:sz="4"/>
+              <w:left w:val="single" w:color="C9D3DD" w:sz="4"/>
+              <w:bottom w:val="single" w:color="C9D3DD" w:sz="4"/>
+              <w:right w:val="single" w:color="C9D3DD" w:sz="4"/>
+            </w:tcBorders>
+            <w:tcMar>
+              <w:top w:type="dxa" w:w="70"/>
+              <w:left w:type="dxa" w:w="110"/>
+              <w:bottom w:type="dxa" w:w="70"/>
+              <w:right w:type="dxa" w:w="110"/>
+            </w:tcMar>
+            <w:vAlign w:val="center"/>
+          </w:tcPr>
+          <w:p>
+            <w:pPr>
+              <w:jc w:val="left"/>
+            </w:pPr>
+            <w:r>
+              <w:rPr>
+                <w:rFonts w:ascii="Consolas" w:cs="Consolas" w:eastAsia="Consolas" w:hAnsi="Consolas"/>
+                <w:sz w:val="17"/>
+                <w:szCs w:val="17"/>
+              </w:rPr>
+              <w:t xml:space="preserve">marketing.staff@</w:t>
+            </w:r>
+          </w:p>
+        </w:tc>
+        <w:tc>
+          <w:tcPr>
+            <w:tcW w:type="dxa" w:w="4238"/>
+            <w:tcBorders>
+              <w:top w:val="single" w:color="C9D3DD" w:sz="4"/>
+              <w:left w:val="single" w:color="C9D3DD" w:sz="4"/>
+              <w:bottom w:val="single" w:color="C9D3DD" w:sz="4"/>
+              <w:right w:val="single" w:color="C9D3DD" w:sz="4"/>
+            </w:tcBorders>
+            <w:tcMar>
+              <w:top w:type="dxa" w:w="70"/>
+              <w:left w:type="dxa" w:w="110"/>
+              <w:bottom w:type="dxa" w:w="70"/>
+              <w:right w:type="dxa" w:w="110"/>
+            </w:tcMar>
+            <w:vAlign w:val="center"/>
+          </w:tcPr>
+          <w:p>
+            <w:pPr>
+              <w:jc w:val="left"/>
+            </w:pPr>
+            <w:r>
+              <w:rPr>
+                <w:rFonts w:ascii="Calibri" w:cs="Calibri" w:eastAsia="Calibri" w:hAnsi="Calibri"/>
+                <w:sz w:val="20"/>
+                <w:szCs w:val="20"/>
+              </w:rPr>
+              <w:t xml:space="preserve">Detail planning: urutan Deskripsi → Lampiran → Catatan progress → Update progress (paling bawah).</w:t>
+            </w:r>
+          </w:p>
+        </w:tc>
+        <w:tc>
+          <w:tcPr>
+            <w:tcW w:type="dxa" w:w="1300"/>
+            <w:tcBorders>
+              <w:top w:val="single" w:color="C9D3DD" w:sz="4"/>
+              <w:left w:val="single" w:color="C9D3DD" w:sz="4"/>
+              <w:bottom w:val="single" w:color="C9D3DD" w:sz="4"/>
+              <w:right w:val="single" w:color="C9D3DD" w:sz="4"/>
+            </w:tcBorders>
+            <w:tcMar>
+              <w:top w:type="dxa" w:w="70"/>
+              <w:left w:type="dxa" w:w="110"/>
+              <w:bottom w:type="dxa" w:w="70"/>
+              <w:right w:type="dxa" w:w="110"/>
+            </w:tcMar>
+            <w:vAlign w:val="center"/>
+          </w:tcPr>
+          <w:p>
+            <w:pPr>
+              <w:jc w:val="left"/>
+            </w:pPr>
+            <w:r>
+              <w:rPr>
+                <w:rFonts w:ascii="Calibri" w:cs="Calibri" w:eastAsia="Calibri" w:hAnsi="Calibri"/>
+                <w:sz w:val="18"/>
+                <w:szCs w:val="18"/>
+              </w:rPr>
+              <w:t xml:space="preserve">☐  Lulus</w:t>
+            </w:r>
+          </w:p>
+          <w:p>
+            <w:pPr>
+              <w:jc w:val="left"/>
+            </w:pPr>
+            <w:r>
+              <w:rPr>
+                <w:rFonts w:ascii="Calibri" w:cs="Calibri" w:eastAsia="Calibri" w:hAnsi="Calibri"/>
+                <w:sz w:val="18"/>
+                <w:szCs w:val="18"/>
+              </w:rPr>
+              <w:t xml:space="preserve">☐  Gagal</w:t>
+            </w:r>
+          </w:p>
+        </w:tc>
+        <w:tc>
+          <w:tcPr>
+            <w:tcW w:type="dxa" w:w="1800"/>
+            <w:tcBorders>
+              <w:top w:val="single" w:color="C9D3DD" w:sz="4"/>
+              <w:left w:val="single" w:color="C9D3DD" w:sz="4"/>
+              <w:bottom w:val="single" w:color="C9D3DD" w:sz="4"/>
+              <w:right w:val="single" w:color="C9D3DD" w:sz="4"/>
+            </w:tcBorders>
+            <w:tcMar>
+              <w:top w:type="dxa" w:w="70"/>
+              <w:left w:type="dxa" w:w="110"/>
+              <w:bottom w:type="dxa" w:w="70"/>
+              <w:right w:type="dxa" w:w="110"/>
+            </w:tcMar>
+            <w:vAlign w:val="center"/>
+          </w:tcPr>
+          <w:p>
+            <w:pPr>
+              <w:jc w:val="left"/>
+            </w:pPr>
+            <w:r>
+              <w:rPr>
+                <w:rFonts w:ascii="Calibri" w:cs="Calibri" w:eastAsia="Calibri" w:hAnsi="Calibri"/>
+                <w:sz w:val="20"/>
+                <w:szCs w:val="20"/>
+              </w:rPr>
+              <w:t xml:space="preserve"/>
+            </w:r>
+          </w:p>
+        </w:tc>
+      </w:tr>
+      <w:tr>
+        <w:trPr>
+          <w:cantSplit/>
+        </w:trPr>
+        <w:tc>
+          <w:tcPr>
+            <w:tcW w:type="dxa" w:w="500"/>
+            <w:tcBorders>
+              <w:top w:val="single" w:color="C9D3DD" w:sz="4"/>
+              <w:left w:val="single" w:color="C9D3DD" w:sz="4"/>
+              <w:bottom w:val="single" w:color="C9D3DD" w:sz="4"/>
+              <w:right w:val="single" w:color="C9D3DD" w:sz="4"/>
+            </w:tcBorders>
+            <w:shd w:fill="F6F8FA" w:color="auto" w:val="clear"/>
+            <w:tcMar>
+              <w:top w:type="dxa" w:w="70"/>
+              <w:left w:type="dxa" w:w="110"/>
+              <w:bottom w:type="dxa" w:w="70"/>
+              <w:right w:type="dxa" w:w="110"/>
+            </w:tcMar>
+            <w:vAlign w:val="center"/>
+          </w:tcPr>
+          <w:p>
+            <w:pPr>
+              <w:jc w:val="center"/>
+            </w:pPr>
+            <w:r>
+              <w:rPr>
+                <w:rFonts w:ascii="Calibri" w:cs="Calibri" w:eastAsia="Calibri" w:hAnsi="Calibri"/>
+                <w:sz w:val="20"/>
+                <w:szCs w:val="20"/>
+              </w:rPr>
+              <w:t xml:space="preserve">17</w:t>
+            </w:r>
+          </w:p>
+        </w:tc>
+        <w:tc>
+          <w:tcPr>
+            <w:tcW w:type="dxa" w:w="1800"/>
+            <w:tcBorders>
+              <w:top w:val="single" w:color="C9D3DD" w:sz="4"/>
+              <w:left w:val="single" w:color="C9D3DD" w:sz="4"/>
+              <w:bottom w:val="single" w:color="C9D3DD" w:sz="4"/>
+              <w:right w:val="single" w:color="C9D3DD" w:sz="4"/>
+            </w:tcBorders>
+            <w:shd w:fill="F6F8FA" w:color="auto" w:val="clear"/>
+            <w:tcMar>
+              <w:top w:type="dxa" w:w="70"/>
+              <w:left w:type="dxa" w:w="110"/>
+              <w:bottom w:type="dxa" w:w="70"/>
+              <w:right w:type="dxa" w:w="110"/>
+            </w:tcMar>
+            <w:vAlign w:val="center"/>
+          </w:tcPr>
+          <w:p>
+            <w:pPr>
+              <w:jc w:val="left"/>
+            </w:pPr>
+            <w:r>
+              <w:rPr>
+                <w:rFonts w:ascii="Consolas" w:cs="Consolas" w:eastAsia="Consolas" w:hAnsi="Consolas"/>
+                <w:sz w:val="17"/>
+                <w:szCs w:val="17"/>
+              </w:rPr>
+              <w:t xml:space="preserve">marketing.staff@</w:t>
+            </w:r>
+          </w:p>
+        </w:tc>
+        <w:tc>
+          <w:tcPr>
+            <w:tcW w:type="dxa" w:w="4238"/>
+            <w:tcBorders>
+              <w:top w:val="single" w:color="C9D3DD" w:sz="4"/>
+              <w:left w:val="single" w:color="C9D3DD" w:sz="4"/>
+              <w:bottom w:val="single" w:color="C9D3DD" w:sz="4"/>
+              <w:right w:val="single" w:color="C9D3DD" w:sz="4"/>
+            </w:tcBorders>
+            <w:shd w:fill="F6F8FA" w:color="auto" w:val="clear"/>
+            <w:tcMar>
+              <w:top w:type="dxa" w:w="70"/>
+              <w:left w:type="dxa" w:w="110"/>
+              <w:bottom w:type="dxa" w:w="70"/>
+              <w:right w:type="dxa" w:w="110"/>
+            </w:tcMar>
+            <w:vAlign w:val="center"/>
+          </w:tcPr>
+          <w:p>
+            <w:pPr>
+              <w:jc w:val="left"/>
+            </w:pPr>
+            <w:r>
+              <w:rPr>
+                <w:rFonts w:ascii="Calibri" w:cs="Calibri" w:eastAsia="Calibri" w:hAnsi="Calibri"/>
+                <w:sz w:val="20"/>
+                <w:szCs w:val="20"/>
+              </w:rPr>
+              <w:t xml:space="preserve">Simpan progress tanpa catatan → progress berubah, tidak ada catatan baru.</w:t>
+            </w:r>
+          </w:p>
+        </w:tc>
+        <w:tc>
+          <w:tcPr>
+            <w:tcW w:type="dxa" w:w="1300"/>
+            <w:tcBorders>
+              <w:top w:val="single" w:color="C9D3DD" w:sz="4"/>
+              <w:left w:val="single" w:color="C9D3DD" w:sz="4"/>
+              <w:bottom w:val="single" w:color="C9D3DD" w:sz="4"/>
+              <w:right w:val="single" w:color="C9D3DD" w:sz="4"/>
+            </w:tcBorders>
+            <w:shd w:fill="F6F8FA" w:color="auto" w:val="clear"/>
+            <w:tcMar>
+              <w:top w:type="dxa" w:w="70"/>
+              <w:left w:type="dxa" w:w="110"/>
+              <w:bottom w:type="dxa" w:w="70"/>
+              <w:right w:type="dxa" w:w="110"/>
+            </w:tcMar>
+            <w:vAlign w:val="center"/>
+          </w:tcPr>
+          <w:p>
+            <w:pPr>
+              <w:jc w:val="left"/>
+            </w:pPr>
+            <w:r>
+              <w:rPr>
+                <w:rFonts w:ascii="Calibri" w:cs="Calibri" w:eastAsia="Calibri" w:hAnsi="Calibri"/>
+                <w:sz w:val="18"/>
+                <w:szCs w:val="18"/>
+              </w:rPr>
+              <w:t xml:space="preserve">☐  Lulus</w:t>
+            </w:r>
+          </w:p>
+          <w:p>
+            <w:pPr>
+              <w:jc w:val="left"/>
+            </w:pPr>
+            <w:r>
+              <w:rPr>
+                <w:rFonts w:ascii="Calibri" w:cs="Calibri" w:eastAsia="Calibri" w:hAnsi="Calibri"/>
+                <w:sz w:val="18"/>
+                <w:szCs w:val="18"/>
+              </w:rPr>
+              <w:t xml:space="preserve">☐  Gagal</w:t>
+            </w:r>
+          </w:p>
+        </w:tc>
+        <w:tc>
+          <w:tcPr>
+            <w:tcW w:type="dxa" w:w="1800"/>
+            <w:tcBorders>
+              <w:top w:val="single" w:color="C9D3DD" w:sz="4"/>
+              <w:left w:val="single" w:color="C9D3DD" w:sz="4"/>
+              <w:bottom w:val="single" w:color="C9D3DD" w:sz="4"/>
+              <w:right w:val="single" w:color="C9D3DD" w:sz="4"/>
+            </w:tcBorders>
+            <w:shd w:fill="F6F8FA" w:color="auto" w:val="clear"/>
+            <w:tcMar>
+              <w:top w:type="dxa" w:w="70"/>
+              <w:left w:type="dxa" w:w="110"/>
+              <w:bottom w:type="dxa" w:w="70"/>
+              <w:right w:type="dxa" w:w="110"/>
+            </w:tcMar>
+            <w:vAlign w:val="center"/>
+          </w:tcPr>
+          <w:p>
+            <w:pPr>
+              <w:jc w:val="left"/>
+            </w:pPr>
+            <w:r>
+              <w:rPr>
+                <w:rFonts w:ascii="Calibri" w:cs="Calibri" w:eastAsia="Calibri" w:hAnsi="Calibri"/>
+                <w:sz w:val="20"/>
+                <w:szCs w:val="20"/>
+              </w:rPr>
+              <w:t xml:space="preserve"/>
+            </w:r>
+          </w:p>
+        </w:tc>
+      </w:tr>
+      <w:tr>
+        <w:trPr>
+          <w:cantSplit/>
+        </w:trPr>
+        <w:tc>
+          <w:tcPr>
+            <w:tcW w:type="dxa" w:w="500"/>
+            <w:tcBorders>
+              <w:top w:val="single" w:color="C9D3DD" w:sz="4"/>
+              <w:left w:val="single" w:color="C9D3DD" w:sz="4"/>
+              <w:bottom w:val="single" w:color="C9D3DD" w:sz="4"/>
+              <w:right w:val="single" w:color="C9D3DD" w:sz="4"/>
+            </w:tcBorders>
+            <w:tcMar>
+              <w:top w:type="dxa" w:w="70"/>
+              <w:left w:type="dxa" w:w="110"/>
+              <w:bottom w:type="dxa" w:w="70"/>
+              <w:right w:type="dxa" w:w="110"/>
+            </w:tcMar>
+            <w:vAlign w:val="center"/>
+          </w:tcPr>
+          <w:p>
+            <w:pPr>
+              <w:jc w:val="center"/>
+            </w:pPr>
+            <w:r>
+              <w:rPr>
+                <w:rFonts w:ascii="Calibri" w:cs="Calibri" w:eastAsia="Calibri" w:hAnsi="Calibri"/>
+                <w:sz w:val="20"/>
+                <w:szCs w:val="20"/>
+              </w:rPr>
+              <w:t xml:space="preserve">18</w:t>
+            </w:r>
+          </w:p>
+        </w:tc>
+        <w:tc>
+          <w:tcPr>
+            <w:tcW w:type="dxa" w:w="1800"/>
+            <w:tcBorders>
+              <w:top w:val="single" w:color="C9D3DD" w:sz="4"/>
+              <w:left w:val="single" w:color="C9D3DD" w:sz="4"/>
+              <w:bottom w:val="single" w:color="C9D3DD" w:sz="4"/>
+              <w:right w:val="single" w:color="C9D3DD" w:sz="4"/>
+            </w:tcBorders>
+            <w:tcMar>
+              <w:top w:type="dxa" w:w="70"/>
+              <w:left w:type="dxa" w:w="110"/>
+              <w:bottom w:type="dxa" w:w="70"/>
+              <w:right w:type="dxa" w:w="110"/>
+            </w:tcMar>
+            <w:vAlign w:val="center"/>
+          </w:tcPr>
+          <w:p>
+            <w:pPr>
+              <w:jc w:val="left"/>
+            </w:pPr>
+            <w:r>
+              <w:rPr>
+                <w:rFonts w:ascii="Consolas" w:cs="Consolas" w:eastAsia="Consolas" w:hAnsi="Consolas"/>
+                <w:sz w:val="17"/>
+                <w:szCs w:val="17"/>
+              </w:rPr>
+              <w:t xml:space="preserve">marketing.staff@</w:t>
+            </w:r>
+          </w:p>
+        </w:tc>
+        <w:tc>
+          <w:tcPr>
+            <w:tcW w:type="dxa" w:w="4238"/>
+            <w:tcBorders>
+              <w:top w:val="single" w:color="C9D3DD" w:sz="4"/>
+              <w:left w:val="single" w:color="C9D3DD" w:sz="4"/>
+              <w:bottom w:val="single" w:color="C9D3DD" w:sz="4"/>
+              <w:right w:val="single" w:color="C9D3DD" w:sz="4"/>
+            </w:tcBorders>
+            <w:tcMar>
+              <w:top w:type="dxa" w:w="70"/>
+              <w:left w:type="dxa" w:w="110"/>
+              <w:bottom w:type="dxa" w:w="70"/>
+              <w:right w:type="dxa" w:w="110"/>
+            </w:tcMar>
+            <w:vAlign w:val="center"/>
+          </w:tcPr>
+          <w:p>
+            <w:pPr>
+              <w:jc w:val="left"/>
+            </w:pPr>
+            <w:r>
+              <w:rPr>
+                <w:rFonts w:ascii="Calibri" w:cs="Calibri" w:eastAsia="Calibri" w:hAnsi="Calibri"/>
+                <w:sz w:val="20"/>
+                <w:szCs w:val="20"/>
+              </w:rPr>
+              <w:t xml:space="preserve">Simpan progress dengan catatan teks + link + file → catatan muncul dengan progress, status, nama, serta tanggal &amp; waktu otomatis.</w:t>
+            </w:r>
+          </w:p>
+        </w:tc>
+        <w:tc>
+          <w:tcPr>
+            <w:tcW w:type="dxa" w:w="1300"/>
+            <w:tcBorders>
+              <w:top w:val="single" w:color="C9D3DD" w:sz="4"/>
+              <w:left w:val="single" w:color="C9D3DD" w:sz="4"/>
+              <w:bottom w:val="single" w:color="C9D3DD" w:sz="4"/>
+              <w:right w:val="single" w:color="C9D3DD" w:sz="4"/>
+            </w:tcBorders>
+            <w:tcMar>
+              <w:top w:type="dxa" w:w="70"/>
+              <w:left w:type="dxa" w:w="110"/>
+              <w:bottom w:type="dxa" w:w="70"/>
+              <w:right w:type="dxa" w:w="110"/>
+            </w:tcMar>
+            <w:vAlign w:val="center"/>
+          </w:tcPr>
+          <w:p>
+            <w:pPr>
+              <w:jc w:val="left"/>
+            </w:pPr>
+            <w:r>
+              <w:rPr>
+                <w:rFonts w:ascii="Calibri" w:cs="Calibri" w:eastAsia="Calibri" w:hAnsi="Calibri"/>
+                <w:sz w:val="18"/>
+                <w:szCs w:val="18"/>
+              </w:rPr>
+              <w:t xml:space="preserve">☐  Lulus</w:t>
+            </w:r>
+          </w:p>
+          <w:p>
+            <w:pPr>
+              <w:jc w:val="left"/>
+            </w:pPr>
+            <w:r>
+              <w:rPr>
+                <w:rFonts w:ascii="Calibri" w:cs="Calibri" w:eastAsia="Calibri" w:hAnsi="Calibri"/>
+                <w:sz w:val="18"/>
+                <w:szCs w:val="18"/>
+              </w:rPr>
+              <w:t xml:space="preserve">☐  Gagal</w:t>
+            </w:r>
+          </w:p>
+        </w:tc>
+        <w:tc>
+          <w:tcPr>
+            <w:tcW w:type="dxa" w:w="1800"/>
+            <w:tcBorders>
+              <w:top w:val="single" w:color="C9D3DD" w:sz="4"/>
+              <w:left w:val="single" w:color="C9D3DD" w:sz="4"/>
+              <w:bottom w:val="single" w:color="C9D3DD" w:sz="4"/>
+              <w:right w:val="single" w:color="C9D3DD" w:sz="4"/>
+            </w:tcBorders>
+            <w:tcMar>
+              <w:top w:type="dxa" w:w="70"/>
+              <w:left w:type="dxa" w:w="110"/>
+              <w:bottom w:type="dxa" w:w="70"/>
+              <w:right w:type="dxa" w:w="110"/>
+            </w:tcMar>
+            <w:vAlign w:val="center"/>
+          </w:tcPr>
+          <w:p>
+            <w:pPr>
+              <w:jc w:val="left"/>
+            </w:pPr>
+            <w:r>
+              <w:rPr>
+                <w:rFonts w:ascii="Calibri" w:cs="Calibri" w:eastAsia="Calibri" w:hAnsi="Calibri"/>
+                <w:sz w:val="20"/>
+                <w:szCs w:val="20"/>
+              </w:rPr>
+              <w:t xml:space="preserve"/>
+            </w:r>
+          </w:p>
+        </w:tc>
+      </w:tr>
+      <w:tr>
+        <w:trPr>
+          <w:cantSplit/>
+        </w:trPr>
+        <w:tc>
+          <w:tcPr>
+            <w:tcW w:type="dxa" w:w="500"/>
+            <w:tcBorders>
+              <w:top w:val="single" w:color="C9D3DD" w:sz="4"/>
+              <w:left w:val="single" w:color="C9D3DD" w:sz="4"/>
+              <w:bottom w:val="single" w:color="C9D3DD" w:sz="4"/>
+              <w:right w:val="single" w:color="C9D3DD" w:sz="4"/>
+            </w:tcBorders>
+            <w:shd w:fill="F6F8FA" w:color="auto" w:val="clear"/>
+            <w:tcMar>
+              <w:top w:type="dxa" w:w="70"/>
+              <w:left w:type="dxa" w:w="110"/>
+              <w:bottom w:type="dxa" w:w="70"/>
+              <w:right w:type="dxa" w:w="110"/>
+            </w:tcMar>
+            <w:vAlign w:val="center"/>
+          </w:tcPr>
+          <w:p>
+            <w:pPr>
+              <w:jc w:val="center"/>
+            </w:pPr>
+            <w:r>
+              <w:rPr>
+                <w:rFonts w:ascii="Calibri" w:cs="Calibri" w:eastAsia="Calibri" w:hAnsi="Calibri"/>
+                <w:sz w:val="20"/>
+                <w:szCs w:val="20"/>
+              </w:rPr>
+              <w:t xml:space="preserve">19</w:t>
+            </w:r>
+          </w:p>
+        </w:tc>
+        <w:tc>
+          <w:tcPr>
+            <w:tcW w:type="dxa" w:w="1800"/>
+            <w:tcBorders>
+              <w:top w:val="single" w:color="C9D3DD" w:sz="4"/>
+              <w:left w:val="single" w:color="C9D3DD" w:sz="4"/>
+              <w:bottom w:val="single" w:color="C9D3DD" w:sz="4"/>
+              <w:right w:val="single" w:color="C9D3DD" w:sz="4"/>
+            </w:tcBorders>
+            <w:shd w:fill="F6F8FA" w:color="auto" w:val="clear"/>
+            <w:tcMar>
+              <w:top w:type="dxa" w:w="70"/>
+              <w:left w:type="dxa" w:w="110"/>
+              <w:bottom w:type="dxa" w:w="70"/>
+              <w:right w:type="dxa" w:w="110"/>
+            </w:tcMar>
+            <w:vAlign w:val="center"/>
+          </w:tcPr>
+          <w:p>
+            <w:pPr>
+              <w:jc w:val="left"/>
+            </w:pPr>
+            <w:r>
+              <w:rPr>
+                <w:rFonts w:ascii="Consolas" w:cs="Consolas" w:eastAsia="Consolas" w:hAnsi="Consolas"/>
+                <w:sz w:val="17"/>
+                <w:szCs w:val="17"/>
+              </w:rPr>
+              <w:t xml:space="preserve">marketing.staff@</w:t>
+            </w:r>
+          </w:p>
+        </w:tc>
+        <w:tc>
+          <w:tcPr>
+            <w:tcW w:type="dxa" w:w="4238"/>
+            <w:tcBorders>
+              <w:top w:val="single" w:color="C9D3DD" w:sz="4"/>
+              <w:left w:val="single" w:color="C9D3DD" w:sz="4"/>
+              <w:bottom w:val="single" w:color="C9D3DD" w:sz="4"/>
+              <w:right w:val="single" w:color="C9D3DD" w:sz="4"/>
+            </w:tcBorders>
+            <w:shd w:fill="F6F8FA" w:color="auto" w:val="clear"/>
+            <w:tcMar>
+              <w:top w:type="dxa" w:w="70"/>
+              <w:left w:type="dxa" w:w="110"/>
+              <w:bottom w:type="dxa" w:w="70"/>
+              <w:right w:type="dxa" w:w="110"/>
+            </w:tcMar>
+            <w:vAlign w:val="center"/>
+          </w:tcPr>
+          <w:p>
+            <w:pPr>
+              <w:jc w:val="left"/>
+            </w:pPr>
+            <w:r>
+              <w:rPr>
+                <w:rFonts w:ascii="Calibri" w:cs="Calibri" w:eastAsia="Calibri" w:hAnsi="Calibri"/>
+                <w:sz w:val="20"/>
+                <w:szCs w:val="20"/>
+              </w:rPr>
+              <w:t xml:space="preserve">Tambah catatan kedua tanpa mengubah progress → kedua catatan tampil, terbaru di atas.</w:t>
+            </w:r>
+          </w:p>
+        </w:tc>
+        <w:tc>
+          <w:tcPr>
+            <w:tcW w:type="dxa" w:w="1300"/>
+            <w:tcBorders>
+              <w:top w:val="single" w:color="C9D3DD" w:sz="4"/>
+              <w:left w:val="single" w:color="C9D3DD" w:sz="4"/>
+              <w:bottom w:val="single" w:color="C9D3DD" w:sz="4"/>
+              <w:right w:val="single" w:color="C9D3DD" w:sz="4"/>
+            </w:tcBorders>
+            <w:shd w:fill="F6F8FA" w:color="auto" w:val="clear"/>
+            <w:tcMar>
+              <w:top w:type="dxa" w:w="70"/>
+              <w:left w:type="dxa" w:w="110"/>
+              <w:bottom w:type="dxa" w:w="70"/>
+              <w:right w:type="dxa" w:w="110"/>
+            </w:tcMar>
+            <w:vAlign w:val="center"/>
+          </w:tcPr>
+          <w:p>
+            <w:pPr>
+              <w:jc w:val="left"/>
+            </w:pPr>
+            <w:r>
+              <w:rPr>
+                <w:rFonts w:ascii="Calibri" w:cs="Calibri" w:eastAsia="Calibri" w:hAnsi="Calibri"/>
+                <w:sz w:val="18"/>
+                <w:szCs w:val="18"/>
+              </w:rPr>
+              <w:t xml:space="preserve">☐  Lulus</w:t>
+            </w:r>
+          </w:p>
+          <w:p>
+            <w:pPr>
+              <w:jc w:val="left"/>
+            </w:pPr>
+            <w:r>
+              <w:rPr>
+                <w:rFonts w:ascii="Calibri" w:cs="Calibri" w:eastAsia="Calibri" w:hAnsi="Calibri"/>
+                <w:sz w:val="18"/>
+                <w:szCs w:val="18"/>
+              </w:rPr>
+              <w:t xml:space="preserve">☐  Gagal</w:t>
+            </w:r>
+          </w:p>
+        </w:tc>
+        <w:tc>
+          <w:tcPr>
+            <w:tcW w:type="dxa" w:w="1800"/>
+            <w:tcBorders>
+              <w:top w:val="single" w:color="C9D3DD" w:sz="4"/>
+              <w:left w:val="single" w:color="C9D3DD" w:sz="4"/>
+              <w:bottom w:val="single" w:color="C9D3DD" w:sz="4"/>
+              <w:right w:val="single" w:color="C9D3DD" w:sz="4"/>
+            </w:tcBorders>
+            <w:shd w:fill="F6F8FA" w:color="auto" w:val="clear"/>
+            <w:tcMar>
+              <w:top w:type="dxa" w:w="70"/>
+              <w:left w:type="dxa" w:w="110"/>
+              <w:bottom w:type="dxa" w:w="70"/>
+              <w:right w:type="dxa" w:w="110"/>
+            </w:tcMar>
+            <w:vAlign w:val="center"/>
+          </w:tcPr>
+          <w:p>
+            <w:pPr>
+              <w:jc w:val="left"/>
+            </w:pPr>
+            <w:r>
+              <w:rPr>
+                <w:rFonts w:ascii="Calibri" w:cs="Calibri" w:eastAsia="Calibri" w:hAnsi="Calibri"/>
+                <w:sz w:val="20"/>
+                <w:szCs w:val="20"/>
+              </w:rPr>
+              <w:t xml:space="preserve"/>
+            </w:r>
+          </w:p>
+        </w:tc>
+      </w:tr>
+      <w:tr>
+        <w:trPr>
+          <w:cantSplit/>
+        </w:trPr>
+        <w:tc>
+          <w:tcPr>
+            <w:tcW w:type="dxa" w:w="500"/>
+            <w:tcBorders>
+              <w:top w:val="single" w:color="C9D3DD" w:sz="4"/>
+              <w:left w:val="single" w:color="C9D3DD" w:sz="4"/>
+              <w:bottom w:val="single" w:color="C9D3DD" w:sz="4"/>
+              <w:right w:val="single" w:color="C9D3DD" w:sz="4"/>
+            </w:tcBorders>
+            <w:tcMar>
+              <w:top w:type="dxa" w:w="70"/>
+              <w:left w:type="dxa" w:w="110"/>
+              <w:bottom w:type="dxa" w:w="70"/>
+              <w:right w:type="dxa" w:w="110"/>
+            </w:tcMar>
+            <w:vAlign w:val="center"/>
+          </w:tcPr>
+          <w:p>
+            <w:pPr>
+              <w:jc w:val="center"/>
+            </w:pPr>
+            <w:r>
+              <w:rPr>
+                <w:rFonts w:ascii="Calibri" w:cs="Calibri" w:eastAsia="Calibri" w:hAnsi="Calibri"/>
+                <w:sz w:val="20"/>
+                <w:szCs w:val="20"/>
+              </w:rPr>
+              <w:t xml:space="preserve">20</w:t>
+            </w:r>
+          </w:p>
+        </w:tc>
+        <w:tc>
+          <w:tcPr>
+            <w:tcW w:type="dxa" w:w="1800"/>
+            <w:tcBorders>
+              <w:top w:val="single" w:color="C9D3DD" w:sz="4"/>
+              <w:left w:val="single" w:color="C9D3DD" w:sz="4"/>
+              <w:bottom w:val="single" w:color="C9D3DD" w:sz="4"/>
+              <w:right w:val="single" w:color="C9D3DD" w:sz="4"/>
+            </w:tcBorders>
+            <w:tcMar>
+              <w:top w:type="dxa" w:w="70"/>
+              <w:left w:type="dxa" w:w="110"/>
+              <w:bottom w:type="dxa" w:w="70"/>
+              <w:right w:type="dxa" w:w="110"/>
+            </w:tcMar>
+            <w:vAlign w:val="center"/>
+          </w:tcPr>
+          <w:p>
+            <w:pPr>
+              <w:jc w:val="left"/>
+            </w:pPr>
+            <w:r>
+              <w:rPr>
+                <w:rFonts w:ascii="Consolas" w:cs="Consolas" w:eastAsia="Consolas" w:hAnsi="Consolas"/>
+                <w:sz w:val="17"/>
+                <w:szCs w:val="17"/>
+              </w:rPr>
+              <w:t xml:space="preserve">marketing.staff@</w:t>
+            </w:r>
+          </w:p>
+        </w:tc>
+        <w:tc>
+          <w:tcPr>
+            <w:tcW w:type="dxa" w:w="4238"/>
+            <w:tcBorders>
+              <w:top w:val="single" w:color="C9D3DD" w:sz="4"/>
+              <w:left w:val="single" w:color="C9D3DD" w:sz="4"/>
+              <w:bottom w:val="single" w:color="C9D3DD" w:sz="4"/>
+              <w:right w:val="single" w:color="C9D3DD" w:sz="4"/>
+            </w:tcBorders>
+            <w:tcMar>
+              <w:top w:type="dxa" w:w="70"/>
+              <w:left w:type="dxa" w:w="110"/>
+              <w:bottom w:type="dxa" w:w="70"/>
+              <w:right w:type="dxa" w:w="110"/>
+            </w:tcMar>
+            <w:vAlign w:val="center"/>
+          </w:tcPr>
+          <w:p>
+            <w:pPr>
+              <w:jc w:val="left"/>
+            </w:pPr>
+            <w:r>
+              <w:rPr>
+                <w:rFonts w:ascii="Calibri" w:cs="Calibri" w:eastAsia="Calibri" w:hAnsi="Calibri"/>
+                <w:sz w:val="20"/>
+                <w:szCs w:val="20"/>
+              </w:rPr>
+              <w:t xml:space="preserve">Edit teks catatan sendiri (muncul tanda "diedit"), tambah/hapus lampiran catatan, lalu hapus catatan → progress planning tidak berubah.</w:t>
+            </w:r>
+          </w:p>
+        </w:tc>
+        <w:tc>
+          <w:tcPr>
+            <w:tcW w:type="dxa" w:w="1300"/>
+            <w:tcBorders>
+              <w:top w:val="single" w:color="C9D3DD" w:sz="4"/>
+              <w:left w:val="single" w:color="C9D3DD" w:sz="4"/>
+              <w:bottom w:val="single" w:color="C9D3DD" w:sz="4"/>
+              <w:right w:val="single" w:color="C9D3DD" w:sz="4"/>
+            </w:tcBorders>
+            <w:tcMar>
+              <w:top w:type="dxa" w:w="70"/>
+              <w:left w:type="dxa" w:w="110"/>
+              <w:bottom w:type="dxa" w:w="70"/>
+              <w:right w:type="dxa" w:w="110"/>
+            </w:tcMar>
+            <w:vAlign w:val="center"/>
+          </w:tcPr>
+          <w:p>
+            <w:pPr>
+              <w:jc w:val="left"/>
+            </w:pPr>
+            <w:r>
+              <w:rPr>
+                <w:rFonts w:ascii="Calibri" w:cs="Calibri" w:eastAsia="Calibri" w:hAnsi="Calibri"/>
+                <w:sz w:val="18"/>
+                <w:szCs w:val="18"/>
+              </w:rPr>
+              <w:t xml:space="preserve">☐  Lulus</w:t>
+            </w:r>
+          </w:p>
+          <w:p>
+            <w:pPr>
+              <w:jc w:val="left"/>
+            </w:pPr>
+            <w:r>
+              <w:rPr>
+                <w:rFonts w:ascii="Calibri" w:cs="Calibri" w:eastAsia="Calibri" w:hAnsi="Calibri"/>
+                <w:sz w:val="18"/>
+                <w:szCs w:val="18"/>
+              </w:rPr>
+              <w:t xml:space="preserve">☐  Gagal</w:t>
+            </w:r>
+          </w:p>
+        </w:tc>
+        <w:tc>
+          <w:tcPr>
+            <w:tcW w:type="dxa" w:w="1800"/>
+            <w:tcBorders>
+              <w:top w:val="single" w:color="C9D3DD" w:sz="4"/>
+              <w:left w:val="single" w:color="C9D3DD" w:sz="4"/>
+              <w:bottom w:val="single" w:color="C9D3DD" w:sz="4"/>
+              <w:right w:val="single" w:color="C9D3DD" w:sz="4"/>
+            </w:tcBorders>
+            <w:tcMar>
+              <w:top w:type="dxa" w:w="70"/>
+              <w:left w:type="dxa" w:w="110"/>
+              <w:bottom w:type="dxa" w:w="70"/>
+              <w:right w:type="dxa" w:w="110"/>
+            </w:tcMar>
+            <w:vAlign w:val="center"/>
+          </w:tcPr>
+          <w:p>
+            <w:pPr>
+              <w:jc w:val="left"/>
+            </w:pPr>
+            <w:r>
+              <w:rPr>
+                <w:rFonts w:ascii="Calibri" w:cs="Calibri" w:eastAsia="Calibri" w:hAnsi="Calibri"/>
+                <w:sz w:val="20"/>
+                <w:szCs w:val="20"/>
+              </w:rPr>
+              <w:t xml:space="preserve"/>
+            </w:r>
+          </w:p>
+        </w:tc>
+      </w:tr>
+      <w:tr>
+        <w:trPr>
+          <w:cantSplit/>
+        </w:trPr>
+        <w:tc>
+          <w:tcPr>
+            <w:tcW w:type="dxa" w:w="500"/>
+            <w:tcBorders>
+              <w:top w:val="single" w:color="C9D3DD" w:sz="4"/>
+              <w:left w:val="single" w:color="C9D3DD" w:sz="4"/>
+              <w:bottom w:val="single" w:color="C9D3DD" w:sz="4"/>
+              <w:right w:val="single" w:color="C9D3DD" w:sz="4"/>
+            </w:tcBorders>
+            <w:shd w:fill="F6F8FA" w:color="auto" w:val="clear"/>
+            <w:tcMar>
+              <w:top w:type="dxa" w:w="70"/>
+              <w:left w:type="dxa" w:w="110"/>
+              <w:bottom w:type="dxa" w:w="70"/>
+              <w:right w:type="dxa" w:w="110"/>
+            </w:tcMar>
+            <w:vAlign w:val="center"/>
+          </w:tcPr>
+          <w:p>
+            <w:pPr>
+              <w:jc w:val="center"/>
+            </w:pPr>
+            <w:r>
+              <w:rPr>
+                <w:rFonts w:ascii="Calibri" w:cs="Calibri" w:eastAsia="Calibri" w:hAnsi="Calibri"/>
+                <w:sz w:val="20"/>
+                <w:szCs w:val="20"/>
+              </w:rPr>
+              <w:t xml:space="preserve">21</w:t>
+            </w:r>
+          </w:p>
+        </w:tc>
+        <w:tc>
+          <w:tcPr>
+            <w:tcW w:type="dxa" w:w="1800"/>
+            <w:tcBorders>
+              <w:top w:val="single" w:color="C9D3DD" w:sz="4"/>
+              <w:left w:val="single" w:color="C9D3DD" w:sz="4"/>
+              <w:bottom w:val="single" w:color="C9D3DD" w:sz="4"/>
+              <w:right w:val="single" w:color="C9D3DD" w:sz="4"/>
+            </w:tcBorders>
+            <w:shd w:fill="F6F8FA" w:color="auto" w:val="clear"/>
+            <w:tcMar>
+              <w:top w:type="dxa" w:w="70"/>
+              <w:left w:type="dxa" w:w="110"/>
+              <w:bottom w:type="dxa" w:w="70"/>
+              <w:right w:type="dxa" w:w="110"/>
+            </w:tcMar>
+            <w:vAlign w:val="center"/>
+          </w:tcPr>
+          <w:p>
+            <w:pPr>
+              <w:jc w:val="left"/>
+            </w:pPr>
+            <w:r>
+              <w:rPr>
+                <w:rFonts w:ascii="Consolas" w:cs="Consolas" w:eastAsia="Consolas" w:hAnsi="Consolas"/>
+                <w:sz w:val="17"/>
+                <w:szCs w:val="17"/>
+              </w:rPr>
+              <w:t xml:space="preserve">marketing.staff@</w:t>
+            </w:r>
+          </w:p>
+        </w:tc>
+        <w:tc>
+          <w:tcPr>
+            <w:tcW w:type="dxa" w:w="4238"/>
+            <w:tcBorders>
+              <w:top w:val="single" w:color="C9D3DD" w:sz="4"/>
+              <w:left w:val="single" w:color="C9D3DD" w:sz="4"/>
+              <w:bottom w:val="single" w:color="C9D3DD" w:sz="4"/>
+              <w:right w:val="single" w:color="C9D3DD" w:sz="4"/>
+            </w:tcBorders>
+            <w:shd w:fill="F6F8FA" w:color="auto" w:val="clear"/>
+            <w:tcMar>
+              <w:top w:type="dxa" w:w="70"/>
+              <w:left w:type="dxa" w:w="110"/>
+              <w:bottom w:type="dxa" w:w="70"/>
+              <w:right w:type="dxa" w:w="110"/>
+            </w:tcMar>
+            <w:vAlign w:val="center"/>
+          </w:tcPr>
+          <w:p>
+            <w:pPr>
+              <w:jc w:val="left"/>
+            </w:pPr>
+            <w:r>
+              <w:rPr>
+                <w:rFonts w:ascii="Calibri" w:cs="Calibri" w:eastAsia="Calibri" w:hAnsi="Calibri"/>
+                <w:sz w:val="20"/>
+                <w:szCs w:val="20"/>
+              </w:rPr>
+              <w:t xml:space="preserve">Catatan milik orang lain (mis. lead) tidak punya tombol edit/hapus.</w:t>
+            </w:r>
+          </w:p>
+        </w:tc>
+        <w:tc>
+          <w:tcPr>
+            <w:tcW w:type="dxa" w:w="1300"/>
+            <w:tcBorders>
+              <w:top w:val="single" w:color="C9D3DD" w:sz="4"/>
+              <w:left w:val="single" w:color="C9D3DD" w:sz="4"/>
+              <w:bottom w:val="single" w:color="C9D3DD" w:sz="4"/>
+              <w:right w:val="single" w:color="C9D3DD" w:sz="4"/>
+            </w:tcBorders>
+            <w:shd w:fill="F6F8FA" w:color="auto" w:val="clear"/>
+            <w:tcMar>
+              <w:top w:type="dxa" w:w="70"/>
+              <w:left w:type="dxa" w:w="110"/>
+              <w:bottom w:type="dxa" w:w="70"/>
+              <w:right w:type="dxa" w:w="110"/>
+            </w:tcMar>
+            <w:vAlign w:val="center"/>
+          </w:tcPr>
+          <w:p>
+            <w:pPr>
+              <w:jc w:val="left"/>
+            </w:pPr>
+            <w:r>
+              <w:rPr>
+                <w:rFonts w:ascii="Calibri" w:cs="Calibri" w:eastAsia="Calibri" w:hAnsi="Calibri"/>
+                <w:sz w:val="18"/>
+                <w:szCs w:val="18"/>
+              </w:rPr>
+              <w:t xml:space="preserve">☐  Lulus</w:t>
+            </w:r>
+          </w:p>
+          <w:p>
+            <w:pPr>
+              <w:jc w:val="left"/>
+            </w:pPr>
+            <w:r>
+              <w:rPr>
+                <w:rFonts w:ascii="Calibri" w:cs="Calibri" w:eastAsia="Calibri" w:hAnsi="Calibri"/>
+                <w:sz w:val="18"/>
+                <w:szCs w:val="18"/>
+              </w:rPr>
+              <w:t xml:space="preserve">☐  Gagal</w:t>
+            </w:r>
+          </w:p>
+        </w:tc>
+        <w:tc>
+          <w:tcPr>
+            <w:tcW w:type="dxa" w:w="1800"/>
+            <w:tcBorders>
+              <w:top w:val="single" w:color="C9D3DD" w:sz="4"/>
+              <w:left w:val="single" w:color="C9D3DD" w:sz="4"/>
+              <w:bottom w:val="single" w:color="C9D3DD" w:sz="4"/>
+              <w:right w:val="single" w:color="C9D3DD" w:sz="4"/>
+            </w:tcBorders>
+            <w:shd w:fill="F6F8FA" w:color="auto" w:val="clear"/>
+            <w:tcMar>
+              <w:top w:type="dxa" w:w="70"/>
+              <w:left w:type="dxa" w:w="110"/>
+              <w:bottom w:type="dxa" w:w="70"/>
+              <w:right w:type="dxa" w:w="110"/>
+            </w:tcMar>
+            <w:vAlign w:val="center"/>
+          </w:tcPr>
+          <w:p>
+            <w:pPr>
+              <w:jc w:val="left"/>
+            </w:pPr>
+            <w:r>
+              <w:rPr>
+                <w:rFonts w:ascii="Calibri" w:cs="Calibri" w:eastAsia="Calibri" w:hAnsi="Calibri"/>
+                <w:sz w:val="20"/>
+                <w:szCs w:val="20"/>
+              </w:rPr>
+              <w:t xml:space="preserve"/>
+            </w:r>
+          </w:p>
+        </w:tc>
+      </w:tr>
+      <w:tr>
+        <w:trPr>
+          <w:cantSplit/>
+        </w:trPr>
+        <w:tc>
+          <w:tcPr>
+            <w:tcW w:type="dxa" w:w="500"/>
+            <w:tcBorders>
+              <w:top w:val="single" w:color="C9D3DD" w:sz="4"/>
+              <w:left w:val="single" w:color="C9D3DD" w:sz="4"/>
+              <w:bottom w:val="single" w:color="C9D3DD" w:sz="4"/>
+              <w:right w:val="single" w:color="C9D3DD" w:sz="4"/>
+            </w:tcBorders>
+            <w:tcMar>
+              <w:top w:type="dxa" w:w="70"/>
+              <w:left w:type="dxa" w:w="110"/>
+              <w:bottom w:type="dxa" w:w="70"/>
+              <w:right w:type="dxa" w:w="110"/>
+            </w:tcMar>
+            <w:vAlign w:val="center"/>
+          </w:tcPr>
+          <w:p>
+            <w:pPr>
+              <w:jc w:val="center"/>
+            </w:pPr>
+            <w:r>
+              <w:rPr>
+                <w:rFonts w:ascii="Calibri" w:cs="Calibri" w:eastAsia="Calibri" w:hAnsi="Calibri"/>
+                <w:sz w:val="20"/>
+                <w:szCs w:val="20"/>
+              </w:rPr>
+              <w:t xml:space="preserve">22</w:t>
+            </w:r>
+          </w:p>
+        </w:tc>
+        <w:tc>
+          <w:tcPr>
+            <w:tcW w:type="dxa" w:w="1800"/>
+            <w:tcBorders>
+              <w:top w:val="single" w:color="C9D3DD" w:sz="4"/>
+              <w:left w:val="single" w:color="C9D3DD" w:sz="4"/>
+              <w:bottom w:val="single" w:color="C9D3DD" w:sz="4"/>
+              <w:right w:val="single" w:color="C9D3DD" w:sz="4"/>
+            </w:tcBorders>
+            <w:tcMar>
+              <w:top w:type="dxa" w:w="70"/>
+              <w:left w:type="dxa" w:w="110"/>
+              <w:bottom w:type="dxa" w:w="70"/>
+              <w:right w:type="dxa" w:w="110"/>
+            </w:tcMar>
+            <w:vAlign w:val="center"/>
+          </w:tcPr>
+          <w:p>
+            <w:pPr>
+              <w:jc w:val="left"/>
+            </w:pPr>
+            <w:r>
+              <w:rPr>
+                <w:rFonts w:ascii="Consolas" w:cs="Consolas" w:eastAsia="Consolas" w:hAnsi="Consolas"/>
+                <w:sz w:val="17"/>
+                <w:szCs w:val="17"/>
+              </w:rPr>
+              <w:t xml:space="preserve">marketing@</w:t>
+            </w:r>
+          </w:p>
+        </w:tc>
+        <w:tc>
+          <w:tcPr>
+            <w:tcW w:type="dxa" w:w="4238"/>
+            <w:tcBorders>
+              <w:top w:val="single" w:color="C9D3DD" w:sz="4"/>
+              <w:left w:val="single" w:color="C9D3DD" w:sz="4"/>
+              <w:bottom w:val="single" w:color="C9D3DD" w:sz="4"/>
+              <w:right w:val="single" w:color="C9D3DD" w:sz="4"/>
+            </w:tcBorders>
+            <w:tcMar>
+              <w:top w:type="dxa" w:w="70"/>
+              <w:left w:type="dxa" w:w="110"/>
+              <w:bottom w:type="dxa" w:w="70"/>
+              <w:right w:type="dxa" w:w="110"/>
+            </w:tcMar>
+            <w:vAlign w:val="center"/>
+          </w:tcPr>
+          <w:p>
+            <w:pPr>
+              <w:jc w:val="left"/>
+            </w:pPr>
+            <w:r>
+              <w:rPr>
+                <w:rFonts w:ascii="Calibri" w:cs="Calibri" w:eastAsia="Calibri" w:hAnsi="Calibri"/>
+                <w:sz w:val="20"/>
+                <w:szCs w:val="20"/>
+              </w:rPr>
+              <w:t xml:space="preserve">Lead bisa edit dan hapus catatan siapa pun di planning divisinya.</w:t>
+            </w:r>
+          </w:p>
+        </w:tc>
+        <w:tc>
+          <w:tcPr>
+            <w:tcW w:type="dxa" w:w="1300"/>
+            <w:tcBorders>
+              <w:top w:val="single" w:color="C9D3DD" w:sz="4"/>
+              <w:left w:val="single" w:color="C9D3DD" w:sz="4"/>
+              <w:bottom w:val="single" w:color="C9D3DD" w:sz="4"/>
+              <w:right w:val="single" w:color="C9D3DD" w:sz="4"/>
+            </w:tcBorders>
+            <w:tcMar>
+              <w:top w:type="dxa" w:w="70"/>
+              <w:left w:type="dxa" w:w="110"/>
+              <w:bottom w:type="dxa" w:w="70"/>
+              <w:right w:type="dxa" w:w="110"/>
+            </w:tcMar>
+            <w:vAlign w:val="center"/>
+          </w:tcPr>
+          <w:p>
+            <w:pPr>
+              <w:jc w:val="left"/>
+            </w:pPr>
+            <w:r>
+              <w:rPr>
+                <w:rFonts w:ascii="Calibri" w:cs="Calibri" w:eastAsia="Calibri" w:hAnsi="Calibri"/>
+                <w:sz w:val="18"/>
+                <w:szCs w:val="18"/>
+              </w:rPr>
+              <w:t xml:space="preserve">☐  Lulus</w:t>
+            </w:r>
+          </w:p>
+          <w:p>
+            <w:pPr>
+              <w:jc w:val="left"/>
+            </w:pPr>
+            <w:r>
+              <w:rPr>
+                <w:rFonts w:ascii="Calibri" w:cs="Calibri" w:eastAsia="Calibri" w:hAnsi="Calibri"/>
+                <w:sz w:val="18"/>
+                <w:szCs w:val="18"/>
+              </w:rPr>
+              <w:t xml:space="preserve">☐  Gagal</w:t>
+            </w:r>
+          </w:p>
+        </w:tc>
+        <w:tc>
+          <w:tcPr>
+            <w:tcW w:type="dxa" w:w="1800"/>
+            <w:tcBorders>
+              <w:top w:val="single" w:color="C9D3DD" w:sz="4"/>
+              <w:left w:val="single" w:color="C9D3DD" w:sz="4"/>
+              <w:bottom w:val="single" w:color="C9D3DD" w:sz="4"/>
+              <w:right w:val="single" w:color="C9D3DD" w:sz="4"/>
+            </w:tcBorders>
+            <w:tcMar>
+              <w:top w:type="dxa" w:w="70"/>
+              <w:left w:type="dxa" w:w="110"/>
+              <w:bottom w:type="dxa" w:w="70"/>
+              <w:right w:type="dxa" w:w="110"/>
+            </w:tcMar>
+            <w:vAlign w:val="center"/>
+          </w:tcPr>
+          <w:p>
+            <w:pPr>
+              <w:jc w:val="left"/>
+            </w:pPr>
+            <w:r>
+              <w:rPr>
+                <w:rFonts w:ascii="Calibri" w:cs="Calibri" w:eastAsia="Calibri" w:hAnsi="Calibri"/>
+                <w:sz w:val="20"/>
+                <w:szCs w:val="20"/>
+              </w:rPr>
+              <w:t xml:space="preserve"/>
+            </w:r>
+          </w:p>
+        </w:tc>
+      </w:tr>
+    </w:tbl>
+    <w:p>
+      <w:pPr>
+        <w:pStyle w:val="Heading2"/>
+        <w:keepNext/>
+        <w:spacing w:after="120" w:before="280"/>
+      </w:pPr>
+      <w:r>
+        <w:rPr>
+          <w:rFonts w:ascii="Calibri" w:cs="Calibri" w:eastAsia="Calibri" w:hAnsi="Calibri"/>
+          <w:b/>
+          <w:bCs/>
+          <w:color w:val="0096CF"/>
+          <w:sz w:val="24"/>
+          <w:szCs w:val="24"/>
+        </w:rPr>
         <w:t xml:space="preserve">Planning — Lampiran &amp; Filter</w:t>
       </w:r>
     </w:p>
@@ -9423,7 +10869,7 @@
                 <w:sz w:val="20"/>
                 <w:szCs w:val="20"/>
               </w:rPr>
-              <w:t xml:space="preserve">16</w:t>
+              <w:t xml:space="preserve">23</w:t>
             </w:r>
           </w:p>
         </w:tc>
@@ -9598,7 +11044,7 @@
                 <w:sz w:val="20"/>
                 <w:szCs w:val="20"/>
               </w:rPr>
-              <w:t xml:space="preserve">17</w:t>
+              <w:t xml:space="preserve">24</w:t>
             </w:r>
           </w:p>
         </w:tc>
@@ -9776,7 +11222,7 @@
                 <w:sz w:val="20"/>
                 <w:szCs w:val="20"/>
               </w:rPr>
-              <w:t xml:space="preserve">18</w:t>
+              <w:t xml:space="preserve">25</w:t>
             </w:r>
           </w:p>
         </w:tc>
@@ -9951,7 +11397,7 @@
                 <w:sz w:val="20"/>
                 <w:szCs w:val="20"/>
               </w:rPr>
-              <w:t xml:space="preserve">19</w:t>
+              <w:t xml:space="preserve">26</w:t>
             </w:r>
           </w:p>
         </w:tc>
@@ -10348,7 +11794,7 @@
                 <w:sz w:val="20"/>
                 <w:szCs w:val="20"/>
               </w:rPr>
-              <w:t xml:space="preserve">20</w:t>
+              <w:t xml:space="preserve">27</w:t>
             </w:r>
           </w:p>
         </w:tc>
@@ -10410,7 +11856,7 @@
                 <w:sz w:val="20"/>
                 <w:szCs w:val="20"/>
               </w:rPr>
-              <w:t xml:space="preserve">Klik "+ Tambah meeting": dropdown Planning berisi "Tanpa planning (meeting dadakan)" dan planning divisi Marketing.</w:t>
+              <w:t xml:space="preserve">Tombol "+ Tambah meeting" tidak ada; meeting divisi Marketing tetap terlihat.</w:t>
             </w:r>
           </w:p>
         </w:tc>
@@ -10522,7 +11968,7 @@
                 <w:sz w:val="20"/>
                 <w:szCs w:val="20"/>
               </w:rPr>
-              <w:t xml:space="preserve">21</w:t>
+              <w:t xml:space="preserve">28</w:t>
             </w:r>
           </w:p>
         </w:tc>
@@ -10554,7 +12000,7 @@
                 <w:sz w:val="17"/>
                 <w:szCs w:val="17"/>
               </w:rPr>
-              <w:t xml:space="preserve">marketing.staff@</w:t>
+              <w:t xml:space="preserve">marketing@</w:t>
             </w:r>
           </w:p>
         </w:tc>
@@ -10586,7 +12032,7 @@
                 <w:sz w:val="20"/>
                 <w:szCs w:val="20"/>
               </w:rPr>
-              <w:t xml:space="preserve">Buat meeting tanpa planning (dadakan) dengan peserta dari divisi lain (mis. PPIC). Nomor otomatis MTG-YYYYMM-xxxx.</w:t>
+              <w:t xml:space="preserve">Klik "+ Tambah meeting": isi Judul meeting (wajib); dropdown Planning berisi "Tanpa planning (meeting dadakan)" dan planning divisi Marketing.</w:t>
             </w:r>
           </w:p>
         </w:tc>
@@ -10699,7 +12145,7 @@
                 <w:sz w:val="20"/>
                 <w:szCs w:val="20"/>
               </w:rPr>
-              <w:t xml:space="preserve">22</w:t>
+              <w:t xml:space="preserve">29</w:t>
             </w:r>
           </w:p>
         </w:tc>
@@ -10730,7 +12176,7 @@
                 <w:sz w:val="17"/>
                 <w:szCs w:val="17"/>
               </w:rPr>
-              <w:t xml:space="preserve">marketing.staff@</w:t>
+              <w:t xml:space="preserve">marketing@</w:t>
             </w:r>
           </w:p>
         </w:tc>
@@ -10761,7 +12207,7 @@
                 <w:sz w:val="20"/>
                 <w:szCs w:val="20"/>
               </w:rPr>
-              <w:t xml:space="preserve">Buat meeting yang terhubung ke planning; tempat diisi link (https://...) → tampil sebagai link yang bisa diklik.</w:t>
+              <w:t xml:space="preserve">Buat meeting tanpa planning (dadakan) dengan peserta dari divisi lain (mis. PPIC); deskripsi boleh kosong. Nomor otomatis MTG-YYYYMM-xxxx.</w:t>
             </w:r>
           </w:p>
         </w:tc>
@@ -10873,7 +12319,7 @@
                 <w:sz w:val="20"/>
                 <w:szCs w:val="20"/>
               </w:rPr>
-              <w:t xml:space="preserve">23</w:t>
+              <w:t xml:space="preserve">30</w:t>
             </w:r>
           </w:p>
         </w:tc>
@@ -10905,7 +12351,7 @@
                 <w:sz w:val="17"/>
                 <w:szCs w:val="17"/>
               </w:rPr>
-              <w:t xml:space="preserve">ppic.staff@</w:t>
+              <w:t xml:space="preserve">marketing@</w:t>
             </w:r>
           </w:p>
         </w:tc>
@@ -10937,7 +12383,7 @@
                 <w:sz w:val="20"/>
                 <w:szCs w:val="20"/>
               </w:rPr>
-              <w:t xml:space="preserve">Meeting Marketing yang diikuti terlihat; meeting Marketing lain tidak terlihat.</w:t>
+              <w:t xml:space="preserve">Buat meeting yang terhubung ke planning; tempat diisi link (https://...) → tampil sebagai link yang bisa diklik.</w:t>
             </w:r>
           </w:p>
         </w:tc>
@@ -11050,7 +12496,7 @@
                 <w:sz w:val="20"/>
                 <w:szCs w:val="20"/>
               </w:rPr>
-              <w:t xml:space="preserve">24</w:t>
+              <w:t xml:space="preserve">31</w:t>
             </w:r>
           </w:p>
         </w:tc>
@@ -11081,7 +12527,7 @@
                 <w:sz w:val="17"/>
                 <w:szCs w:val="17"/>
               </w:rPr>
-              <w:t xml:space="preserve">ppic.staff@</w:t>
+              <w:t xml:space="preserve">marketing@</w:t>
             </w:r>
           </w:p>
         </w:tc>
@@ -11112,7 +12558,7 @@
                 <w:sz w:val="20"/>
                 <w:szCs w:val="20"/>
               </w:rPr>
-              <w:t xml:space="preserve">Sebagai peserta: bisa isi Hasil meeting &amp; ubah status; tombol Edit/Hapus tidak ada.</w:t>
+              <w:t xml:space="preserve">Simpan tanpa judul → ditolak.</w:t>
             </w:r>
           </w:p>
         </w:tc>
@@ -11224,7 +12670,7 @@
                 <w:sz w:val="20"/>
                 <w:szCs w:val="20"/>
               </w:rPr>
-              <w:t xml:space="preserve">25</w:t>
+              <w:t xml:space="preserve">32</w:t>
             </w:r>
           </w:p>
         </w:tc>
@@ -11256,7 +12702,7 @@
                 <w:sz w:val="17"/>
                 <w:szCs w:val="17"/>
               </w:rPr>
-              <w:t xml:space="preserve">teknik.staff@</w:t>
+              <w:t xml:space="preserve">ppic.staff@</w:t>
             </w:r>
           </w:p>
         </w:tc>
@@ -11288,7 +12734,7 @@
                 <w:sz w:val="20"/>
                 <w:szCs w:val="20"/>
               </w:rPr>
-              <w:t xml:space="preserve">Bukan peserta &amp; beda divisi → meeting Marketing tidak terlihat.</w:t>
+              <w:t xml:space="preserve">Meeting Marketing yang diikuti terlihat; meeting Marketing lain tidak terlihat.</w:t>
             </w:r>
           </w:p>
         </w:tc>
@@ -11401,7 +12847,7 @@
                 <w:sz w:val="20"/>
                 <w:szCs w:val="20"/>
               </w:rPr>
-              <w:t xml:space="preserve">26</w:t>
+              <w:t xml:space="preserve">33</w:t>
             </w:r>
           </w:p>
         </w:tc>
@@ -11432,7 +12878,7 @@
                 <w:sz w:val="17"/>
                 <w:szCs w:val="17"/>
               </w:rPr>
-              <w:t xml:space="preserve">marketing@</w:t>
+              <w:t xml:space="preserve">ppic.staff@</w:t>
             </w:r>
           </w:p>
         </w:tc>
@@ -11463,7 +12909,7 @@
                 <w:sz w:val="20"/>
                 <w:szCs w:val="20"/>
               </w:rPr>
-              <w:t xml:space="preserve">Lead bisa edit (ganti peserta, lepas planning) dan hapus meeting buatan staff divisinya.</w:t>
+              <w:t xml:space="preserve">Sebagai peserta: bisa isi Hasil meeting &amp; ubah status; tombol Edit/Hapus tidak ada.</w:t>
             </w:r>
           </w:p>
         </w:tc>
@@ -11575,7 +13021,7 @@
                 <w:sz w:val="20"/>
                 <w:szCs w:val="20"/>
               </w:rPr>
-              <w:t xml:space="preserve">27</w:t>
+              <w:t xml:space="preserve">34</w:t>
             </w:r>
           </w:p>
         </w:tc>
@@ -11607,6 +13053,357 @@
                 <w:sz w:val="17"/>
                 <w:szCs w:val="17"/>
               </w:rPr>
+              <w:t xml:space="preserve">teknik.staff@</w:t>
+            </w:r>
+          </w:p>
+        </w:tc>
+        <w:tc>
+          <w:tcPr>
+            <w:tcW w:type="dxa" w:w="4238"/>
+            <w:tcBorders>
+              <w:top w:val="single" w:color="C9D3DD" w:sz="4"/>
+              <w:left w:val="single" w:color="C9D3DD" w:sz="4"/>
+              <w:bottom w:val="single" w:color="C9D3DD" w:sz="4"/>
+              <w:right w:val="single" w:color="C9D3DD" w:sz="4"/>
+            </w:tcBorders>
+            <w:shd w:fill="F6F8FA" w:color="auto" w:val="clear"/>
+            <w:tcMar>
+              <w:top w:type="dxa" w:w="70"/>
+              <w:left w:type="dxa" w:w="110"/>
+              <w:bottom w:type="dxa" w:w="70"/>
+              <w:right w:type="dxa" w:w="110"/>
+            </w:tcMar>
+            <w:vAlign w:val="center"/>
+          </w:tcPr>
+          <w:p>
+            <w:pPr>
+              <w:jc w:val="left"/>
+            </w:pPr>
+            <w:r>
+              <w:rPr>
+                <w:rFonts w:ascii="Calibri" w:cs="Calibri" w:eastAsia="Calibri" w:hAnsi="Calibri"/>
+                <w:sz w:val="20"/>
+                <w:szCs w:val="20"/>
+              </w:rPr>
+              <w:t xml:space="preserve">Bukan peserta &amp; beda divisi → meeting Marketing tidak terlihat.</w:t>
+            </w:r>
+          </w:p>
+        </w:tc>
+        <w:tc>
+          <w:tcPr>
+            <w:tcW w:type="dxa" w:w="1300"/>
+            <w:tcBorders>
+              <w:top w:val="single" w:color="C9D3DD" w:sz="4"/>
+              <w:left w:val="single" w:color="C9D3DD" w:sz="4"/>
+              <w:bottom w:val="single" w:color="C9D3DD" w:sz="4"/>
+              <w:right w:val="single" w:color="C9D3DD" w:sz="4"/>
+            </w:tcBorders>
+            <w:shd w:fill="F6F8FA" w:color="auto" w:val="clear"/>
+            <w:tcMar>
+              <w:top w:type="dxa" w:w="70"/>
+              <w:left w:type="dxa" w:w="110"/>
+              <w:bottom w:type="dxa" w:w="70"/>
+              <w:right w:type="dxa" w:w="110"/>
+            </w:tcMar>
+            <w:vAlign w:val="center"/>
+          </w:tcPr>
+          <w:p>
+            <w:pPr>
+              <w:jc w:val="left"/>
+            </w:pPr>
+            <w:r>
+              <w:rPr>
+                <w:rFonts w:ascii="Calibri" w:cs="Calibri" w:eastAsia="Calibri" w:hAnsi="Calibri"/>
+                <w:sz w:val="18"/>
+                <w:szCs w:val="18"/>
+              </w:rPr>
+              <w:t xml:space="preserve">☐  Lulus</w:t>
+            </w:r>
+          </w:p>
+          <w:p>
+            <w:pPr>
+              <w:jc w:val="left"/>
+            </w:pPr>
+            <w:r>
+              <w:rPr>
+                <w:rFonts w:ascii="Calibri" w:cs="Calibri" w:eastAsia="Calibri" w:hAnsi="Calibri"/>
+                <w:sz w:val="18"/>
+                <w:szCs w:val="18"/>
+              </w:rPr>
+              <w:t xml:space="preserve">☐  Gagal</w:t>
+            </w:r>
+          </w:p>
+        </w:tc>
+        <w:tc>
+          <w:tcPr>
+            <w:tcW w:type="dxa" w:w="1800"/>
+            <w:tcBorders>
+              <w:top w:val="single" w:color="C9D3DD" w:sz="4"/>
+              <w:left w:val="single" w:color="C9D3DD" w:sz="4"/>
+              <w:bottom w:val="single" w:color="C9D3DD" w:sz="4"/>
+              <w:right w:val="single" w:color="C9D3DD" w:sz="4"/>
+            </w:tcBorders>
+            <w:shd w:fill="F6F8FA" w:color="auto" w:val="clear"/>
+            <w:tcMar>
+              <w:top w:type="dxa" w:w="70"/>
+              <w:left w:type="dxa" w:w="110"/>
+              <w:bottom w:type="dxa" w:w="70"/>
+              <w:right w:type="dxa" w:w="110"/>
+            </w:tcMar>
+            <w:vAlign w:val="center"/>
+          </w:tcPr>
+          <w:p>
+            <w:pPr>
+              <w:jc w:val="left"/>
+            </w:pPr>
+            <w:r>
+              <w:rPr>
+                <w:rFonts w:ascii="Calibri" w:cs="Calibri" w:eastAsia="Calibri" w:hAnsi="Calibri"/>
+                <w:sz w:val="20"/>
+                <w:szCs w:val="20"/>
+              </w:rPr>
+              <w:t xml:space="preserve"/>
+            </w:r>
+          </w:p>
+        </w:tc>
+      </w:tr>
+      <w:tr>
+        <w:trPr>
+          <w:cantSplit/>
+        </w:trPr>
+        <w:tc>
+          <w:tcPr>
+            <w:tcW w:type="dxa" w:w="500"/>
+            <w:tcBorders>
+              <w:top w:val="single" w:color="C9D3DD" w:sz="4"/>
+              <w:left w:val="single" w:color="C9D3DD" w:sz="4"/>
+              <w:bottom w:val="single" w:color="C9D3DD" w:sz="4"/>
+              <w:right w:val="single" w:color="C9D3DD" w:sz="4"/>
+            </w:tcBorders>
+            <w:tcMar>
+              <w:top w:type="dxa" w:w="70"/>
+              <w:left w:type="dxa" w:w="110"/>
+              <w:bottom w:type="dxa" w:w="70"/>
+              <w:right w:type="dxa" w:w="110"/>
+            </w:tcMar>
+            <w:vAlign w:val="center"/>
+          </w:tcPr>
+          <w:p>
+            <w:pPr>
+              <w:jc w:val="center"/>
+            </w:pPr>
+            <w:r>
+              <w:rPr>
+                <w:rFonts w:ascii="Calibri" w:cs="Calibri" w:eastAsia="Calibri" w:hAnsi="Calibri"/>
+                <w:sz w:val="20"/>
+                <w:szCs w:val="20"/>
+              </w:rPr>
+              <w:t xml:space="preserve">35</w:t>
+            </w:r>
+          </w:p>
+        </w:tc>
+        <w:tc>
+          <w:tcPr>
+            <w:tcW w:type="dxa" w:w="1800"/>
+            <w:tcBorders>
+              <w:top w:val="single" w:color="C9D3DD" w:sz="4"/>
+              <w:left w:val="single" w:color="C9D3DD" w:sz="4"/>
+              <w:bottom w:val="single" w:color="C9D3DD" w:sz="4"/>
+              <w:right w:val="single" w:color="C9D3DD" w:sz="4"/>
+            </w:tcBorders>
+            <w:tcMar>
+              <w:top w:type="dxa" w:w="70"/>
+              <w:left w:type="dxa" w:w="110"/>
+              <w:bottom w:type="dxa" w:w="70"/>
+              <w:right w:type="dxa" w:w="110"/>
+            </w:tcMar>
+            <w:vAlign w:val="center"/>
+          </w:tcPr>
+          <w:p>
+            <w:pPr>
+              <w:jc w:val="left"/>
+            </w:pPr>
+            <w:r>
+              <w:rPr>
+                <w:rFonts w:ascii="Consolas" w:cs="Consolas" w:eastAsia="Consolas" w:hAnsi="Consolas"/>
+                <w:sz w:val="17"/>
+                <w:szCs w:val="17"/>
+              </w:rPr>
+              <w:t xml:space="preserve">marketing@</w:t>
+            </w:r>
+          </w:p>
+        </w:tc>
+        <w:tc>
+          <w:tcPr>
+            <w:tcW w:type="dxa" w:w="4238"/>
+            <w:tcBorders>
+              <w:top w:val="single" w:color="C9D3DD" w:sz="4"/>
+              <w:left w:val="single" w:color="C9D3DD" w:sz="4"/>
+              <w:bottom w:val="single" w:color="C9D3DD" w:sz="4"/>
+              <w:right w:val="single" w:color="C9D3DD" w:sz="4"/>
+            </w:tcBorders>
+            <w:tcMar>
+              <w:top w:type="dxa" w:w="70"/>
+              <w:left w:type="dxa" w:w="110"/>
+              <w:bottom w:type="dxa" w:w="70"/>
+              <w:right w:type="dxa" w:w="110"/>
+            </w:tcMar>
+            <w:vAlign w:val="center"/>
+          </w:tcPr>
+          <w:p>
+            <w:pPr>
+              <w:jc w:val="left"/>
+            </w:pPr>
+            <w:r>
+              <w:rPr>
+                <w:rFonts w:ascii="Calibri" w:cs="Calibri" w:eastAsia="Calibri" w:hAnsi="Calibri"/>
+                <w:sz w:val="20"/>
+                <w:szCs w:val="20"/>
+              </w:rPr>
+              <w:t xml:space="preserve">Edit meeting (ganti judul, peserta, lepas planning) dan hapus meeting divisinya.</w:t>
+            </w:r>
+          </w:p>
+        </w:tc>
+        <w:tc>
+          <w:tcPr>
+            <w:tcW w:type="dxa" w:w="1300"/>
+            <w:tcBorders>
+              <w:top w:val="single" w:color="C9D3DD" w:sz="4"/>
+              <w:left w:val="single" w:color="C9D3DD" w:sz="4"/>
+              <w:bottom w:val="single" w:color="C9D3DD" w:sz="4"/>
+              <w:right w:val="single" w:color="C9D3DD" w:sz="4"/>
+            </w:tcBorders>
+            <w:tcMar>
+              <w:top w:type="dxa" w:w="70"/>
+              <w:left w:type="dxa" w:w="110"/>
+              <w:bottom w:type="dxa" w:w="70"/>
+              <w:right w:type="dxa" w:w="110"/>
+            </w:tcMar>
+            <w:vAlign w:val="center"/>
+          </w:tcPr>
+          <w:p>
+            <w:pPr>
+              <w:jc w:val="left"/>
+            </w:pPr>
+            <w:r>
+              <w:rPr>
+                <w:rFonts w:ascii="Calibri" w:cs="Calibri" w:eastAsia="Calibri" w:hAnsi="Calibri"/>
+                <w:sz w:val="18"/>
+                <w:szCs w:val="18"/>
+              </w:rPr>
+              <w:t xml:space="preserve">☐  Lulus</w:t>
+            </w:r>
+          </w:p>
+          <w:p>
+            <w:pPr>
+              <w:jc w:val="left"/>
+            </w:pPr>
+            <w:r>
+              <w:rPr>
+                <w:rFonts w:ascii="Calibri" w:cs="Calibri" w:eastAsia="Calibri" w:hAnsi="Calibri"/>
+                <w:sz w:val="18"/>
+                <w:szCs w:val="18"/>
+              </w:rPr>
+              <w:t xml:space="preserve">☐  Gagal</w:t>
+            </w:r>
+          </w:p>
+        </w:tc>
+        <w:tc>
+          <w:tcPr>
+            <w:tcW w:type="dxa" w:w="1800"/>
+            <w:tcBorders>
+              <w:top w:val="single" w:color="C9D3DD" w:sz="4"/>
+              <w:left w:val="single" w:color="C9D3DD" w:sz="4"/>
+              <w:bottom w:val="single" w:color="C9D3DD" w:sz="4"/>
+              <w:right w:val="single" w:color="C9D3DD" w:sz="4"/>
+            </w:tcBorders>
+            <w:tcMar>
+              <w:top w:type="dxa" w:w="70"/>
+              <w:left w:type="dxa" w:w="110"/>
+              <w:bottom w:type="dxa" w:w="70"/>
+              <w:right w:type="dxa" w:w="110"/>
+            </w:tcMar>
+            <w:vAlign w:val="center"/>
+          </w:tcPr>
+          <w:p>
+            <w:pPr>
+              <w:jc w:val="left"/>
+            </w:pPr>
+            <w:r>
+              <w:rPr>
+                <w:rFonts w:ascii="Calibri" w:cs="Calibri" w:eastAsia="Calibri" w:hAnsi="Calibri"/>
+                <w:sz w:val="20"/>
+                <w:szCs w:val="20"/>
+              </w:rPr>
+              <w:t xml:space="preserve"/>
+            </w:r>
+          </w:p>
+        </w:tc>
+      </w:tr>
+      <w:tr>
+        <w:trPr>
+          <w:cantSplit/>
+        </w:trPr>
+        <w:tc>
+          <w:tcPr>
+            <w:tcW w:type="dxa" w:w="500"/>
+            <w:tcBorders>
+              <w:top w:val="single" w:color="C9D3DD" w:sz="4"/>
+              <w:left w:val="single" w:color="C9D3DD" w:sz="4"/>
+              <w:bottom w:val="single" w:color="C9D3DD" w:sz="4"/>
+              <w:right w:val="single" w:color="C9D3DD" w:sz="4"/>
+            </w:tcBorders>
+            <w:shd w:fill="F6F8FA" w:color="auto" w:val="clear"/>
+            <w:tcMar>
+              <w:top w:type="dxa" w:w="70"/>
+              <w:left w:type="dxa" w:w="110"/>
+              <w:bottom w:type="dxa" w:w="70"/>
+              <w:right w:type="dxa" w:w="110"/>
+            </w:tcMar>
+            <w:vAlign w:val="center"/>
+          </w:tcPr>
+          <w:p>
+            <w:pPr>
+              <w:jc w:val="center"/>
+            </w:pPr>
+            <w:r>
+              <w:rPr>
+                <w:rFonts w:ascii="Calibri" w:cs="Calibri" w:eastAsia="Calibri" w:hAnsi="Calibri"/>
+                <w:sz w:val="20"/>
+                <w:szCs w:val="20"/>
+              </w:rPr>
+              <w:t xml:space="preserve">36</w:t>
+            </w:r>
+          </w:p>
+        </w:tc>
+        <w:tc>
+          <w:tcPr>
+            <w:tcW w:type="dxa" w:w="1800"/>
+            <w:tcBorders>
+              <w:top w:val="single" w:color="C9D3DD" w:sz="4"/>
+              <w:left w:val="single" w:color="C9D3DD" w:sz="4"/>
+              <w:bottom w:val="single" w:color="C9D3DD" w:sz="4"/>
+              <w:right w:val="single" w:color="C9D3DD" w:sz="4"/>
+            </w:tcBorders>
+            <w:shd w:fill="F6F8FA" w:color="auto" w:val="clear"/>
+            <w:tcMar>
+              <w:top w:type="dxa" w:w="70"/>
+              <w:left w:type="dxa" w:w="110"/>
+              <w:bottom w:type="dxa" w:w="70"/>
+              <w:right w:type="dxa" w:w="110"/>
+            </w:tcMar>
+            <w:vAlign w:val="center"/>
+          </w:tcPr>
+          <w:p>
+            <w:pPr>
+              <w:jc w:val="left"/>
+            </w:pPr>
+            <w:r>
+              <w:rPr>
+                <w:rFonts w:ascii="Consolas" w:cs="Consolas" w:eastAsia="Consolas" w:hAnsi="Consolas"/>
+                <w:sz w:val="17"/>
+                <w:szCs w:val="17"/>
+              </w:rPr>
               <w:t xml:space="preserve">gm@</w:t>
             </w:r>
           </w:p>
@@ -11639,7 +13436,7 @@
                 <w:sz w:val="20"/>
                 <w:szCs w:val="20"/>
               </w:rPr>
-              <w:t xml:space="preserve">Melihat meeting semua divisi; filter divisi tersedia.</w:t>
+              <w:t xml:space="preserve">Melihat dan membuat meeting semua divisi; filter divisi tersedia.</w:t>
             </w:r>
           </w:p>
         </w:tc>
@@ -11971,7 +13768,7 @@
                 <w:sz w:val="20"/>
                 <w:szCs w:val="20"/>
               </w:rPr>
-              <w:t xml:space="preserve">28</w:t>
+              <w:t xml:space="preserve">37</w:t>
             </w:r>
           </w:p>
         </w:tc>
@@ -12145,7 +13942,7 @@
                 <w:sz w:val="20"/>
                 <w:szCs w:val="20"/>
               </w:rPr>
-              <w:t xml:space="preserve">29</w:t>
+              <w:t xml:space="preserve">38</w:t>
             </w:r>
           </w:p>
         </w:tc>
@@ -12322,7 +14119,7 @@
                 <w:sz w:val="20"/>
                 <w:szCs w:val="20"/>
               </w:rPr>
-              <w:t xml:space="preserve">30</w:t>
+              <w:t xml:space="preserve">39</w:t>
             </w:r>
           </w:p>
         </w:tc>
@@ -12496,7 +14293,7 @@
                 <w:sz w:val="20"/>
                 <w:szCs w:val="20"/>
               </w:rPr>
-              <w:t xml:space="preserve">31</w:t>
+              <w:t xml:space="preserve">40</w:t>
             </w:r>
           </w:p>
         </w:tc>
@@ -12673,7 +14470,7 @@
                 <w:sz w:val="20"/>
                 <w:szCs w:val="20"/>
               </w:rPr>
-              <w:t xml:space="preserve">32</w:t>
+              <w:t xml:space="preserve">41</w:t>
             </w:r>
           </w:p>
         </w:tc>
@@ -12847,7 +14644,7 @@
                 <w:sz w:val="20"/>
                 <w:szCs w:val="20"/>
               </w:rPr>
-              <w:t xml:space="preserve">33</w:t>
+              <w:t xml:space="preserve">42</w:t>
             </w:r>
           </w:p>
         </w:tc>
@@ -13243,7 +15040,7 @@
                 <w:sz w:val="20"/>
                 <w:szCs w:val="20"/>
               </w:rPr>
-              <w:t xml:space="preserve">34</w:t>
+              <w:t xml:space="preserve">43</w:t>
             </w:r>
           </w:p>
         </w:tc>
@@ -13417,7 +15214,7 @@
                 <w:sz w:val="20"/>
                 <w:szCs w:val="20"/>
               </w:rPr>
-              <w:t xml:space="preserve">35</w:t>
+              <w:t xml:space="preserve">44</w:t>
             </w:r>
           </w:p>
         </w:tc>
@@ -13813,7 +15610,7 @@
                 <w:sz w:val="20"/>
                 <w:szCs w:val="20"/>
               </w:rPr>
-              <w:t xml:space="preserve">36</w:t>
+              <w:t xml:space="preserve">45</w:t>
             </w:r>
           </w:p>
         </w:tc>
@@ -13988,7 +15785,7 @@
                 <w:sz w:val="20"/>
                 <w:szCs w:val="20"/>
               </w:rPr>
-              <w:t xml:space="preserve">37</w:t>
+              <w:t xml:space="preserve">46</w:t>
             </w:r>
           </w:p>
         </w:tc>

</xml_diff>

<commit_message>
Hasil meeting bisa berisi teks, link, dan file (semuanya opsional)
- Migrasi 013_meeting_files: tabel lampiran hasil meeting
- API /api/meetings/[id]/files (tambah link/upload) dan
  /api/meetings/files/[fileId] (unduh/hapus) dengan cek hak akses meeting
- Peserta hanya bisa menghapus lampiran yang diunggahnya sendiri;
  pembuat & lead/admin bisa semua
- Komponen lampiran (AttachmentPicker, FileItems, PendingItems) dipakai
  bersama oleh catatan progress planning dan hasil meeting
- docs/akun-testing.docx: skenario lampiran hasil meeting

Co-Authored-By: Claude Opus 5.5 <noreply@anthropic.com>
</commit_message>
<xml_diff>
--- a/docs/akun-testing.docx
+++ b/docs/akun-testing.docx
@@ -13002,7 +13002,6 @@
               <w:bottom w:val="single" w:color="C9D3DD" w:sz="4"/>
               <w:right w:val="single" w:color="C9D3DD" w:sz="4"/>
             </w:tcBorders>
-            <w:shd w:fill="F6F8FA" w:color="auto" w:val="clear"/>
             <w:tcMar>
               <w:top w:type="dxa" w:w="70"/>
               <w:left w:type="dxa" w:w="110"/>
@@ -13034,7 +13033,6 @@
               <w:bottom w:val="single" w:color="C9D3DD" w:sz="4"/>
               <w:right w:val="single" w:color="C9D3DD" w:sz="4"/>
             </w:tcBorders>
-            <w:shd w:fill="F6F8FA" w:color="auto" w:val="clear"/>
             <w:tcMar>
               <w:top w:type="dxa" w:w="70"/>
               <w:left w:type="dxa" w:w="110"/>
@@ -13053,7 +13051,7 @@
                 <w:sz w:val="17"/>
                 <w:szCs w:val="17"/>
               </w:rPr>
-              <w:t xml:space="preserve">teknik.staff@</w:t>
+              <w:t xml:space="preserve">ppic.staff@</w:t>
             </w:r>
           </w:p>
         </w:tc>
@@ -13066,26 +13064,25 @@
               <w:bottom w:val="single" w:color="C9D3DD" w:sz="4"/>
               <w:right w:val="single" w:color="C9D3DD" w:sz="4"/>
             </w:tcBorders>
-            <w:shd w:fill="F6F8FA" w:color="auto" w:val="clear"/>
-            <w:tcMar>
-              <w:top w:type="dxa" w:w="70"/>
-              <w:left w:type="dxa" w:w="110"/>
-              <w:bottom w:type="dxa" w:w="70"/>
-              <w:right w:type="dxa" w:w="110"/>
-            </w:tcMar>
-            <w:vAlign w:val="center"/>
-          </w:tcPr>
-          <w:p>
-            <w:pPr>
-              <w:jc w:val="left"/>
-            </w:pPr>
-            <w:r>
-              <w:rPr>
-                <w:rFonts w:ascii="Calibri" w:cs="Calibri" w:eastAsia="Calibri" w:hAnsi="Calibri"/>
-                <w:sz w:val="20"/>
-                <w:szCs w:val="20"/>
-              </w:rPr>
-              <w:t xml:space="preserve">Bukan peserta &amp; beda divisi → meeting Marketing tidak terlihat.</w:t>
+            <w:tcMar>
+              <w:top w:type="dxa" w:w="70"/>
+              <w:left w:type="dxa" w:w="110"/>
+              <w:bottom w:type="dxa" w:w="70"/>
+              <w:right w:type="dxa" w:w="110"/>
+            </w:tcMar>
+            <w:vAlign w:val="center"/>
+          </w:tcPr>
+          <w:p>
+            <w:pPr>
+              <w:jc w:val="left"/>
+            </w:pPr>
+            <w:r>
+              <w:rPr>
+                <w:rFonts w:ascii="Calibri" w:cs="Calibri" w:eastAsia="Calibri" w:hAnsi="Calibri"/>
+                <w:sz w:val="20"/>
+                <w:szCs w:val="20"/>
+              </w:rPr>
+              <w:t xml:space="preserve">Hasil meeting (opsional): isi teks, tambah link dan upload file (gambar/PDF/Word) → Simpan hasil; lampiran tampil dan bisa dibuka. Format lain (mis. .xlsx) ditolak.</w:t>
             </w:r>
           </w:p>
         </w:tc>
@@ -13098,7 +13095,6 @@
               <w:bottom w:val="single" w:color="C9D3DD" w:sz="4"/>
               <w:right w:val="single" w:color="C9D3DD" w:sz="4"/>
             </w:tcBorders>
-            <w:shd w:fill="F6F8FA" w:color="auto" w:val="clear"/>
             <w:tcMar>
               <w:top w:type="dxa" w:w="70"/>
               <w:left w:type="dxa" w:w="110"/>
@@ -13143,7 +13139,6 @@
               <w:bottom w:val="single" w:color="C9D3DD" w:sz="4"/>
               <w:right w:val="single" w:color="C9D3DD" w:sz="4"/>
             </w:tcBorders>
-            <w:shd w:fill="F6F8FA" w:color="auto" w:val="clear"/>
             <w:tcMar>
               <w:top w:type="dxa" w:w="70"/>
               <w:left w:type="dxa" w:w="110"/>
@@ -13229,7 +13224,7 @@
                 <w:sz w:val="17"/>
                 <w:szCs w:val="17"/>
               </w:rPr>
-              <w:t xml:space="preserve">marketing@</w:t>
+              <w:t xml:space="preserve">ppic.staff@</w:t>
             </w:r>
           </w:p>
         </w:tc>
@@ -13260,7 +13255,7 @@
                 <w:sz w:val="20"/>
                 <w:szCs w:val="20"/>
               </w:rPr>
-              <w:t xml:space="preserve">Edit meeting (ganti judul, peserta, lepas planning) dan hapus meeting divisinya.</w:t>
+              <w:t xml:space="preserve">Peserta hanya bisa menghapus lampiran hasil yang diunggahnya sendiri; pembuat/lead bisa menghapus semua.</w:t>
             </w:r>
           </w:p>
         </w:tc>
@@ -13373,6 +13368,357 @@
                 <w:szCs w:val="20"/>
               </w:rPr>
               <w:t xml:space="preserve">36</w:t>
+            </w:r>
+          </w:p>
+        </w:tc>
+        <w:tc>
+          <w:tcPr>
+            <w:tcW w:type="dxa" w:w="1800"/>
+            <w:tcBorders>
+              <w:top w:val="single" w:color="C9D3DD" w:sz="4"/>
+              <w:left w:val="single" w:color="C9D3DD" w:sz="4"/>
+              <w:bottom w:val="single" w:color="C9D3DD" w:sz="4"/>
+              <w:right w:val="single" w:color="C9D3DD" w:sz="4"/>
+            </w:tcBorders>
+            <w:shd w:fill="F6F8FA" w:color="auto" w:val="clear"/>
+            <w:tcMar>
+              <w:top w:type="dxa" w:w="70"/>
+              <w:left w:type="dxa" w:w="110"/>
+              <w:bottom w:type="dxa" w:w="70"/>
+              <w:right w:type="dxa" w:w="110"/>
+            </w:tcMar>
+            <w:vAlign w:val="center"/>
+          </w:tcPr>
+          <w:p>
+            <w:pPr>
+              <w:jc w:val="left"/>
+            </w:pPr>
+            <w:r>
+              <w:rPr>
+                <w:rFonts w:ascii="Consolas" w:cs="Consolas" w:eastAsia="Consolas" w:hAnsi="Consolas"/>
+                <w:sz w:val="17"/>
+                <w:szCs w:val="17"/>
+              </w:rPr>
+              <w:t xml:space="preserve">teknik.staff@</w:t>
+            </w:r>
+          </w:p>
+        </w:tc>
+        <w:tc>
+          <w:tcPr>
+            <w:tcW w:type="dxa" w:w="4238"/>
+            <w:tcBorders>
+              <w:top w:val="single" w:color="C9D3DD" w:sz="4"/>
+              <w:left w:val="single" w:color="C9D3DD" w:sz="4"/>
+              <w:bottom w:val="single" w:color="C9D3DD" w:sz="4"/>
+              <w:right w:val="single" w:color="C9D3DD" w:sz="4"/>
+            </w:tcBorders>
+            <w:shd w:fill="F6F8FA" w:color="auto" w:val="clear"/>
+            <w:tcMar>
+              <w:top w:type="dxa" w:w="70"/>
+              <w:left w:type="dxa" w:w="110"/>
+              <w:bottom w:type="dxa" w:w="70"/>
+              <w:right w:type="dxa" w:w="110"/>
+            </w:tcMar>
+            <w:vAlign w:val="center"/>
+          </w:tcPr>
+          <w:p>
+            <w:pPr>
+              <w:jc w:val="left"/>
+            </w:pPr>
+            <w:r>
+              <w:rPr>
+                <w:rFonts w:ascii="Calibri" w:cs="Calibri" w:eastAsia="Calibri" w:hAnsi="Calibri"/>
+                <w:sz w:val="20"/>
+                <w:szCs w:val="20"/>
+              </w:rPr>
+              <w:t xml:space="preserve">Bukan peserta &amp; beda divisi → meeting Marketing tidak terlihat.</w:t>
+            </w:r>
+          </w:p>
+        </w:tc>
+        <w:tc>
+          <w:tcPr>
+            <w:tcW w:type="dxa" w:w="1300"/>
+            <w:tcBorders>
+              <w:top w:val="single" w:color="C9D3DD" w:sz="4"/>
+              <w:left w:val="single" w:color="C9D3DD" w:sz="4"/>
+              <w:bottom w:val="single" w:color="C9D3DD" w:sz="4"/>
+              <w:right w:val="single" w:color="C9D3DD" w:sz="4"/>
+            </w:tcBorders>
+            <w:shd w:fill="F6F8FA" w:color="auto" w:val="clear"/>
+            <w:tcMar>
+              <w:top w:type="dxa" w:w="70"/>
+              <w:left w:type="dxa" w:w="110"/>
+              <w:bottom w:type="dxa" w:w="70"/>
+              <w:right w:type="dxa" w:w="110"/>
+            </w:tcMar>
+            <w:vAlign w:val="center"/>
+          </w:tcPr>
+          <w:p>
+            <w:pPr>
+              <w:jc w:val="left"/>
+            </w:pPr>
+            <w:r>
+              <w:rPr>
+                <w:rFonts w:ascii="Calibri" w:cs="Calibri" w:eastAsia="Calibri" w:hAnsi="Calibri"/>
+                <w:sz w:val="18"/>
+                <w:szCs w:val="18"/>
+              </w:rPr>
+              <w:t xml:space="preserve">☐  Lulus</w:t>
+            </w:r>
+          </w:p>
+          <w:p>
+            <w:pPr>
+              <w:jc w:val="left"/>
+            </w:pPr>
+            <w:r>
+              <w:rPr>
+                <w:rFonts w:ascii="Calibri" w:cs="Calibri" w:eastAsia="Calibri" w:hAnsi="Calibri"/>
+                <w:sz w:val="18"/>
+                <w:szCs w:val="18"/>
+              </w:rPr>
+              <w:t xml:space="preserve">☐  Gagal</w:t>
+            </w:r>
+          </w:p>
+        </w:tc>
+        <w:tc>
+          <w:tcPr>
+            <w:tcW w:type="dxa" w:w="1800"/>
+            <w:tcBorders>
+              <w:top w:val="single" w:color="C9D3DD" w:sz="4"/>
+              <w:left w:val="single" w:color="C9D3DD" w:sz="4"/>
+              <w:bottom w:val="single" w:color="C9D3DD" w:sz="4"/>
+              <w:right w:val="single" w:color="C9D3DD" w:sz="4"/>
+            </w:tcBorders>
+            <w:shd w:fill="F6F8FA" w:color="auto" w:val="clear"/>
+            <w:tcMar>
+              <w:top w:type="dxa" w:w="70"/>
+              <w:left w:type="dxa" w:w="110"/>
+              <w:bottom w:type="dxa" w:w="70"/>
+              <w:right w:type="dxa" w:w="110"/>
+            </w:tcMar>
+            <w:vAlign w:val="center"/>
+          </w:tcPr>
+          <w:p>
+            <w:pPr>
+              <w:jc w:val="left"/>
+            </w:pPr>
+            <w:r>
+              <w:rPr>
+                <w:rFonts w:ascii="Calibri" w:cs="Calibri" w:eastAsia="Calibri" w:hAnsi="Calibri"/>
+                <w:sz w:val="20"/>
+                <w:szCs w:val="20"/>
+              </w:rPr>
+              <w:t xml:space="preserve"/>
+            </w:r>
+          </w:p>
+        </w:tc>
+      </w:tr>
+      <w:tr>
+        <w:trPr>
+          <w:cantSplit/>
+        </w:trPr>
+        <w:tc>
+          <w:tcPr>
+            <w:tcW w:type="dxa" w:w="500"/>
+            <w:tcBorders>
+              <w:top w:val="single" w:color="C9D3DD" w:sz="4"/>
+              <w:left w:val="single" w:color="C9D3DD" w:sz="4"/>
+              <w:bottom w:val="single" w:color="C9D3DD" w:sz="4"/>
+              <w:right w:val="single" w:color="C9D3DD" w:sz="4"/>
+            </w:tcBorders>
+            <w:tcMar>
+              <w:top w:type="dxa" w:w="70"/>
+              <w:left w:type="dxa" w:w="110"/>
+              <w:bottom w:type="dxa" w:w="70"/>
+              <w:right w:type="dxa" w:w="110"/>
+            </w:tcMar>
+            <w:vAlign w:val="center"/>
+          </w:tcPr>
+          <w:p>
+            <w:pPr>
+              <w:jc w:val="center"/>
+            </w:pPr>
+            <w:r>
+              <w:rPr>
+                <w:rFonts w:ascii="Calibri" w:cs="Calibri" w:eastAsia="Calibri" w:hAnsi="Calibri"/>
+                <w:sz w:val="20"/>
+                <w:szCs w:val="20"/>
+              </w:rPr>
+              <w:t xml:space="preserve">37</w:t>
+            </w:r>
+          </w:p>
+        </w:tc>
+        <w:tc>
+          <w:tcPr>
+            <w:tcW w:type="dxa" w:w="1800"/>
+            <w:tcBorders>
+              <w:top w:val="single" w:color="C9D3DD" w:sz="4"/>
+              <w:left w:val="single" w:color="C9D3DD" w:sz="4"/>
+              <w:bottom w:val="single" w:color="C9D3DD" w:sz="4"/>
+              <w:right w:val="single" w:color="C9D3DD" w:sz="4"/>
+            </w:tcBorders>
+            <w:tcMar>
+              <w:top w:type="dxa" w:w="70"/>
+              <w:left w:type="dxa" w:w="110"/>
+              <w:bottom w:type="dxa" w:w="70"/>
+              <w:right w:type="dxa" w:w="110"/>
+            </w:tcMar>
+            <w:vAlign w:val="center"/>
+          </w:tcPr>
+          <w:p>
+            <w:pPr>
+              <w:jc w:val="left"/>
+            </w:pPr>
+            <w:r>
+              <w:rPr>
+                <w:rFonts w:ascii="Consolas" w:cs="Consolas" w:eastAsia="Consolas" w:hAnsi="Consolas"/>
+                <w:sz w:val="17"/>
+                <w:szCs w:val="17"/>
+              </w:rPr>
+              <w:t xml:space="preserve">marketing@</w:t>
+            </w:r>
+          </w:p>
+        </w:tc>
+        <w:tc>
+          <w:tcPr>
+            <w:tcW w:type="dxa" w:w="4238"/>
+            <w:tcBorders>
+              <w:top w:val="single" w:color="C9D3DD" w:sz="4"/>
+              <w:left w:val="single" w:color="C9D3DD" w:sz="4"/>
+              <w:bottom w:val="single" w:color="C9D3DD" w:sz="4"/>
+              <w:right w:val="single" w:color="C9D3DD" w:sz="4"/>
+            </w:tcBorders>
+            <w:tcMar>
+              <w:top w:type="dxa" w:w="70"/>
+              <w:left w:type="dxa" w:w="110"/>
+              <w:bottom w:type="dxa" w:w="70"/>
+              <w:right w:type="dxa" w:w="110"/>
+            </w:tcMar>
+            <w:vAlign w:val="center"/>
+          </w:tcPr>
+          <w:p>
+            <w:pPr>
+              <w:jc w:val="left"/>
+            </w:pPr>
+            <w:r>
+              <w:rPr>
+                <w:rFonts w:ascii="Calibri" w:cs="Calibri" w:eastAsia="Calibri" w:hAnsi="Calibri"/>
+                <w:sz w:val="20"/>
+                <w:szCs w:val="20"/>
+              </w:rPr>
+              <w:t xml:space="preserve">Edit meeting (ganti judul, peserta, lepas planning) dan hapus meeting divisinya.</w:t>
+            </w:r>
+          </w:p>
+        </w:tc>
+        <w:tc>
+          <w:tcPr>
+            <w:tcW w:type="dxa" w:w="1300"/>
+            <w:tcBorders>
+              <w:top w:val="single" w:color="C9D3DD" w:sz="4"/>
+              <w:left w:val="single" w:color="C9D3DD" w:sz="4"/>
+              <w:bottom w:val="single" w:color="C9D3DD" w:sz="4"/>
+              <w:right w:val="single" w:color="C9D3DD" w:sz="4"/>
+            </w:tcBorders>
+            <w:tcMar>
+              <w:top w:type="dxa" w:w="70"/>
+              <w:left w:type="dxa" w:w="110"/>
+              <w:bottom w:type="dxa" w:w="70"/>
+              <w:right w:type="dxa" w:w="110"/>
+            </w:tcMar>
+            <w:vAlign w:val="center"/>
+          </w:tcPr>
+          <w:p>
+            <w:pPr>
+              <w:jc w:val="left"/>
+            </w:pPr>
+            <w:r>
+              <w:rPr>
+                <w:rFonts w:ascii="Calibri" w:cs="Calibri" w:eastAsia="Calibri" w:hAnsi="Calibri"/>
+                <w:sz w:val="18"/>
+                <w:szCs w:val="18"/>
+              </w:rPr>
+              <w:t xml:space="preserve">☐  Lulus</w:t>
+            </w:r>
+          </w:p>
+          <w:p>
+            <w:pPr>
+              <w:jc w:val="left"/>
+            </w:pPr>
+            <w:r>
+              <w:rPr>
+                <w:rFonts w:ascii="Calibri" w:cs="Calibri" w:eastAsia="Calibri" w:hAnsi="Calibri"/>
+                <w:sz w:val="18"/>
+                <w:szCs w:val="18"/>
+              </w:rPr>
+              <w:t xml:space="preserve">☐  Gagal</w:t>
+            </w:r>
+          </w:p>
+        </w:tc>
+        <w:tc>
+          <w:tcPr>
+            <w:tcW w:type="dxa" w:w="1800"/>
+            <w:tcBorders>
+              <w:top w:val="single" w:color="C9D3DD" w:sz="4"/>
+              <w:left w:val="single" w:color="C9D3DD" w:sz="4"/>
+              <w:bottom w:val="single" w:color="C9D3DD" w:sz="4"/>
+              <w:right w:val="single" w:color="C9D3DD" w:sz="4"/>
+            </w:tcBorders>
+            <w:tcMar>
+              <w:top w:type="dxa" w:w="70"/>
+              <w:left w:type="dxa" w:w="110"/>
+              <w:bottom w:type="dxa" w:w="70"/>
+              <w:right w:type="dxa" w:w="110"/>
+            </w:tcMar>
+            <w:vAlign w:val="center"/>
+          </w:tcPr>
+          <w:p>
+            <w:pPr>
+              <w:jc w:val="left"/>
+            </w:pPr>
+            <w:r>
+              <w:rPr>
+                <w:rFonts w:ascii="Calibri" w:cs="Calibri" w:eastAsia="Calibri" w:hAnsi="Calibri"/>
+                <w:sz w:val="20"/>
+                <w:szCs w:val="20"/>
+              </w:rPr>
+              <w:t xml:space="preserve"/>
+            </w:r>
+          </w:p>
+        </w:tc>
+      </w:tr>
+      <w:tr>
+        <w:trPr>
+          <w:cantSplit/>
+        </w:trPr>
+        <w:tc>
+          <w:tcPr>
+            <w:tcW w:type="dxa" w:w="500"/>
+            <w:tcBorders>
+              <w:top w:val="single" w:color="C9D3DD" w:sz="4"/>
+              <w:left w:val="single" w:color="C9D3DD" w:sz="4"/>
+              <w:bottom w:val="single" w:color="C9D3DD" w:sz="4"/>
+              <w:right w:val="single" w:color="C9D3DD" w:sz="4"/>
+            </w:tcBorders>
+            <w:shd w:fill="F6F8FA" w:color="auto" w:val="clear"/>
+            <w:tcMar>
+              <w:top w:type="dxa" w:w="70"/>
+              <w:left w:type="dxa" w:w="110"/>
+              <w:bottom w:type="dxa" w:w="70"/>
+              <w:right w:type="dxa" w:w="110"/>
+            </w:tcMar>
+            <w:vAlign w:val="center"/>
+          </w:tcPr>
+          <w:p>
+            <w:pPr>
+              <w:jc w:val="center"/>
+            </w:pPr>
+            <w:r>
+              <w:rPr>
+                <w:rFonts w:ascii="Calibri" w:cs="Calibri" w:eastAsia="Calibri" w:hAnsi="Calibri"/>
+                <w:sz w:val="20"/>
+                <w:szCs w:val="20"/>
+              </w:rPr>
+              <w:t xml:space="preserve">38</w:t>
             </w:r>
           </w:p>
         </w:tc>
@@ -13768,7 +14114,7 @@
                 <w:sz w:val="20"/>
                 <w:szCs w:val="20"/>
               </w:rPr>
-              <w:t xml:space="preserve">37</w:t>
+              <w:t xml:space="preserve">39</w:t>
             </w:r>
           </w:p>
         </w:tc>
@@ -13942,7 +14288,7 @@
                 <w:sz w:val="20"/>
                 <w:szCs w:val="20"/>
               </w:rPr>
-              <w:t xml:space="preserve">38</w:t>
+              <w:t xml:space="preserve">40</w:t>
             </w:r>
           </w:p>
         </w:tc>
@@ -14119,7 +14465,7 @@
                 <w:sz w:val="20"/>
                 <w:szCs w:val="20"/>
               </w:rPr>
-              <w:t xml:space="preserve">39</w:t>
+              <w:t xml:space="preserve">41</w:t>
             </w:r>
           </w:p>
         </w:tc>
@@ -14293,7 +14639,7 @@
                 <w:sz w:val="20"/>
                 <w:szCs w:val="20"/>
               </w:rPr>
-              <w:t xml:space="preserve">40</w:t>
+              <w:t xml:space="preserve">42</w:t>
             </w:r>
           </w:p>
         </w:tc>
@@ -14470,7 +14816,7 @@
                 <w:sz w:val="20"/>
                 <w:szCs w:val="20"/>
               </w:rPr>
-              <w:t xml:space="preserve">41</w:t>
+              <w:t xml:space="preserve">43</w:t>
             </w:r>
           </w:p>
         </w:tc>
@@ -14644,7 +14990,7 @@
                 <w:sz w:val="20"/>
                 <w:szCs w:val="20"/>
               </w:rPr>
-              <w:t xml:space="preserve">42</w:t>
+              <w:t xml:space="preserve">44</w:t>
             </w:r>
           </w:p>
         </w:tc>
@@ -15040,7 +15386,7 @@
                 <w:sz w:val="20"/>
                 <w:szCs w:val="20"/>
               </w:rPr>
-              <w:t xml:space="preserve">43</w:t>
+              <w:t xml:space="preserve">45</w:t>
             </w:r>
           </w:p>
         </w:tc>
@@ -15214,7 +15560,7 @@
                 <w:sz w:val="20"/>
                 <w:szCs w:val="20"/>
               </w:rPr>
-              <w:t xml:space="preserve">44</w:t>
+              <w:t xml:space="preserve">46</w:t>
             </w:r>
           </w:p>
         </w:tc>
@@ -15610,7 +15956,7 @@
                 <w:sz w:val="20"/>
                 <w:szCs w:val="20"/>
               </w:rPr>
-              <w:t xml:space="preserve">45</w:t>
+              <w:t xml:space="preserve">47</w:t>
             </w:r>
           </w:p>
         </w:tc>
@@ -15785,7 +16131,7 @@
                 <w:sz w:val="20"/>
                 <w:szCs w:val="20"/>
               </w:rPr>
-              <w:t xml:space="preserve">46</w:t>
+              <w:t xml:space="preserve">48</w:t>
             </w:r>
           </w:p>
         </w:tc>

</xml_diff>